<commit_message>
Bibliographie reclassée par ordre alphabétique
Co-Authored-By: Claude Opus 5.5 <noreply@anthropic.com>
Claude-Session: https://claude.ai/code/session_01BMtPhiCmF4fJJwSAqbwbtJ
</commit_message>
<xml_diff>
--- a/Redaction/Audit de l'Orchestration stratégique RH CTMG - Unisanté - Azdine ZARGUI-NAJI.docx
+++ b/Redaction/Audit de l'Orchestration stratégique RH CTMG - Unisanté - Azdine ZARGUI-NAJI.docx
@@ -2378,7 +2378,7 @@
               <w:rPr>
                 <w:noProof/>
               </w:rPr>
-              <w:t>17</w:t>
+              <w:t>18</w:t>
             </w:r>
             <w:r>
               <w:rPr>
@@ -2684,7 +2684,7 @@
               <w:rPr>
                 <w:noProof/>
               </w:rPr>
-              <w:t>48</w:t>
+              <w:t>49</w:t>
             </w:r>
             <w:r>
               <w:rPr>
@@ -2832,7 +2832,91 @@
         <w:rPr>
           <w:lang w:val="fr-FR"/>
         </w:rPr>
-        <w:t>Le cadre d’analyse suivra le cheminement proposé par la grille d’audit du module (Bédat, 2026), à savoir : configuration organisationnelle, structure de gouvernance, acteurs clés, biais cognitifs, enjeux de délégation, puis diagnostic et recommandations. Trois apports théoriques structurent la lecture. Le premier est la gouvernance d'entreprise comportementale de Charreaux (2005). Aux approches disciplinaires, qui voient dans la gouvernance un moyen de contrôler les dirigeants et de réduire l'asymétrie d'information (Fama &amp; Jensen, 1983 ; Jensen &amp; Meckling, 1976), s'ajoutent les approches cognitives, centrées sur la production de connaissance et l'apprentissage, ainsi qu'une dimension comportementale : dirigeants et administrateurs ont des biais, que les mécanismes de gouvernance peuvent corriger ou amplifier. Notre hypothèse centrale en découle : à la CTMG, les leviers disciplinaires (indicateurs, contrôle, procédures) l'emportent sur les leviers cognitifs, alors que la difficulté est cognitive, l'institution Unisanté ne sachant pas, ou ne cherchant pas à savoir, ce qui se passe sur le terrain. Le deuxième apport est celui des perspectives fondées sur les ressources (Prévot et al., 2010). L'expertise des régulateurs, en grande partie tacite, est précieuse, rare et difficile à imiter (Barney, 1991), mais elle doit encore être structurée et mobilisée, ce que Sirmon et al. (2011) appellent l'orchestration des ressources. Une fuite de l’expertise avec le départ des personnes n'est plus orchestrée : elle est perdue. Le troisième apport concerne le rôle de la fonction RH. Walker (2026) rappelle que les RH ne sont pas un médiateur neutre et qu'elles agissent d'abord pour l'organisation, ce qui éclaire les attentes déçues exprimées dans les entretiens.</w:t>
+        <w:t xml:space="preserve">Le cadre d’analyse suivra le cheminement proposé par la grille d’audit du module (Bédat, 2026), à savoir : configuration organisationnelle, structure de gouvernance, acteurs clés, biais cognitifs, enjeux de délégation, puis diagnostic et recommandations. Trois apports théoriques structurent la lecture. Le premier est la gouvernance d'entreprise comportementale de </w:t>
+      </w:r>
+      <w:proofErr w:type="spellStart"/>
+      <w:r>
+        <w:rPr>
+          <w:lang w:val="fr-FR"/>
+        </w:rPr>
+        <w:t>Charreaux</w:t>
+      </w:r>
+      <w:proofErr w:type="spellEnd"/>
+      <w:r>
+        <w:rPr>
+          <w:lang w:val="fr-FR"/>
+        </w:rPr>
+        <w:t xml:space="preserve"> (2005). Aux approches disciplinaires, qui voient dans la gouvernance un moyen de contrôler les dirigeants et de réduire l'asymétrie d'information (</w:t>
+      </w:r>
+      <w:proofErr w:type="spellStart"/>
+      <w:r>
+        <w:rPr>
+          <w:lang w:val="fr-FR"/>
+        </w:rPr>
+        <w:t>Fama</w:t>
+      </w:r>
+      <w:proofErr w:type="spellEnd"/>
+      <w:r>
+        <w:rPr>
+          <w:lang w:val="fr-FR"/>
+        </w:rPr>
+        <w:t xml:space="preserve"> &amp; Jensen, 1983 ; Jensen &amp; </w:t>
+      </w:r>
+      <w:proofErr w:type="spellStart"/>
+      <w:r>
+        <w:rPr>
+          <w:lang w:val="fr-FR"/>
+        </w:rPr>
+        <w:t>Meckling</w:t>
+      </w:r>
+      <w:proofErr w:type="spellEnd"/>
+      <w:r>
+        <w:rPr>
+          <w:lang w:val="fr-FR"/>
+        </w:rPr>
+        <w:t>, 1976), s'ajoutent les approches cognitives, centrées sur la production de connaissance et l'apprentissage, ainsi qu'une dimension comportementale : dirigeants et administrateurs ont des biais, que les mécanismes de gouvernance peuvent corriger ou amplifier. Notre hypothèse centrale en découle : à la CTMG, les leviers disciplinaires (indicateurs, contrôle, procédures) l'emportent sur les leviers cognitifs, alors que la difficulté est cognitive, l'institution Unisanté ne sachant pas, ou ne cherchant pas à savoir, ce qui se passe sur le terrain. Le deuxième apport est celui des perspectives fondées sur les ressources (</w:t>
+      </w:r>
+      <w:proofErr w:type="spellStart"/>
+      <w:r>
+        <w:rPr>
+          <w:lang w:val="fr-FR"/>
+        </w:rPr>
+        <w:t>Prévot</w:t>
+      </w:r>
+      <w:proofErr w:type="spellEnd"/>
+      <w:r>
+        <w:rPr>
+          <w:lang w:val="fr-FR"/>
+        </w:rPr>
+        <w:t xml:space="preserve"> et </w:t>
+      </w:r>
+      <w:proofErr w:type="gramStart"/>
+      <w:r>
+        <w:rPr>
+          <w:lang w:val="fr-FR"/>
+        </w:rPr>
+        <w:t>al.,</w:t>
+      </w:r>
+      <w:proofErr w:type="gramEnd"/>
+      <w:r>
+        <w:rPr>
+          <w:lang w:val="fr-FR"/>
+        </w:rPr>
+        <w:t xml:space="preserve"> 2010). L'expertise des régulateurs, en grande partie tacite, est précieuse, rare et difficile à imiter (Barney, 1991), mais elle doit encore être structurée et mobilisée, ce que </w:t>
+      </w:r>
+      <w:proofErr w:type="spellStart"/>
+      <w:r>
+        <w:rPr>
+          <w:lang w:val="fr-FR"/>
+        </w:rPr>
+        <w:t>Sirmon</w:t>
+      </w:r>
+      <w:proofErr w:type="spellEnd"/>
+      <w:r>
+        <w:rPr>
+          <w:lang w:val="fr-FR"/>
+        </w:rPr>
+        <w:t xml:space="preserve"> et al. (2011) appellent l'orchestration des ressources. Une fuite de l’expertise avec le départ des personnes n'est plus orchestrée : elle est perdue. Le troisième apport concerne le rôle de la fonction RH. Walker (2026) rappelle que les RH ne sont pas un médiateur neutre et qu'elles agissent d'abord pour l'organisation, ce qui éclaire les attentes déçues exprimées dans les entretiens.</w:t>
       </w:r>
     </w:p>
     <w:p>
@@ -2865,20 +2949,48 @@
         <w:rPr>
           <w:lang w:val="fr-FR"/>
         </w:rPr>
-        <w:t>Le matériau mobilisé comprend donc nos observations de terrain et deux entretiens semi-directifs avec des collaborateurs de première ligne. Le premier a été mené avec un chef de salle, également infirmier régulateur, en septembre 2026 (E1). Le second a été conduit avec une régulatrice sanitaire, praticienne formatrice, en novembre 2024 pour un travail antérieur du cursus, le module « Comportements organisationnels et psychologie du travail », et il est réutilisé ici avec son autorisation (E2). S'y ajoutent des sources institutionnelles publiques pour les faits. Ce choix découle de la contrainte d’accès aux données internes, mais il a un intérêt propre : l'information de terrain est précisément celle dont nous faisons l'hypothèse qu'elle ne parvient pas aux organes de gouvernance. Que les collaborateurs ne puissent pas savoir ce que l'audit interne a conclu est déjà, en soi, une observation sur l'asymétrie d'information.</w:t>
-      </w:r>
-    </w:p>
-    <w:p>
-      <w:pPr>
-        <w:rPr>
-          <w:lang w:val="fr-FR"/>
-        </w:rPr>
-      </w:pPr>
-      <w:r>
-        <w:rPr>
-          <w:lang w:val="fr-FR"/>
-        </w:rPr>
-        <w:t>Cette proximité expose aussi à des biais. Les deux personnes interrogées appartiennent à notre environnement professionnel, et notre propre lecture de la situation peut orienter l'interprétation dans le sens de ce que nous pensions déjà, c'est-à-dire un biais de confirmation. Pour limiter ce risque, nous avons recoupé les faits avec des sources publiques chaque fois que c'était possible. Nous formulons comme des hypothèses les interprétations qui portent sur des acteurs non interrogés : la direction, les RH, le Conseil. Nous avons aussi retenu les éléments qui nuancent le diagnostic, et l’entretien E1 en apporte plusieurs. Toutes les personnes sont anonymisées, et nous désignons les fonctions plutôt que les individus car un audit adressé à un conseil a vocation à décrire des mécanismes de l’organisation.</w:t>
+        <w:t xml:space="preserve">Le matériau mobilisé comprend donc nos observations de terrain et deux entretiens semi-directifs avec des collaborateurs de première ligne. Le premier a été mené avec un chef de salle, également infirmier régulateur, en septembre 2026 (E1). Le second a été conduit avec </w:t>
+      </w:r>
+      <w:proofErr w:type="gramStart"/>
+      <w:r>
+        <w:rPr>
+          <w:lang w:val="fr-FR"/>
+        </w:rPr>
+        <w:t>une régulatrice</w:t>
+      </w:r>
+      <w:proofErr w:type="gramEnd"/>
+      <w:r>
+        <w:rPr>
+          <w:lang w:val="fr-FR"/>
+        </w:rPr>
+        <w:t xml:space="preserve"> sanitaire, praticienne formatrice, en novembre 2024 pour un travail antérieur du cursus, le module « Comportements organisationnels et psychologie du travail », et il est réutilisé ici avec son autorisation (E2). S'y ajoutent des sources institutionnelles publiques pour les faits. Ce choix découle de la contrainte d’accès aux données internes, mais il a un intérêt propre : l'information de terrain est précisément celle dont nous faisons l'hypothèse qu'elle ne parvient pas aux organes de gouvernance. Que les collaborateurs ne puissent pas savoir ce que l'audit interne a conclu est déjà, en soi, une observation sur l'asymétrie d'information.</w:t>
+      </w:r>
+    </w:p>
+    <w:p>
+      <w:pPr>
+        <w:rPr>
+          <w:lang w:val="fr-FR"/>
+        </w:rPr>
+      </w:pPr>
+      <w:r>
+        <w:rPr>
+          <w:lang w:val="fr-FR"/>
+        </w:rPr>
+        <w:t xml:space="preserve">Cette proximité expose aussi à des biais. Les deux personnes interrogées appartiennent à notre environnement professionnel, et notre propre lecture de la situation peut orienter l'interprétation dans le sens de ce que nous pensions déjà, c'est-à-dire un biais de confirmation. Pour limiter ce risque, nous avons recoupé les faits avec des sources publiques chaque fois que c'était possible. Nous formulons comme des hypothèses les interprétations qui portent sur des acteurs non interrogés : la direction, les RH, le Conseil. Nous avons aussi retenu les éléments qui nuancent le diagnostic, et l’entretien E1 en apporte plusieurs. Toutes les personnes sont </w:t>
+      </w:r>
+      <w:proofErr w:type="spellStart"/>
+      <w:r>
+        <w:rPr>
+          <w:lang w:val="fr-FR"/>
+        </w:rPr>
+        <w:t>anonymisées</w:t>
+      </w:r>
+      <w:proofErr w:type="spellEnd"/>
+      <w:r>
+        <w:rPr>
+          <w:lang w:val="fr-FR"/>
+        </w:rPr>
+        <w:t>, et nous désignons les fonctions plutôt que les individus car un audit adressé à un conseil a vocation à décrire des mécanismes de l’organisation.</w:t>
       </w:r>
     </w:p>
     <w:p>
@@ -2929,13 +3041,27 @@
         <w:rPr>
           <w:lang w:val="fr-FR"/>
         </w:rPr>
-        <w:t>ons de Vaud et de Neuchâtel, qui</w:t>
-      </w:r>
-      <w:r>
-        <w:rPr>
-          <w:lang w:val="fr-FR"/>
-        </w:rPr>
-        <w:t xml:space="preserve"> la mandatent. Elle constitue l'un des éléments du dispositif d'urgence et de santé communautaire de ces deux cantons (Unisanté, s.d.-c). Elle évalue les demandes d'aide médicale (somatique et psychologique) et sociale et les oriente vers la ressource adaptée (médecin de garde, urgences, 144, médecin traitant, conseils), en lien avec de nombreux partenaires sanitaires et sociaux (EMUS, Police, institutions sanitaires et sociales, offices du médecin cantonal).</w:t>
+        <w:t>ons de Vaud et de Neuchâtel et est mandatée par le canton de Vaud (et indirectement par le canton de Neuchâtel)</w:t>
+      </w:r>
+      <w:r>
+        <w:rPr>
+          <w:lang w:val="fr-FR"/>
+        </w:rPr>
+        <w:t xml:space="preserve">. Elle constitue l'un des éléments du dispositif d'urgence et de santé communautaire de ces deux cantons (Unisanté, </w:t>
+      </w:r>
+      <w:proofErr w:type="spellStart"/>
+      <w:r>
+        <w:rPr>
+          <w:lang w:val="fr-FR"/>
+        </w:rPr>
+        <w:t>s.d</w:t>
+      </w:r>
+      <w:proofErr w:type="spellEnd"/>
+      <w:r>
+        <w:rPr>
+          <w:lang w:val="fr-FR"/>
+        </w:rPr>
+        <w:t>.-c). Elle évalue les demandes d'aide médicale (somatique et psychologique) et sociale et les oriente vers la ressource adaptée (médecin de garde, urgences, 144, médecin traitant, conseils), en lien avec de nombreux partenaires sanitaires et sociaux (EMUS, Police, institutions sanitaires et sociales, offices du médecin cantonal).</w:t>
       </w:r>
     </w:p>
     <w:p>
@@ -2977,27 +3103,77 @@
         <w:rPr>
           <w:lang w:val="fr-FR"/>
         </w:rPr>
-        <w:t xml:space="preserve">Jusqu'en 2024, la CTMG était gérée, comme la centrale 144, par la Fondation Urgences Santé. Après des travaux engagés à l'été 2022 sous l'égide du DSAS, le Conseil d'État vaudois a décidé de rattacher les deux centrales à deux entités distinctes : le 144 au CHUV, la CTMG à Unisanté. </w:t>
+        <w:t xml:space="preserve">Jusqu'en 2024, la CTMG était gérée, comme la centrale 144, par la Fondation Urgences Santé. Après des travaux engagés à l'été 2022 sous l'égide du DSAS, le Conseil d'État vaudois a décidé </w:t>
       </w:r>
       <w:r>
         <w:rPr>
           <w:lang w:val="fr-FR"/>
         </w:rPr>
         <w:lastRenderedPageBreak/>
-        <w:t>Ce choix a conduit à la dissolution de fait de la Fondation (CHUV, s.d. ; État de Vaud, s.d.-a). Pendant cette transition, conduite entre 2022 et 2024, la centrale a été placée sous la tutelle de l'État-major cantonal de conduite (EMCC), selon les collaborateurs (E1). À l'interne, le poste de cheffe de service a été créé et pourvu en septembre 2022. Les trois cadres de proximité de l'époque ont démissionné successivement et ont été remplacés.</w:t>
-      </w:r>
-    </w:p>
-    <w:p>
-      <w:pPr>
-        <w:rPr>
-          <w:lang w:val="fr-FR"/>
-        </w:rPr>
-      </w:pPr>
-      <w:r>
-        <w:rPr>
-          <w:lang w:val="fr-FR"/>
-        </w:rPr>
-        <w:t>Le témoignage de E1 invite à distinguer trois temps. Le premier est la crise de la Fondation, qui opposait selon lui les anciens cadres au conseil d'administration : « à cette époque, je ne me souviens pas d'un problème particulier de confiance entre les collaborateurs et leur hiérarchie ». Le deuxième est la période de tutelle, pendant laquelle la nouvelle cheffe de service est arrivée. Le troisième commence après le rattachement : « progressivement, la confiance s'est dégradée », avec « des tensions, des départs et des situations managériales que des collègues ont mal vécues » (E1). La crise de confiance actuelle n'est donc pas un héritage de la Fondation : elle est apparue dans le nouveau cadre institutionnel, et c'est là qu'il faut en chercher les ressorts.</w:t>
+        <w:t xml:space="preserve">de rattacher les deux centrales à deux entités distinctes : le 144 au CHUV, la CTMG à Unisanté. Ce choix a conduit à la dissolution de fait de la Fondation (CHUV, </w:t>
+      </w:r>
+      <w:proofErr w:type="spellStart"/>
+      <w:proofErr w:type="gramStart"/>
+      <w:r>
+        <w:rPr>
+          <w:lang w:val="fr-FR"/>
+        </w:rPr>
+        <w:t>s.d</w:t>
+      </w:r>
+      <w:proofErr w:type="spellEnd"/>
+      <w:r>
+        <w:rPr>
+          <w:lang w:val="fr-FR"/>
+        </w:rPr>
+        <w:t>. ;</w:t>
+      </w:r>
+      <w:proofErr w:type="gramEnd"/>
+      <w:r>
+        <w:rPr>
+          <w:lang w:val="fr-FR"/>
+        </w:rPr>
+        <w:t xml:space="preserve"> État de Vaud, </w:t>
+      </w:r>
+      <w:proofErr w:type="spellStart"/>
+      <w:r>
+        <w:rPr>
+          <w:lang w:val="fr-FR"/>
+        </w:rPr>
+        <w:t>s.d</w:t>
+      </w:r>
+      <w:proofErr w:type="spellEnd"/>
+      <w:r>
+        <w:rPr>
+          <w:lang w:val="fr-FR"/>
+        </w:rPr>
+        <w:t>.-a). Pendant cette transition, conduite entre 2022 et 2024, la centrale a été placée sous la tutelle de l'État-major cantonal de conduite (EMCC), selon les collaborateurs (E1). À l'interne, le poste de cheffe de service a été créé et pourvu en septembre 2022. Les trois cadres de proximité de l'époque ont démissionné successivement et ont été remplacés.</w:t>
+      </w:r>
+    </w:p>
+    <w:p>
+      <w:pPr>
+        <w:rPr>
+          <w:lang w:val="fr-FR"/>
+        </w:rPr>
+      </w:pPr>
+      <w:r>
+        <w:rPr>
+          <w:lang w:val="fr-FR"/>
+        </w:rPr>
+        <w:t xml:space="preserve">Le témoignage </w:t>
+      </w:r>
+      <w:proofErr w:type="gramStart"/>
+      <w:r>
+        <w:rPr>
+          <w:lang w:val="fr-FR"/>
+        </w:rPr>
+        <w:t>de E1</w:t>
+      </w:r>
+      <w:proofErr w:type="gramEnd"/>
+      <w:r>
+        <w:rPr>
+          <w:lang w:val="fr-FR"/>
+        </w:rPr>
+        <w:t xml:space="preserve"> invite à distinguer trois temps. Le premier est la crise de la Fondation, qui opposait selon lui les anciens cadres au conseil d'administration : « à cette époque, je ne me souviens pas d'un problème particulier de confiance entre les collaborateurs et leur hiérarchie ». Le deuxième est la période de tutelle, pendant laquelle la nouvelle cheffe de service est arrivée. Le troisième commence après le rattachement : « progressivement, la confiance s'est dégradée », avec « des tensions, des départs et des situations managériales que des collègues ont mal vécues » (E1). La crise de confiance actuelle n'est donc pas un héritage de la Fondation : elle est apparue dans le nouveau cadre institutionnel, et c'est là qu'il faut en chercher les ressorts.</w:t>
       </w:r>
     </w:p>
     <w:p>
@@ -3141,7 +3317,21 @@
         <w:rPr>
           <w:lang w:val="fr-FR"/>
         </w:rPr>
-        <w:t xml:space="preserve"> Giauque (2024) décrit des autorités éloignées des lieux où le service est produit, qui recentralisent l'information au moyen d'indicateurs de plus en plus nombreux. Emery et Giauque (2019) en soulignent le paradoxe : les indicateurs rendent certaines dimensions de l'activité très visibles et en laissent d'autres dans l'ombre. À la CTMG, l'activité est d'abord suivie par des volumes : appels traités, prises en charge adultes et pédiatriques, taux d'activité. E2 regrette que, lors des briefings, « la seule chose positive qu'on balance, c'est que c'est des bons chiffres ». Elle ne rejette pas les indicateurs en tant que tels, mais le fait qu'ils soient présentés seuls : « pour expliquer les chiffres, il faut expliquer le reste », ce qui renvoie à la « myopie de l'efficience » (Bédat, 2026).</w:t>
+        <w:t xml:space="preserve"> Giauque (2024) décrit des autorités éloignées des lieux où le service est produit, qui </w:t>
+      </w:r>
+      <w:proofErr w:type="spellStart"/>
+      <w:r>
+        <w:rPr>
+          <w:lang w:val="fr-FR"/>
+        </w:rPr>
+        <w:t>recentralisent</w:t>
+      </w:r>
+      <w:proofErr w:type="spellEnd"/>
+      <w:r>
+        <w:rPr>
+          <w:lang w:val="fr-FR"/>
+        </w:rPr>
+        <w:t xml:space="preserve"> l'information au moyen d'indicateurs de plus en plus nombreux. Emery et Giauque (2019) en soulignent le paradoxe : les indicateurs rendent certaines dimensions de l'activité très visibles et en laissent d'autres dans l'ombre. À la CTMG, l'activité est d'abord suivie par des volumes : appels traités, prises en charge adultes et pédiatriques, taux d'activité. E2 regrette que, lors des briefings, « la seule chose positive qu'on balance, c'est que c'est des bons chiffres ». Elle ne rejette pas les indicateurs en tant que tels, mais le fait qu'ils soient présentés seuls : « pour expliquer les chiffres, il faut expliquer le reste », ce qui renvoie à la « myopie de l'efficience » (Bédat, 2026).</w:t>
       </w:r>
     </w:p>
     <w:p>
@@ -3161,7 +3351,35 @@
         <w:rPr>
           <w:lang w:val="fr-FR"/>
         </w:rPr>
-        <w:t xml:space="preserve"> Giauque (2003) a montré que les réformes managériales du secteur public produisent une « bureaucratie libérale », qui promet l'autonomie tout en resserrant le contrôle. Les régulateurs disposent d'une autonomie clinique réelle (« on reste assez autonomes dans nos décisions », E2), mais leur travail est suivi par des indicateurs de productivité, avec ce « petit côté flicage » qu'E2 associe au suivi du taux d'activité. Ces injonctions contradictoires (Emery &amp; Giauque, 2003) heurtent aussi la motivation de service public de soignants dont la première motivation reste « d'aider les gens » (E2 ; Vandenabeele et al., 2014). Or Ritz (2009) a montré, dans l'administration fédérale suisse, que cette motivation est associée à la performance organisationnelle perçue. La négliger a donc un coût pour l'organisation elle-même.</w:t>
+        <w:t xml:space="preserve"> Giauque (2003) a montré que les réformes managériales du secteur public produisent une « bureaucratie libérale », qui promet l'autonomie tout en resserrant le contrôle. Les régulateurs disposent d'une autonomie clinique réelle (« on reste assez autonomes dans nos décisions », E2), mais leur travail est suivi par des indicateurs de productivité, avec ce « petit côté flicage » qu'E2 associe au suivi du taux d'activité. Ces injonctions contradictoires (Emery &amp; Giauque, 2003) heurtent aussi la motivation de service public de soignants dont la première motivation reste « d'aider les gens » (E2 ; </w:t>
+      </w:r>
+      <w:proofErr w:type="spellStart"/>
+      <w:r>
+        <w:rPr>
+          <w:lang w:val="fr-FR"/>
+        </w:rPr>
+        <w:t>Vandenabeele</w:t>
+      </w:r>
+      <w:proofErr w:type="spellEnd"/>
+      <w:r>
+        <w:rPr>
+          <w:lang w:val="fr-FR"/>
+        </w:rPr>
+        <w:t xml:space="preserve"> et </w:t>
+      </w:r>
+      <w:proofErr w:type="gramStart"/>
+      <w:r>
+        <w:rPr>
+          <w:lang w:val="fr-FR"/>
+        </w:rPr>
+        <w:t>al.,</w:t>
+      </w:r>
+      <w:proofErr w:type="gramEnd"/>
+      <w:r>
+        <w:rPr>
+          <w:lang w:val="fr-FR"/>
+        </w:rPr>
+        <w:t xml:space="preserve"> 2014). Or Ritz (2009) a montré, dans l'administration fédérale suisse, que cette motivation est associée à la performance organisationnelle perçue. La négliger a donc un coût pour l'organisation elle-même.</w:t>
       </w:r>
     </w:p>
     <w:p>
@@ -3186,11 +3404,19 @@
           <w:lang w:val="fr-FR"/>
         </w:rPr>
       </w:pPr>
-      <w:r>
-        <w:rPr>
-          <w:lang w:val="fr-FR"/>
-        </w:rPr>
-        <w:t>Stinchcombe (1965) a montré que les organisations gardent durablement l'empreinte des conditions dans lesquelles elles ont été formées. L'encadrement actuel de la CTMG s'est constitué pendant une période de crise et de tutelle, où il fallait stabiliser un service fragilisé : privilégier le contrôle, les procédures et les indicateurs était alors sans doute rationnel. Notre hypothèse est que cette logique s'est maintenue au-delà de la crise : le contexte s'est stabilisé, mais le mode de pilotage n'a pas changé de nature. E1 le suggère lorsqu'il oppose une forme améliorée à un fond inchangé : « la manière dont les décisions sont prises, la place donnée aux remontées du terrain ou la confiance envers les collaborateurs, je trouve que ça reste assez similaire ».</w:t>
+      <w:proofErr w:type="spellStart"/>
+      <w:r>
+        <w:rPr>
+          <w:lang w:val="fr-FR"/>
+        </w:rPr>
+        <w:t>Stinchcombe</w:t>
+      </w:r>
+      <w:proofErr w:type="spellEnd"/>
+      <w:r>
+        <w:rPr>
+          <w:lang w:val="fr-FR"/>
+        </w:rPr>
+        <w:t xml:space="preserve"> (1965) a montré que les organisations gardent durablement l'empreinte des conditions dans lesquelles elles ont été formées. L'encadrement actuel de la CTMG s'est constitué pendant une période de crise et de tutelle, où il fallait stabiliser un service fragilisé : privilégier le contrôle, les procédures et les indicateurs était alors sans doute rationnel. Notre hypothèse est que cette logique s'est maintenue au-delà de la crise : le contexte s'est stabilisé, mais le mode de pilotage n'a pas changé de nature. E1 le suggère lorsqu'il oppose une forme améliorée à un fond inchangé : « la manière dont les décisions sont prises, la place donnée aux remontées du terrain ou la confiance envers les collaborateurs, je trouve que ça reste assez similaire ».</w:t>
       </w:r>
     </w:p>
     <w:p>
@@ -3226,56 +3452,74 @@
         <w:rPr>
           <w:lang w:val="fr-FR"/>
         </w:rPr>
-        <w:t xml:space="preserve"> </w:t>
-      </w:r>
-      <w:r>
-        <w:rPr>
-          <w:lang w:val="fr-FR"/>
-        </w:rPr>
-        <w:t>(Merçay et al., 2021)</w:t>
-      </w:r>
-      <w:r>
-        <w:rPr>
-          <w:lang w:val="fr-FR"/>
-        </w:rPr>
-        <w:t xml:space="preserve"> pour la CTMG, qui recrute ses régulateurs parmi les infirmiers. L'expertise de régulation s'acquiert ensuite à l'interne, par la formation et la pratique. Chaque départ fait donc perdre un investissement propre à l'organisation, et son remplacement se fait dans un marché tendu. La fidélisation devient ainsi un enjeu stratégique, qui dépend largement des pratiques RH : dans le secteur public, celles-ci renforcent la loyauté des agents (Assanti &amp; Giauque, 2026).</w:t>
-      </w:r>
-    </w:p>
-    <w:p>
-      <w:pPr>
-        <w:rPr>
-          <w:lang w:val="fr-FR"/>
-        </w:rPr>
-      </w:pPr>
-      <w:r>
-        <w:rPr>
-          <w:lang w:val="fr-FR"/>
-        </w:rPr>
-        <w:t>Les difficultés de la CTMG s'inscrivent donc dans une configuration qui fa</w:t>
-      </w:r>
-      <w:r>
-        <w:rPr>
-          <w:lang w:val="fr-FR"/>
-        </w:rPr>
-        <w:t>vorise la distance, la mesure,</w:t>
-      </w:r>
-      <w:r>
-        <w:rPr>
-          <w:lang w:val="fr-FR"/>
-        </w:rPr>
-        <w:t xml:space="preserve"> le contrôle</w:t>
-      </w:r>
-      <w:r>
-        <w:rPr>
-          <w:lang w:val="fr-FR"/>
-        </w:rPr>
-        <w:t xml:space="preserve"> et que la pénurie infirmière rend plus coûteuse</w:t>
-      </w:r>
-      <w:r>
-        <w:rPr>
-          <w:lang w:val="fr-FR"/>
-        </w:rPr>
-        <w:t xml:space="preserve"> et pas seulement dans des comportements individuels. Reste à examiner la structure de gouvernance qui encadre ce fonctionnement.</w:t>
+        <w:t xml:space="preserve"> (</w:t>
+      </w:r>
+      <w:proofErr w:type="spellStart"/>
+      <w:r>
+        <w:rPr>
+          <w:lang w:val="fr-FR"/>
+        </w:rPr>
+        <w:t>Merçay</w:t>
+      </w:r>
+      <w:proofErr w:type="spellEnd"/>
+      <w:r>
+        <w:rPr>
+          <w:lang w:val="fr-FR"/>
+        </w:rPr>
+        <w:t xml:space="preserve"> et </w:t>
+      </w:r>
+      <w:proofErr w:type="gramStart"/>
+      <w:r>
+        <w:rPr>
+          <w:lang w:val="fr-FR"/>
+        </w:rPr>
+        <w:t>al.,</w:t>
+      </w:r>
+      <w:proofErr w:type="gramEnd"/>
+      <w:r>
+        <w:rPr>
+          <w:lang w:val="fr-FR"/>
+        </w:rPr>
+        <w:t xml:space="preserve"> 2021)</w:t>
+      </w:r>
+      <w:r>
+        <w:rPr>
+          <w:lang w:val="fr-FR"/>
+        </w:rPr>
+        <w:t xml:space="preserve"> pour la CTMG, qui recrute ses régulateurs parmi les infirmiers. L'expertise de régulation s'acquiert ensuite à l'interne, par la formation et la pratique. Chaque départ fait donc perdre un investissement propre à l'organisation, et son remplacement se fait dans un marché tendu. La fidélisation devient ainsi un enjeu stratégique, qui dépend largement des pratiques RH : dans le secteur public, celles-ci renforcent la loyauté des agents (</w:t>
+      </w:r>
+      <w:proofErr w:type="spellStart"/>
+      <w:r>
+        <w:rPr>
+          <w:lang w:val="fr-FR"/>
+        </w:rPr>
+        <w:t>Assanti</w:t>
+      </w:r>
+      <w:proofErr w:type="spellEnd"/>
+      <w:r>
+        <w:rPr>
+          <w:lang w:val="fr-FR"/>
+        </w:rPr>
+        <w:t xml:space="preserve"> &amp; Giauque, 2026).</w:t>
+      </w:r>
+    </w:p>
+    <w:p>
+      <w:pPr>
+        <w:rPr>
+          <w:lang w:val="fr-FR"/>
+        </w:rPr>
+      </w:pPr>
+      <w:r>
+        <w:rPr>
+          <w:lang w:val="fr-FR"/>
+        </w:rPr>
+        <w:t>Les difficultés de la CTMG ne relèvent donc pas seulement de comportements individuels. Elles s'inscrivent dans une configuration qui favorise la distance, la mesure et le contrôle, et la pénurie infirmière rend plus coûteux chacun des départs qu'elle provoque.</w:t>
+      </w:r>
+      <w:r>
+        <w:rPr>
+          <w:lang w:val="fr-FR"/>
+        </w:rPr>
+        <w:t xml:space="preserve"> Reste à examiner la structure de gouvernance qui encadre ce fonctionnement.</w:t>
       </w:r>
     </w:p>
     <w:p>
@@ -3320,7 +3564,77 @@
         <w:rPr>
           <w:lang w:val="fr-FR"/>
         </w:rPr>
-        <w:t>La CTMG est soumise à la gouvernance d'Unisanté, qui s'organise autour de deux organes distincts. Le Conseil d'Unisanté compte sept à huit membres, désignés par le Conseil d'État vaudois pour la législature 2022-2027. Il adopte le plan stratégique, qui doit ensuite être ratifié par le Conseil d'État, ainsi que le budget, les objectifs annuels et les comptes. Il valide aussi le contrat de prestations conclu avec le Département de la santé et de l'action sociale (DSAS). Parmi ses membres figure la directrice générale de la santé ad interim, représentante du DSAS, c'est-à-dire de l'administration de tutelle (État de Vaud, s.d.-c ; Unisanté, s.d.-b). La direction générale est, elle aussi, désignée par le Conseil d'État (État de Vaud, s.d.-b). Le directeur général préside un comité de direction qui réunit les directions transversales (finances, ressources humaines, direction médicale, direction des soins) et les chefs des sept départements, dont le DUSC auquel appartient la CTMG (Unisanté, s.d.-a).</w:t>
+        <w:t xml:space="preserve">La CTMG est soumise à la gouvernance d'Unisanté, qui s'organise autour de deux organes distincts. Le Conseil d'Unisanté compte sept à huit membres, désignés par le Conseil d'État vaudois pour la législature 2022-2027. Il adopte le plan stratégique, qui doit ensuite être ratifié par le Conseil d'État, ainsi que le budget, les objectifs annuels et les comptes. Il valide aussi le contrat de prestations conclu avec le Département de la santé et de l'action sociale (DSAS). Parmi ses membres figure la directrice générale de la santé ad </w:t>
+      </w:r>
+      <w:proofErr w:type="spellStart"/>
+      <w:r>
+        <w:rPr>
+          <w:lang w:val="fr-FR"/>
+        </w:rPr>
+        <w:t>interim</w:t>
+      </w:r>
+      <w:proofErr w:type="spellEnd"/>
+      <w:r>
+        <w:rPr>
+          <w:lang w:val="fr-FR"/>
+        </w:rPr>
+        <w:t xml:space="preserve">, représentante du DSAS, c'est-à-dire de l'administration de tutelle (État de Vaud, </w:t>
+      </w:r>
+      <w:proofErr w:type="spellStart"/>
+      <w:r>
+        <w:rPr>
+          <w:lang w:val="fr-FR"/>
+        </w:rPr>
+        <w:t>s.d</w:t>
+      </w:r>
+      <w:proofErr w:type="spellEnd"/>
+      <w:r>
+        <w:rPr>
+          <w:lang w:val="fr-FR"/>
+        </w:rPr>
+        <w:t xml:space="preserve">.-c ; Unisanté, </w:t>
+      </w:r>
+      <w:proofErr w:type="spellStart"/>
+      <w:r>
+        <w:rPr>
+          <w:lang w:val="fr-FR"/>
+        </w:rPr>
+        <w:t>s.d</w:t>
+      </w:r>
+      <w:proofErr w:type="spellEnd"/>
+      <w:r>
+        <w:rPr>
+          <w:lang w:val="fr-FR"/>
+        </w:rPr>
+        <w:t xml:space="preserve">.-b). La direction générale est, elle aussi, désignée par le Conseil d'État (État de Vaud, </w:t>
+      </w:r>
+      <w:proofErr w:type="spellStart"/>
+      <w:r>
+        <w:rPr>
+          <w:lang w:val="fr-FR"/>
+        </w:rPr>
+        <w:t>s.d</w:t>
+      </w:r>
+      <w:proofErr w:type="spellEnd"/>
+      <w:r>
+        <w:rPr>
+          <w:lang w:val="fr-FR"/>
+        </w:rPr>
+        <w:t xml:space="preserve">.-b). Le directeur général préside un comité de direction qui réunit les directions transversales (finances, ressources humaines, direction médicale, direction des soins) et les chefs des sept départements, dont le DUSC auquel appartient la CTMG (Unisanté, </w:t>
+      </w:r>
+      <w:proofErr w:type="spellStart"/>
+      <w:r>
+        <w:rPr>
+          <w:lang w:val="fr-FR"/>
+        </w:rPr>
+        <w:t>s.d</w:t>
+      </w:r>
+      <w:proofErr w:type="spellEnd"/>
+      <w:r>
+        <w:rPr>
+          <w:lang w:val="fr-FR"/>
+        </w:rPr>
+        <w:t>.-a).</w:t>
       </w:r>
     </w:p>
     <w:p>
@@ -3356,14 +3670,24 @@
           <w:i/>
           <w:lang w:val="fr-FR"/>
         </w:rPr>
-        <w:t>one-tier</w:t>
-      </w:r>
+        <w:t>one-</w:t>
+      </w:r>
+      <w:proofErr w:type="spellStart"/>
+      <w:r>
+        <w:rPr>
+          <w:i/>
+          <w:lang w:val="fr-FR"/>
+        </w:rPr>
+        <w:t>tier</w:t>
+      </w:r>
+      <w:proofErr w:type="spellEnd"/>
       <w:r>
         <w:rPr>
           <w:lang w:val="fr-FR"/>
         </w:rPr>
         <w:t>) réunit dans un même organe la surveillance et la direction. Le système dualiste (</w:t>
       </w:r>
+      <w:proofErr w:type="spellStart"/>
       <w:r>
         <w:rPr>
           <w:i/>
@@ -3371,6 +3695,7 @@
         </w:rPr>
         <w:t>two-tier</w:t>
       </w:r>
+      <w:proofErr w:type="spellEnd"/>
       <w:r>
         <w:rPr>
           <w:lang w:val="fr-FR"/>
@@ -3418,7 +3743,21 @@
         <w:rPr>
           <w:lang w:val="fr-FR"/>
         </w:rPr>
-        <w:t>L'atout classique du dualisme est l'indépendance de l'organe de surveillance, qui n'a pas à contrôler ses propres décisions. Sa limite est symétrique : ne participant pas à la gestion, il dépend de ce que la direction lui transmet. Forbes et Milliken (1999) décrivent le conseil comme un groupe de décision épisodique, dont l'efficacité tient moins à sa composition qu'à ses processus : effort consenti, mobilisation des connaissances, débat contradictoire. Un conseil peut être parfaitement constitué et rester aveugle sur ce qu'on ne lui présente pas. Or l'information de la CTMG chemine du service au DUSC, puis au comité de direction et au Conseil, chaque étape la résumant. La dégradation du climat décrite par les collaborateurs a peu de chances d'y parvenir autrement que sous une forme très filtrée ou édulcorée.</w:t>
+        <w:t xml:space="preserve">L'atout classique du dualisme est l'indépendance de l'organe de surveillance, qui n'a pas à contrôler ses propres décisions. Sa limite est symétrique : ne participant pas à la gestion, il dépend de ce que la direction lui transmet. Forbes et </w:t>
+      </w:r>
+      <w:proofErr w:type="spellStart"/>
+      <w:r>
+        <w:rPr>
+          <w:lang w:val="fr-FR"/>
+        </w:rPr>
+        <w:t>Milliken</w:t>
+      </w:r>
+      <w:proofErr w:type="spellEnd"/>
+      <w:r>
+        <w:rPr>
+          <w:lang w:val="fr-FR"/>
+        </w:rPr>
+        <w:t xml:space="preserve"> (1999) décrivent le conseil comme un groupe de décision épisodique, dont l'efficacité tient moins à sa composition qu'à ses processus : effort consenti, mobilisation des connaissances, débat contradictoire. Un conseil peut être parfaitement constitué et rester aveugle sur ce qu'on ne lui présente pas. Or l'information de la CTMG chemine du service au DUSC, puis au comité de direction et au Conseil, chaque étape la résumant. La dégradation du climat décrite par les collaborateurs a peu de chances d'y parvenir autrement que sous une forme très filtrée ou édulcorée.</w:t>
       </w:r>
     </w:p>
     <w:p>
@@ -3444,7 +3783,21 @@
         <w:rPr>
           <w:lang w:val="fr-FR"/>
         </w:rPr>
-        <w:t>La direction des ressources humaines siège au comité de direction, et donc à l'échelon exécutif. Les informations publiques que nous avons consultées ne font état d'aucune commission du Conseil consacrée aux ressources humaines. Hilb (2016) plaide précisément pour que les questions de personnel soient intégrées au travail du conseil lui-même. Petrovic et al. (2018) voient dans la gouvernance le « chaînon manquant » entre les pratiques RH et la performance. La configuration observée à Unisanté place la GRH du côté de la mise en œuvre. Les questions humaines ne deviennent un objet de gouvernance que si l'exécutif choisit de les porter devant le Conseil. Les travaux de Bédat (2024), qui portent justement sur l'influence des conseils d'administration sur la stratégie RH dans le contexte suisse, invitent à interroger ce point plutôt qu'à le tenir pour acquis.</w:t>
+        <w:t xml:space="preserve">La direction des ressources humaines siège au comité de direction, et donc à l'échelon exécutif. Les informations publiques que nous avons consultées ne font état d'aucune commission du Conseil consacrée aux ressources humaines. </w:t>
+      </w:r>
+      <w:proofErr w:type="spellStart"/>
+      <w:r>
+        <w:rPr>
+          <w:lang w:val="fr-FR"/>
+        </w:rPr>
+        <w:t>Hilb</w:t>
+      </w:r>
+      <w:proofErr w:type="spellEnd"/>
+      <w:r>
+        <w:rPr>
+          <w:lang w:val="fr-FR"/>
+        </w:rPr>
+        <w:t xml:space="preserve"> (2016) plaide précisément pour que les questions de personnel soient intégrées au travail du conseil lui-même. Petrovic et al. (2018) voient dans la gouvernance le « chaînon manquant » entre les pratiques RH et la performance. La configuration observée à Unisanté place la GRH du côté de la mise en œuvre. Les questions humaines ne deviennent un objet de gouvernance que si l'exécutif choisit de les porter devant le Conseil. Les travaux de Bédat (2024), qui portent justement sur l'influence des conseils d'administration sur la stratégie RH dans le contexte suisse, invitent à interroger ce point plutôt qu'à le tenir pour acquis.</w:t>
       </w:r>
     </w:p>
     <w:p>
@@ -3548,6 +3901,7 @@
               <w:spacing w:after="40" w:line="240" w:lineRule="auto"/>
               <w:jc w:val="left"/>
             </w:pPr>
+            <w:proofErr w:type="spellStart"/>
             <w:r>
               <w:rPr>
                 <w:b/>
@@ -3555,6 +3909,7 @@
               </w:rPr>
               <w:t>Acteur</w:t>
             </w:r>
+            <w:proofErr w:type="spellEnd"/>
           </w:p>
         </w:tc>
         <w:tc>
@@ -3567,13 +3922,31 @@
               <w:spacing w:after="40" w:line="240" w:lineRule="auto"/>
               <w:jc w:val="left"/>
             </w:pPr>
+            <w:proofErr w:type="spellStart"/>
             <w:r>
               <w:rPr>
                 <w:b/>
                 <w:sz w:val="20"/>
               </w:rPr>
-              <w:t>Rôle formel</w:t>
-            </w:r>
+              <w:t>Rôle</w:t>
+            </w:r>
+            <w:proofErr w:type="spellEnd"/>
+            <w:r>
+              <w:rPr>
+                <w:b/>
+                <w:sz w:val="20"/>
+              </w:rPr>
+              <w:t xml:space="preserve"> </w:t>
+            </w:r>
+            <w:proofErr w:type="spellStart"/>
+            <w:r>
+              <w:rPr>
+                <w:b/>
+                <w:sz w:val="20"/>
+              </w:rPr>
+              <w:t>formel</w:t>
+            </w:r>
+            <w:proofErr w:type="spellEnd"/>
           </w:p>
         </w:tc>
         <w:tc>
@@ -3614,12 +3987,28 @@
               <w:spacing w:after="40" w:line="240" w:lineRule="auto"/>
               <w:jc w:val="left"/>
             </w:pPr>
+            <w:proofErr w:type="spellStart"/>
             <w:r>
               <w:rPr>
                 <w:sz w:val="20"/>
               </w:rPr>
-              <w:t>Conseil d'Unisanté</w:t>
-            </w:r>
+              <w:t>Conseil</w:t>
+            </w:r>
+            <w:proofErr w:type="spellEnd"/>
+            <w:r>
+              <w:rPr>
+                <w:sz w:val="20"/>
+              </w:rPr>
+              <w:t xml:space="preserve"> </w:t>
+            </w:r>
+            <w:proofErr w:type="spellStart"/>
+            <w:r>
+              <w:rPr>
+                <w:sz w:val="20"/>
+              </w:rPr>
+              <w:t>d'Unisanté</w:t>
+            </w:r>
+            <w:proofErr w:type="spellEnd"/>
           </w:p>
         </w:tc>
         <w:tc>
@@ -3683,7 +4072,21 @@
               <w:rPr>
                 <w:sz w:val="20"/>
               </w:rPr>
-              <w:t>Direction générale, DUSC</w:t>
+              <w:t xml:space="preserve">Direction </w:t>
+            </w:r>
+            <w:proofErr w:type="spellStart"/>
+            <w:r>
+              <w:rPr>
+                <w:sz w:val="20"/>
+              </w:rPr>
+              <w:t>générale</w:t>
+            </w:r>
+            <w:proofErr w:type="spellEnd"/>
+            <w:r>
+              <w:rPr>
+                <w:sz w:val="20"/>
+              </w:rPr>
+              <w:t>, DUSC</w:t>
             </w:r>
           </w:p>
         </w:tc>
@@ -3809,11 +4212,19 @@
               <w:spacing w:after="40" w:line="240" w:lineRule="auto"/>
               <w:jc w:val="left"/>
             </w:pPr>
+            <w:proofErr w:type="spellStart"/>
             <w:r>
               <w:rPr>
                 <w:sz w:val="20"/>
               </w:rPr>
-              <w:t>Cheffe de service</w:t>
+              <w:t>Cheffe</w:t>
+            </w:r>
+            <w:proofErr w:type="spellEnd"/>
+            <w:r>
+              <w:rPr>
+                <w:sz w:val="20"/>
+              </w:rPr>
+              <w:t xml:space="preserve"> de service</w:t>
             </w:r>
           </w:p>
         </w:tc>
@@ -3943,8 +4354,16 @@
               <w:rPr>
                 <w:sz w:val="20"/>
               </w:rPr>
-              <w:t>Chefs de salle</w:t>
-            </w:r>
+              <w:t xml:space="preserve">Chefs de </w:t>
+            </w:r>
+            <w:proofErr w:type="spellStart"/>
+            <w:r>
+              <w:rPr>
+                <w:sz w:val="20"/>
+              </w:rPr>
+              <w:t>salle</w:t>
+            </w:r>
+            <w:proofErr w:type="spellEnd"/>
           </w:p>
         </w:tc>
         <w:tc>
@@ -4034,11 +4453,33 @@
           <w:lang w:val="fr-FR"/>
         </w:rPr>
       </w:pPr>
-      <w:r>
-        <w:rPr>
-          <w:lang w:val="fr-FR"/>
-        </w:rPr>
-        <w:t>Reichel et Lazarova (2013) distinguent deux mouvements qui transforment la position des départements RH : l'externalisation de certaines activités et la délégation de la gestion quotidienne du personnel aux managers de ligne. À la CTMG, les RH d'Unisanté sont centralisées et ne travaillent pas dans le service ; la gestion courante des collaborateurs repose sur les cadres de proximité, et la présence RH sur place se limite à une matinée par semaine, dont, selon E1, peu de collègues se saisissent.</w:t>
+      <w:proofErr w:type="spellStart"/>
+      <w:r>
+        <w:rPr>
+          <w:lang w:val="fr-FR"/>
+        </w:rPr>
+        <w:t>Reichel</w:t>
+      </w:r>
+      <w:proofErr w:type="spellEnd"/>
+      <w:r>
+        <w:rPr>
+          <w:lang w:val="fr-FR"/>
+        </w:rPr>
+        <w:t xml:space="preserve"> et </w:t>
+      </w:r>
+      <w:proofErr w:type="spellStart"/>
+      <w:r>
+        <w:rPr>
+          <w:lang w:val="fr-FR"/>
+        </w:rPr>
+        <w:t>Lazarova</w:t>
+      </w:r>
+      <w:proofErr w:type="spellEnd"/>
+      <w:r>
+        <w:rPr>
+          <w:lang w:val="fr-FR"/>
+        </w:rPr>
+        <w:t xml:space="preserve"> (2013) distinguent deux mouvements qui transforment la position des départements RH : l'externalisation de certaines activités et la délégation de la gestion quotidienne du personnel aux managers de ligne. À la CTMG, les RH d'Unisanté sont centralisées et ne travaillent pas dans le service ; la gestion courante des collaborateurs repose sur les cadres de proximité, et la présence RH sur place se limite à une matinée par semaine, dont, selon E1, peu de collègues se saisissent.</w:t>
       </w:r>
     </w:p>
     <w:p>
@@ -4086,18 +4527,50 @@
         </w:rPr>
         <w:t xml:space="preserve">Les chefs de salle occupent une place singulière. Sans lien hiérarchique avec leurs collègues, ils reçoivent ce qui ne se dit pas ailleurs : « les collègues viennent souvent nous parler de manière informelle » (E1). E2 explique que c'est justement l'absence de lien hiérarchique qui a rendu possible une discussion ouverte, alors que la même question adressée aux cadres « était vécue comme une agression ». Les chefs de salle jouent ainsi un rôle d'intermédiaire entre deux mondes, comparable à celui que le module décrit pour les </w:t>
       </w:r>
+      <w:proofErr w:type="spellStart"/>
       <w:r>
         <w:rPr>
           <w:i/>
           <w:lang w:val="fr-FR"/>
         </w:rPr>
-        <w:t>boundary spanners</w:t>
-      </w:r>
-      <w:r>
-        <w:rPr>
-          <w:lang w:val="fr-FR"/>
-        </w:rPr>
-        <w:t>, ces acteurs qui traduisent d'une logique à l'autre (Bonnet et al., 2017). Mais ce rôle n'est ni reconnu ni outillé. Ce que les chefs de salle transmettent formellement à l'encadrement, ce sont des volumes d'appels. Les signaux humains qu'ils recueillent restent à leur niveau.</w:t>
+        <w:t>boundary</w:t>
+      </w:r>
+      <w:proofErr w:type="spellEnd"/>
+      <w:r>
+        <w:rPr>
+          <w:i/>
+          <w:lang w:val="fr-FR"/>
+        </w:rPr>
+        <w:t xml:space="preserve"> </w:t>
+      </w:r>
+      <w:proofErr w:type="spellStart"/>
+      <w:r>
+        <w:rPr>
+          <w:i/>
+          <w:lang w:val="fr-FR"/>
+        </w:rPr>
+        <w:t>spanners</w:t>
+      </w:r>
+      <w:proofErr w:type="spellEnd"/>
+      <w:r>
+        <w:rPr>
+          <w:lang w:val="fr-FR"/>
+        </w:rPr>
+        <w:t xml:space="preserve">, ces acteurs qui traduisent d'une logique à l'autre (Bonnet et </w:t>
+      </w:r>
+      <w:proofErr w:type="gramStart"/>
+      <w:r>
+        <w:rPr>
+          <w:lang w:val="fr-FR"/>
+        </w:rPr>
+        <w:t>al.,</w:t>
+      </w:r>
+      <w:proofErr w:type="gramEnd"/>
+      <w:r>
+        <w:rPr>
+          <w:lang w:val="fr-FR"/>
+        </w:rPr>
+        <w:t xml:space="preserve"> 2017). Mais ce rôle n'est ni reconnu ni outillé. Ce que les chefs de salle transmettent formellement à l'encadrement, ce sont des volumes d'appels. Les signaux humains qu'ils recueillent restent à leur niveau.</w:t>
       </w:r>
     </w:p>
     <w:p>
@@ -4126,7 +4599,35 @@
         <w:rPr>
           <w:lang w:val="fr-FR"/>
         </w:rPr>
-        <w:t>La fonction RH ne dispose pas seulement d'un pouvoir formel. Son influence repose aussi sur sa crédibilité auprès des différents acteurs (Aldrich et al., 2015 ; Sheehan et al., 2014). Or l'épisode qui a suivi l'audit interne a entamé cette crédibilité auprès des équipes. Les collaborateurs avaient exprimé leurs difficultés, et ils n'ont reçu aucun retour sur les conclusions. Ils ont en revanche reçu un message des RH exprimant leur confiance envers la direction. E1 précise que la réaction négative ne venait pas d'une attente de prise de position contre la direction. Elle venait du sentiment que « leur parole n'avait pas vraiment de poids ». Depuis, une partie des collaborateurs « perçoit les RH comme étant plus proches de la direction que des équipes » (E1).</w:t>
+        <w:t xml:space="preserve">La fonction RH ne dispose pas seulement d'un pouvoir formel. Son influence repose aussi sur sa crédibilité auprès des différents acteurs (Aldrich et </w:t>
+      </w:r>
+      <w:proofErr w:type="gramStart"/>
+      <w:r>
+        <w:rPr>
+          <w:lang w:val="fr-FR"/>
+        </w:rPr>
+        <w:t>al.,</w:t>
+      </w:r>
+      <w:proofErr w:type="gramEnd"/>
+      <w:r>
+        <w:rPr>
+          <w:lang w:val="fr-FR"/>
+        </w:rPr>
+        <w:t xml:space="preserve"> 2015 ; </w:t>
+      </w:r>
+      <w:proofErr w:type="spellStart"/>
+      <w:r>
+        <w:rPr>
+          <w:lang w:val="fr-FR"/>
+        </w:rPr>
+        <w:t>Sheehan</w:t>
+      </w:r>
+      <w:proofErr w:type="spellEnd"/>
+      <w:r>
+        <w:rPr>
+          <w:lang w:val="fr-FR"/>
+        </w:rPr>
+        <w:t xml:space="preserve"> et al., 2014). Or l'épisode qui a suivi l'audit interne a entamé cette crédibilité auprès des équipes. Les collaborateurs avaient exprimé leurs difficultés, et ils n'ont reçu aucun retour sur les conclusions. Ils ont en revanche reçu un message des RH exprimant leur confiance envers la direction. E1 précise que la réaction négative ne venait pas d'une attente de prise de position contre la direction. Elle venait du sentiment que « leur parole n'avait pas vraiment de poids ». Depuis, une partie des collaborateurs « perçoit les RH comme étant plus proches de la direction que des équipes » (E1).</w:t>
       </w:r>
     </w:p>
     <w:p>
@@ -4159,7 +4660,21 @@
           <w:lang w:val="fr-FR"/>
         </w:rPr>
         <w:lastRenderedPageBreak/>
-        <w:t>en tire une règle de conduite personnelle : « je ne veux pas m'attirer les foudres ». Nous ne pouvons pas vérifier la manière dont ces épisodes ont été vécus de l'autre côté. Leur effet sur le comportement des collaborateurs est en revanche clairement exprimé : on se tait, ou on parle seulement entre pairs (Pfeffer, 1992).</w:t>
+        <w:t>en tire une règle de conduite personnelle : « je ne veux pas m'attirer les foudres ». Nous ne pouvons pas vérifier la manière dont ces épisodes ont été vécus de l'autre côté. Leur effet sur le comportement des collaborateurs est en revanche clairement exprimé : on se tait, ou on parle seulement entre pairs (</w:t>
+      </w:r>
+      <w:proofErr w:type="spellStart"/>
+      <w:r>
+        <w:rPr>
+          <w:lang w:val="fr-FR"/>
+        </w:rPr>
+        <w:t>Pfeffer</w:t>
+      </w:r>
+      <w:proofErr w:type="spellEnd"/>
+      <w:r>
+        <w:rPr>
+          <w:lang w:val="fr-FR"/>
+        </w:rPr>
+        <w:t>, 1992).</w:t>
       </w:r>
     </w:p>
     <w:p>
@@ -4201,7 +4716,21 @@
         <w:rPr>
           <w:lang w:val="fr-FR"/>
         </w:rPr>
-        <w:t>Les sections précédentes décrivent un circuit d'information défaillant. Elles n'expliquent pas pourquoi ceux qui se trouvent en haut de la chaîne ne cherchent pas davantage à le réparer. Charreaux (2005) invite à prendre au sérieux cette question : les dirigeants et les administrateurs ne sont pas des décideurs parfaitement rationnels, et leurs biais font partie des mécanismes de gouvernance eux-mêmes. Les décideurs concernés (direction du service, DUSC, RH, Conseil) n'ont pas été interrogés. Les biais présentés ici sont donc des hypothèses construites à partir de ce qui est observable depuis le terrain, et non des diagnostics posés sur des personnes. Pour chacun, nous indiquons ce qui dans les données le suggère, le mécanisme en jeu et ce qu'il produit sur l'orchestration RH.</w:t>
+        <w:t xml:space="preserve">Les sections précédentes décrivent un circuit d'information défaillant. Elles n'expliquent pas pourquoi ceux qui se trouvent en haut de la chaîne ne cherchent pas davantage à le réparer. </w:t>
+      </w:r>
+      <w:proofErr w:type="spellStart"/>
+      <w:r>
+        <w:rPr>
+          <w:lang w:val="fr-FR"/>
+        </w:rPr>
+        <w:t>Charreaux</w:t>
+      </w:r>
+      <w:proofErr w:type="spellEnd"/>
+      <w:r>
+        <w:rPr>
+          <w:lang w:val="fr-FR"/>
+        </w:rPr>
+        <w:t xml:space="preserve"> (2005) invite à prendre au sérieux cette question : les dirigeants et les administrateurs ne sont pas des décideurs parfaitement rationnels, et leurs biais font partie des mécanismes de gouvernance eux-mêmes. Les décideurs concernés (direction du service, DUSC, RH, Conseil) n'ont pas été interrogés. Les biais présentés ici sont donc des hypothèses construites à partir de ce qui est observable depuis le terrain, et non des diagnostics posés sur des personnes. Pour chacun, nous indiquons ce qui dans les données le suggère, le mécanisme en jeu et ce qu'il produit sur l'orchestration RH.</w:t>
       </w:r>
     </w:p>
     <w:p>
@@ -4226,11 +4755,19 @@
           <w:lang w:val="fr-FR"/>
         </w:rPr>
       </w:pPr>
-      <w:r>
-        <w:rPr>
-          <w:lang w:val="fr-FR"/>
-        </w:rPr>
-        <w:t>Ocasio (1997) propose de comprendre le comportement des organisations à partir de la manière dont elles distribuent l'attention de leurs décideurs. L'attention est une ressource rare. Ce sur quoi elle se porte dépend moins des préférences individuelles que des canaux, des règles et des procédures que l'organisation met à disposition. Une question qui ne dispose d'aucun canal pour atteindre les décideurs a peu de chances de retenir leur attention, quelle que soit son importance.</w:t>
+      <w:proofErr w:type="spellStart"/>
+      <w:r>
+        <w:rPr>
+          <w:lang w:val="fr-FR"/>
+        </w:rPr>
+        <w:t>Ocasio</w:t>
+      </w:r>
+      <w:proofErr w:type="spellEnd"/>
+      <w:r>
+        <w:rPr>
+          <w:lang w:val="fr-FR"/>
+        </w:rPr>
+        <w:t xml:space="preserve"> (1997) propose de comprendre le comportement des organisations à partir de la manière dont elles distribuent l'attention de leurs décideurs. L'attention est une ressource rare. Ce sur quoi elle se porte dépend moins des préférences individuelles que des canaux, des règles et des procédures que l'organisation met à disposition. Une question qui ne dispose d'aucun canal pour atteindre les décideurs a peu de chances de retenir leur attention, quelle que soit son importance.</w:t>
       </w:r>
     </w:p>
     <w:p>
@@ -4273,7 +4810,49 @@
         <w:rPr>
           <w:lang w:val="fr-FR"/>
         </w:rPr>
-        <w:t>L'heuristique de disponibilité conduit à estimer l'importance d'un phénomène selon la facilité avec laquelle des exemples viennent à l'esprit (Tversky &amp; Kahneman, 1974), et le jugement intuitif s'appuie sur ce qui est immédiatement accessible sans chercher ce qui manque (Kahneman, 2012). Un organe qui ne reçoit ni plainte formelle, ni alerte, ni indicateur dégradé conclura donc assez naturellement que la situation est maîtrisée. Or, à la CTMG, l'absence de plainte résulte en partie du silence décrit en section 4.3. Les décideurs risquent de tirer une conclusion rassurante d'une absence d'information que le problème lui-même produit.</w:t>
+        <w:t>L'heuristique de disponibilité conduit à estimer l'importance d'un phénomène selon la facilité avec laquelle des exemples viennent à l'esprit (</w:t>
+      </w:r>
+      <w:proofErr w:type="spellStart"/>
+      <w:r>
+        <w:rPr>
+          <w:lang w:val="fr-FR"/>
+        </w:rPr>
+        <w:t>Tversky</w:t>
+      </w:r>
+      <w:proofErr w:type="spellEnd"/>
+      <w:r>
+        <w:rPr>
+          <w:lang w:val="fr-FR"/>
+        </w:rPr>
+        <w:t xml:space="preserve"> &amp; </w:t>
+      </w:r>
+      <w:proofErr w:type="spellStart"/>
+      <w:r>
+        <w:rPr>
+          <w:lang w:val="fr-FR"/>
+        </w:rPr>
+        <w:t>Kahneman</w:t>
+      </w:r>
+      <w:proofErr w:type="spellEnd"/>
+      <w:r>
+        <w:rPr>
+          <w:lang w:val="fr-FR"/>
+        </w:rPr>
+        <w:t>, 1974), et le jugement intuitif s'appuie sur ce qui est immédiatement accessible sans chercher ce qui manque (</w:t>
+      </w:r>
+      <w:proofErr w:type="spellStart"/>
+      <w:r>
+        <w:rPr>
+          <w:lang w:val="fr-FR"/>
+        </w:rPr>
+        <w:t>Kahneman</w:t>
+      </w:r>
+      <w:proofErr w:type="spellEnd"/>
+      <w:r>
+        <w:rPr>
+          <w:lang w:val="fr-FR"/>
+        </w:rPr>
+        <w:t>, 2012). Un organe qui ne reçoit ni plainte formelle, ni alerte, ni indicateur dégradé conclura donc assez naturellement que la situation est maîtrisée. Or, à la CTMG, l'absence de plainte résulte en partie du silence décrit en section 4.3. Les décideurs risquent de tirer une conclusion rassurante d'une absence d'information que le problème lui-même produit.</w:t>
       </w:r>
     </w:p>
     <w:p>
@@ -4311,24 +4890,88 @@
           <w:lang w:val="fr-FR"/>
         </w:rPr>
       </w:pPr>
-      <w:r>
-        <w:rPr>
-          <w:lang w:val="fr-FR"/>
-        </w:rPr>
-        <w:t>Schwenk (1988) recense parmi les biais les plus fréquents de la décision stratégique la tendance à interpréter les informations nouvelles à la lumière des croyances préalables, en retenant ce qui les confirme. Simonson et Staw (1992) montrent de leur côté comment les décideurs persistent dans une voie engagée lorsqu'ils s'en sentent personnellement responsables, et comment certaines techniques, comme fixer à l'avance des seuils d'alerte ou évaluer les décideurs sur la qualité de leur processus plutôt que sur l'issue, réduisent cette escalade. L'hypothèse que nous formulons est la suivante. La fonction de cheffe de service a été créée et pourvue par l'institution pendant la tutelle, dans un contexte de crise. Remettre en cause la manière dont le service est dirigé reviendrait, pour l'institution, à réexaminer ses propres choix. Le risque est alors de lire les résultats d'un audit dans le sens le plus compatible avec la décision initiale, et de réaffirmer publiquement son engagement plutôt que d'ouvrir la question.</w:t>
-      </w:r>
-    </w:p>
-    <w:p>
-      <w:pPr>
-        <w:rPr>
-          <w:lang w:val="fr-FR"/>
-        </w:rPr>
-      </w:pPr>
-      <w:r>
-        <w:rPr>
-          <w:lang w:val="fr-FR"/>
-        </w:rPr>
-        <w:t>Cette hypothèse doit être tenue à distance, car d'autres explications sont plausibles. L'audit peut n'avoir rien révélé qui justifie un changement. Les RH peuvent être tenues à un devoir de réserve sur son contenu. L'accompagnement managérial dont la direction a bénéficié, que E1 a appris de manière informelle, peut être la réponse que l'institution a jugée proportionnée, et il a d'ailleurs produit des effets visibles sur la communication. Mais c'est précisément parce que plusieurs lectures sont possibles que l'absence de restitution pose problème. Faute d'information, les collaborateurs retiennent la plus défavorable : leur parole « n'avait pas vraiment de poids » (E1).</w:t>
+      <w:proofErr w:type="spellStart"/>
+      <w:r>
+        <w:rPr>
+          <w:lang w:val="fr-FR"/>
+        </w:rPr>
+        <w:t>Schwenk</w:t>
+      </w:r>
+      <w:proofErr w:type="spellEnd"/>
+      <w:r>
+        <w:rPr>
+          <w:lang w:val="fr-FR"/>
+        </w:rPr>
+        <w:t xml:space="preserve"> (1988) recense parmi les biais les plus fréquents de la décision stratégique la tendance à interpréter les informations nouvelles à la lumière des croyances préalables, en retenant ce qui les confirme. </w:t>
+      </w:r>
+      <w:proofErr w:type="spellStart"/>
+      <w:r>
+        <w:rPr>
+          <w:lang w:val="fr-FR"/>
+        </w:rPr>
+        <w:t>Simonson</w:t>
+      </w:r>
+      <w:proofErr w:type="spellEnd"/>
+      <w:r>
+        <w:rPr>
+          <w:lang w:val="fr-FR"/>
+        </w:rPr>
+        <w:t xml:space="preserve"> et </w:t>
+      </w:r>
+      <w:proofErr w:type="spellStart"/>
+      <w:r>
+        <w:rPr>
+          <w:lang w:val="fr-FR"/>
+        </w:rPr>
+        <w:t>Staw</w:t>
+      </w:r>
+      <w:proofErr w:type="spellEnd"/>
+      <w:r>
+        <w:rPr>
+          <w:lang w:val="fr-FR"/>
+        </w:rPr>
+        <w:t xml:space="preserve"> (1992) montrent de leur côté comment les décideurs persistent dans une voie engagée lorsqu'ils s'en sentent personnellement responsables, et comment certaines techniques, comme fixer à l'avance des seuils d'alerte ou évaluer les décideurs sur la qualité de leur processus plutôt que sur l'issue, réduisent cette escalade. L'hypothèse que nous formulons est la suivante. La fonction de cheffe de service a été créée et pourvue par l'institution pendant la tutelle, dans un contexte de crise. Remettre en cause la manière dont le service est dirigé reviendrait, pour l'institution, à réexaminer ses propres choix. Le risque est alors de lire les résultats d'un audit dans le sens le plus compatible avec la décision initiale, et de réaffirmer publiquement son engagement plutôt que d'ouvrir la question.</w:t>
+      </w:r>
+    </w:p>
+    <w:p>
+      <w:pPr>
+        <w:rPr>
+          <w:lang w:val="fr-FR"/>
+        </w:rPr>
+      </w:pPr>
+      <w:r>
+        <w:rPr>
+          <w:lang w:val="fr-FR"/>
+        </w:rPr>
+        <w:t xml:space="preserve">Cette hypothèse doit être tenue à distance, car d'autres explications sont plausibles. L'audit peut n'avoir rien révélé qui justifie un changement. Les RH peuvent être </w:t>
+      </w:r>
+      <w:proofErr w:type="gramStart"/>
+      <w:r>
+        <w:rPr>
+          <w:lang w:val="fr-FR"/>
+        </w:rPr>
+        <w:t>tenues</w:t>
+      </w:r>
+      <w:proofErr w:type="gramEnd"/>
+      <w:r>
+        <w:rPr>
+          <w:lang w:val="fr-FR"/>
+        </w:rPr>
+        <w:t xml:space="preserve"> à un devoir de réserve sur son contenu. L'accompagnement managérial dont la direction a bénéficié, que E1 a appris de manière informelle, </w:t>
+      </w:r>
+      <w:proofErr w:type="spellStart"/>
+      <w:r>
+        <w:rPr>
+          <w:lang w:val="fr-FR"/>
+        </w:rPr>
+        <w:t>peut être</w:t>
+      </w:r>
+      <w:proofErr w:type="spellEnd"/>
+      <w:r>
+        <w:rPr>
+          <w:lang w:val="fr-FR"/>
+        </w:rPr>
+        <w:t xml:space="preserve"> la réponse que l'institution a jugée proportionnée, et il a d'ailleurs produit des effets visibles sur la communication. Mais c'est précisément parce que plusieurs lectures sont possibles que l'absence de restitution pose problème. Faute d'information, les collaborateurs retiennent la plus défavorable : leur parole « n'avait pas vraiment de poids » (E1).</w:t>
       </w:r>
     </w:p>
     <w:p>
@@ -4357,7 +5000,21 @@
         <w:rPr>
           <w:lang w:val="fr-FR"/>
         </w:rPr>
-        <w:t>L'erreur fondamentale d'attribution désigne la tendance à expliquer les comportements d'autrui par ses dispositions personnelles plutôt que par la situation. McCormick et Martinko (2004) ont montré que les attributions causales que font les leaders sur la performance de leurs collaborateurs orientent directement leurs réactions. Barker et Barr (2002) observent que les dirigeants qui attribuent un déclin à des causes internes sont plus enclins à engager une réorientation que ceux qui l'attribuent à des causes extérieures à leur propre action.</w:t>
+        <w:t xml:space="preserve">L'erreur fondamentale d'attribution désigne la tendance à expliquer les comportements d'autrui par ses dispositions personnelles plutôt que par la situation. McCormick et </w:t>
+      </w:r>
+      <w:proofErr w:type="spellStart"/>
+      <w:r>
+        <w:rPr>
+          <w:lang w:val="fr-FR"/>
+        </w:rPr>
+        <w:t>Martinko</w:t>
+      </w:r>
+      <w:proofErr w:type="spellEnd"/>
+      <w:r>
+        <w:rPr>
+          <w:lang w:val="fr-FR"/>
+        </w:rPr>
+        <w:t xml:space="preserve"> (2004) ont montré que les attributions causales que font les leaders sur la performance de leurs collaborateurs orientent directement leurs réactions. Barker et Barr (2002) observent que les dirigeants qui attribuent un déclin à des causes internes sont plus enclins à engager une réorientation que ceux qui l'attribuent à des causes extérieures à leur propre action.</w:t>
       </w:r>
     </w:p>
     <w:p>
@@ -4377,7 +5034,35 @@
           <w:lang w:val="fr-FR"/>
         </w:rPr>
         <w:lastRenderedPageBreak/>
-        <w:t>charge de travail en période de sous-effectif (E2). Une collaboratrice décrite comme « dans la revendication » finit par partir, et son départ est vécu par ses collègues comme l'aboutissement d'une mise à l'écart, alors que, selon E2, elle disait « des choses qui pouvaient être vraies ». Si chaque départ est lu comme un cas particulier (une personnalité difficile, un projet personnel, une inadaptation au poste), la série des départs ne devient jamais un phénomène organisationnel. Pour reprendre Barker et Barr, l'absence d'attribution interne rend la réorientation improbable. Le même mécanisme peut jouer au niveau du Conseil, dont l'évaluation de la direction dépend des attributions qu'il fait des difficultés qu'on lui rapporte (Haleblian &amp; Rajagopalan, 2006).</w:t>
+        <w:t>charge de travail en période de sous-effectif (E2). Une collaboratrice décrite comme « dans la revendication » finit par partir, et son départ est vécu par ses collègues comme l'aboutissement d'une mise à l'écart, alors que, selon E2, elle disait « des choses qui pouvaient être vraies ». Si chaque départ est lu comme un cas particulier (une personnalité difficile, un projet personnel, une inadaptation au poste), la série des départs ne devient jamais un phénomène organisationnel. Pour reprendre Barker et Barr, l'absence d'attribution interne rend la réorientation improbable. Le même mécanisme peut jouer au niveau du Conseil, dont l'évaluation de la direction dépend des attributions qu'il fait des difficultés qu'on lui rapporte (</w:t>
+      </w:r>
+      <w:proofErr w:type="spellStart"/>
+      <w:r>
+        <w:rPr>
+          <w:lang w:val="fr-FR"/>
+        </w:rPr>
+        <w:t>Haleblian</w:t>
+      </w:r>
+      <w:proofErr w:type="spellEnd"/>
+      <w:r>
+        <w:rPr>
+          <w:lang w:val="fr-FR"/>
+        </w:rPr>
+        <w:t xml:space="preserve"> &amp; </w:t>
+      </w:r>
+      <w:proofErr w:type="spellStart"/>
+      <w:r>
+        <w:rPr>
+          <w:lang w:val="fr-FR"/>
+        </w:rPr>
+        <w:t>Rajagopalan</w:t>
+      </w:r>
+      <w:proofErr w:type="spellEnd"/>
+      <w:r>
+        <w:rPr>
+          <w:lang w:val="fr-FR"/>
+        </w:rPr>
+        <w:t>, 2006).</w:t>
       </w:r>
     </w:p>
     <w:p>
@@ -4435,8 +5120,23 @@
         <w:rPr>
           <w:lang w:val="fr-FR"/>
         </w:rPr>
-        <w:t>E1 fait une distinction qui résume bien la situation. Depuis l'accompagnement managérial, la communication est « plus mesuré[e], plus calme, certaines choses sont mieux formulées ». Mais « sur le fond », il ne voit « pas encore de changement majeur dans la gouvernance ». Gioia et Chittipeddi (1991) ont décrit le travail de production de sens (</w:t>
-      </w:r>
+        <w:t xml:space="preserve">E1 fait une distinction qui résume bien la situation. Depuis l'accompagnement managérial, la communication est « plus mesuré[e], plus calme, certaines choses sont mieux formulées ». Mais « sur le fond », il ne voit « pas encore de changement majeur dans la gouvernance ». Gioia et </w:t>
+      </w:r>
+      <w:proofErr w:type="spellStart"/>
+      <w:r>
+        <w:rPr>
+          <w:lang w:val="fr-FR"/>
+        </w:rPr>
+        <w:t>Chittipeddi</w:t>
+      </w:r>
+      <w:proofErr w:type="spellEnd"/>
+      <w:r>
+        <w:rPr>
+          <w:lang w:val="fr-FR"/>
+        </w:rPr>
+        <w:t xml:space="preserve"> (1991) ont décrit le travail de production de sens (</w:t>
+      </w:r>
+      <w:proofErr w:type="spellStart"/>
       <w:r>
         <w:rPr>
           <w:i/>
@@ -4444,24 +5144,53 @@
         </w:rPr>
         <w:t>sensegiving</w:t>
       </w:r>
-      <w:r>
-        <w:rPr>
-          <w:lang w:val="fr-FR"/>
-        </w:rPr>
-        <w:t>) par lequel les dirigeants cherchent à orienter la manière dont les autres interprètent une situation. Weick (1995) rappelle que chacun construit le sens de ce qu'il vit à partir d'indices, et que les collaborateurs interprètent aussi bien les silences que les messages. Ici, l'effort porte sur la formulation, alors que ce qui est interprété par les équipes, ce sont les actes.</w:t>
-      </w:r>
-    </w:p>
-    <w:p>
-      <w:pPr>
-        <w:rPr>
-          <w:lang w:val="fr-FR"/>
-        </w:rPr>
-      </w:pPr>
-      <w:r>
-        <w:rPr>
-          <w:lang w:val="fr-FR"/>
-        </w:rPr>
-        <w:t>Meyer et Rowan (1977) offrent la lecture la plus éclairante de cet épisode. Ils ont montré que les organisations adoptent des structures formelles qui répondent aux attentes de leur environnement institutionnel, et les découplent parfois de leur fonctionnement réel. Ce découplage s'accompagne d'une « logique de confiance » : on affirme sa confiance dans les acteurs et on évite l'inspection approfondie de ce qui se passe réellement. Un audit sans restitution, suivi d'un message de confiance, correspond presque terme à terme à cette description. L'audit remplit sa fonction de légitimité, puisque l'institution a agi, sans produire l'apprentissage qu'on pouvait en attendre.</w:t>
+      <w:proofErr w:type="spellEnd"/>
+      <w:r>
+        <w:rPr>
+          <w:lang w:val="fr-FR"/>
+        </w:rPr>
+        <w:t xml:space="preserve">) par lequel les dirigeants cherchent à orienter la manière dont les autres interprètent une situation. </w:t>
+      </w:r>
+      <w:proofErr w:type="spellStart"/>
+      <w:r>
+        <w:rPr>
+          <w:lang w:val="fr-FR"/>
+        </w:rPr>
+        <w:t>Weick</w:t>
+      </w:r>
+      <w:proofErr w:type="spellEnd"/>
+      <w:r>
+        <w:rPr>
+          <w:lang w:val="fr-FR"/>
+        </w:rPr>
+        <w:t xml:space="preserve"> (1995) rappelle que chacun construit le sens de ce qu'il vit à partir d'indices, et que les collaborateurs interprètent aussi bien les silences que les messages. Ici, l'effort porte sur la formulation, alors que ce qui est interprété par les équipes, ce sont les actes.</w:t>
+      </w:r>
+    </w:p>
+    <w:p>
+      <w:pPr>
+        <w:rPr>
+          <w:lang w:val="fr-FR"/>
+        </w:rPr>
+      </w:pPr>
+      <w:r>
+        <w:rPr>
+          <w:lang w:val="fr-FR"/>
+        </w:rPr>
+        <w:t xml:space="preserve">Meyer et </w:t>
+      </w:r>
+      <w:proofErr w:type="spellStart"/>
+      <w:r>
+        <w:rPr>
+          <w:lang w:val="fr-FR"/>
+        </w:rPr>
+        <w:t>Rowan</w:t>
+      </w:r>
+      <w:proofErr w:type="spellEnd"/>
+      <w:r>
+        <w:rPr>
+          <w:lang w:val="fr-FR"/>
+        </w:rPr>
+        <w:t xml:space="preserve"> (1977) offrent la lecture la plus éclairante de cet épisode. Ils ont montré que les organisations adoptent des structures formelles qui répondent aux attentes de leur environnement institutionnel, et les découplent parfois de leur fonctionnement réel. Ce découplage s'accompagne d'une « logique de confiance » : on affirme sa confiance dans les acteurs et on évite l'inspection approfondie de ce qui se passe réellement. Un audit sans restitution, suivi d'un message de confiance, correspond presque terme à terme à cette description. L'audit remplit sa fonction de légitimité, puisque l'institution a agi, sans produire l'apprentissage qu'on pouvait en attendre.</w:t>
       </w:r>
     </w:p>
     <w:p>
@@ -4510,7 +5239,21 @@
         <w:rPr>
           <w:lang w:val="fr-FR"/>
         </w:rPr>
-        <w:t>Une précaution s'impose au terme de cette section. Tetlock (2000) a montré que la détection des biais dépend aussi du point de vue de celui qui les observe : ce que l'un qualifie de biais, l'autre peut le considérer comme une prudence légitime. Notre position de chef de salle nous rend plus attentif aux biais des décideurs qu'aux nôtres. C'est une raison supplémentaire pour présenter ces analyses comme des hypothèses que seule une démarche contradictoire, incluant la direction et les RH, permettrait de confirmer.</w:t>
+        <w:t xml:space="preserve">Une précaution s'impose au terme de cette section. </w:t>
+      </w:r>
+      <w:proofErr w:type="spellStart"/>
+      <w:r>
+        <w:rPr>
+          <w:lang w:val="fr-FR"/>
+        </w:rPr>
+        <w:t>Tetlock</w:t>
+      </w:r>
+      <w:proofErr w:type="spellEnd"/>
+      <w:r>
+        <w:rPr>
+          <w:lang w:val="fr-FR"/>
+        </w:rPr>
+        <w:t xml:space="preserve"> (2000) a montré que la détection des biais dépend aussi du point de vue de celui qui les observe : ce que l'un qualifie de biais, l'autre peut le considérer comme une prudence légitime. Notre position de chef de salle nous rend plus attentif aux biais des décideurs qu'aux nôtres. C'est une raison supplémentaire pour présenter ces analyses comme des hypothèses que seule une démarche contradictoire, incluant la direction et les RH, permettrait de confirmer.</w:t>
       </w:r>
     </w:p>
     <w:p>
@@ -4535,11 +5278,19 @@
           <w:lang w:val="fr-FR"/>
         </w:rPr>
       </w:pPr>
-      <w:r>
-        <w:rPr>
-          <w:lang w:val="fr-FR"/>
-        </w:rPr>
-        <w:t>Boxall (1996) distingue la qualité du capital humain et celle des processus qui le mobilisent ; un capital humain qualifié « reste stérile s'il n'est pas managé par des pratiques RH structurées, initiées par la gouvernance » (Bédat, 2026). La CTMG illustre bien ce décalage.</w:t>
+      <w:proofErr w:type="spellStart"/>
+      <w:r>
+        <w:rPr>
+          <w:lang w:val="fr-FR"/>
+        </w:rPr>
+        <w:t>Boxall</w:t>
+      </w:r>
+      <w:proofErr w:type="spellEnd"/>
+      <w:r>
+        <w:rPr>
+          <w:lang w:val="fr-FR"/>
+        </w:rPr>
+        <w:t xml:space="preserve"> (1996) distingue la qualité du capital humain et celle des processus qui le mobilisent ; un capital humain qualifié « reste stérile s'il n'est pas managé par des pratiques RH structurées, initiées par la gouvernance » (Bédat, 2026). La CTMG illustre bien ce décalage.</w:t>
       </w:r>
     </w:p>
     <w:p>
@@ -4565,7 +5316,49 @@
         <w:rPr>
           <w:lang w:val="fr-FR"/>
         </w:rPr>
-        <w:t>Les facteurs limitants correspondent aux mécanismes analysés dans les sections précédentes : distance et perte de crédibilité des RH, pilotage par les volumes, absence de la fonction RH au niveau du Conseil, absence d'espaces d'écoute et de débriefing, circuits administratifs et contractuels lents. Brandl et Pohler (2010) rappellent que le rôle du département RH dépend largement des attentes que la direction générale nourrit à son égard. Rien n'indique qu'à la CTMG la fonction RH soit attendue comme partenaire stratégique : elle apparaît comme instance administrative et, lors de l'audit, comme soutien de la ligne hiérarchique. Or, dans le secteur public suisse, les pratiques RH agissent sur la performance notamment par l'intermédiaire de la motivation intrinsèque des agents (Giauque et al., 2013). Dans un service qui repose sur la motivation de soignants, ce positionnement n'est pas secondaire.</w:t>
+        <w:t xml:space="preserve">Les facteurs limitants correspondent aux mécanismes analysés dans les sections précédentes : distance et perte de crédibilité des RH, pilotage par les volumes, absence de la fonction RH au niveau du Conseil, absence d'espaces d'écoute et de débriefing, circuits administratifs et contractuels lents. </w:t>
+      </w:r>
+      <w:proofErr w:type="spellStart"/>
+      <w:r>
+        <w:rPr>
+          <w:lang w:val="fr-FR"/>
+        </w:rPr>
+        <w:t>Brandl</w:t>
+      </w:r>
+      <w:proofErr w:type="spellEnd"/>
+      <w:r>
+        <w:rPr>
+          <w:lang w:val="fr-FR"/>
+        </w:rPr>
+        <w:t xml:space="preserve"> et </w:t>
+      </w:r>
+      <w:proofErr w:type="spellStart"/>
+      <w:r>
+        <w:rPr>
+          <w:lang w:val="fr-FR"/>
+        </w:rPr>
+        <w:t>Pohler</w:t>
+      </w:r>
+      <w:proofErr w:type="spellEnd"/>
+      <w:r>
+        <w:rPr>
+          <w:lang w:val="fr-FR"/>
+        </w:rPr>
+        <w:t xml:space="preserve"> (2010) rappellent que le rôle du département RH dépend largement des attentes que la direction générale nourrit à son égard. Rien n'indique qu'à la CTMG la fonction RH soit attendue comme partenaire stratégique : elle apparaît comme instance administrative et, lors de l'audit, comme soutien de la ligne hiérarchique. Or, dans le secteur public suisse, les pratiques RH agissent sur la performance notamment par l'intermédiaire de la motivation intrinsèque des agents (Giauque et </w:t>
+      </w:r>
+      <w:proofErr w:type="gramStart"/>
+      <w:r>
+        <w:rPr>
+          <w:lang w:val="fr-FR"/>
+        </w:rPr>
+        <w:t>al.,</w:t>
+      </w:r>
+      <w:proofErr w:type="gramEnd"/>
+      <w:r>
+        <w:rPr>
+          <w:lang w:val="fr-FR"/>
+        </w:rPr>
+        <w:t xml:space="preserve"> 2013). Dans un service qui repose sur la motivation de soignants, ce positionnement n'est pas secondaire.</w:t>
       </w:r>
     </w:p>
     <w:p>
@@ -4610,7 +5403,49 @@
         <w:rPr>
           <w:lang w:val="fr-FR"/>
         </w:rPr>
-        <w:t xml:space="preserve">L'expertise des régulateurs est en grande partie tacite : elle relève de ce que Polanyi (1966) décrivait comme un savoir que l'on possède sans pouvoir entièrement l'énoncer. Elle se transmet par la pratique partagée et le compagnonnage bien plus que par des procédures (Nonaka &amp; Takeuchi, 1995 ; Lamari, 2010). Chaque départ emporte une part de ce savoir, et chaque arrivée impose jusqu'à trois mois de formation (E2). Le turnover observé sur le terrain, sans pouvoir être chiffré, a donc un coût cumulatif : il épuise ceux qui restent et qui forment, abaisse le niveau </w:t>
+        <w:t>L'expertise des régulateurs est en grande partie tacite : elle relève de ce que Polanyi (1966) décrivait comme un savoir que l'on possède sans pouvoir entièrement l'énoncer. Elle se transmet par la pratique partagée et le compagnonnage bien plus que par des procédures (</w:t>
+      </w:r>
+      <w:proofErr w:type="spellStart"/>
+      <w:r>
+        <w:rPr>
+          <w:lang w:val="fr-FR"/>
+        </w:rPr>
+        <w:t>Nonaka</w:t>
+      </w:r>
+      <w:proofErr w:type="spellEnd"/>
+      <w:r>
+        <w:rPr>
+          <w:lang w:val="fr-FR"/>
+        </w:rPr>
+        <w:t xml:space="preserve"> &amp; </w:t>
+      </w:r>
+      <w:proofErr w:type="spellStart"/>
+      <w:r>
+        <w:rPr>
+          <w:lang w:val="fr-FR"/>
+        </w:rPr>
+        <w:t>Takeuchi</w:t>
+      </w:r>
+      <w:proofErr w:type="spellEnd"/>
+      <w:r>
+        <w:rPr>
+          <w:lang w:val="fr-FR"/>
+        </w:rPr>
+        <w:t xml:space="preserve">, 1995 ; </w:t>
+      </w:r>
+      <w:proofErr w:type="spellStart"/>
+      <w:r>
+        <w:rPr>
+          <w:lang w:val="fr-FR"/>
+        </w:rPr>
+        <w:t>Lamari</w:t>
+      </w:r>
+      <w:proofErr w:type="spellEnd"/>
+      <w:r>
+        <w:rPr>
+          <w:lang w:val="fr-FR"/>
+        </w:rPr>
+        <w:t xml:space="preserve">, 2010). Chaque départ emporte une part de ce savoir, et chaque arrivée impose jusqu'à trois mois de formation (E2). Le turnover observé sur le terrain, sans pouvoir être chiffré, a donc un coût cumulatif : il épuise ceux qui restent et qui forment, abaisse le niveau </w:t>
       </w:r>
       <w:r>
         <w:rPr>
@@ -4643,7 +5478,21 @@
         <w:rPr>
           <w:lang w:val="fr-FR"/>
         </w:rPr>
-        <w:t>Enfin, il existe un risque de légitimité et de réputation. Sortie d'une crise qui a conduit à la dissolution de l'entité qui la gérait, la CTMG remplit une mission de santé publique financée par l'impôt. Une nouvelle crise, liée au personnel ou à la qualité de la prestation, atteindrait aussi Unisanté, qui l'a accueillie. La question de la résilience organisationnelle, entre agilité et rigidité, se pose ici avec acuité (Giovannini &amp; Giauque, 2023).</w:t>
+        <w:t>Enfin, il existe un risque de légitimité et de réputation. Sortie d'une crise qui a conduit à la dissolution de l'entité qui la gérait, la CTMG remplit une mission de santé publique financée par l'impôt. Une nouvelle crise, liée au personnel ou à la qualité de la prestation, atteindrait aussi Unisanté, qui l'a accueillie. La question de la résilience organisationnelle, entre agilité et rigidité, se pose ici avec acuité (</w:t>
+      </w:r>
+      <w:proofErr w:type="spellStart"/>
+      <w:r>
+        <w:rPr>
+          <w:lang w:val="fr-FR"/>
+        </w:rPr>
+        <w:t>Giovannini</w:t>
+      </w:r>
+      <w:proofErr w:type="spellEnd"/>
+      <w:r>
+        <w:rPr>
+          <w:lang w:val="fr-FR"/>
+        </w:rPr>
+        <w:t xml:space="preserve"> &amp; Giauque, 2023).</w:t>
       </w:r>
     </w:p>
     <w:p>
@@ -4746,7 +5595,21 @@
         <w:rPr>
           <w:lang w:val="fr-FR"/>
         </w:rPr>
-        <w:t>La CTMG ne souffre pas d'un manque de structures, mais de l'absence d'un dispositif qui permette à la gouvernance de voir l'humain. Au sens de Charreaux (2005), les leviers disciplinaires sont bien présents, les leviers cognitifs presque absents. L'architecture dualiste rend le Conseil dépendant de l'information produite par l'exécutif. La délégation RH confie la remontée des difficultés à une ligne managériale qui les vit comme des critiques, et les chefs de salle qui recueillent cette information n'ont aucun moyen de la transmettre. Les biais des décideurs entretiennent enfin une lecture rassurante de la situation.</w:t>
+        <w:t xml:space="preserve">La CTMG ne souffre pas d'un manque de structures, mais de l'absence d'un dispositif qui permette à la gouvernance de voir l'humain. Au sens de </w:t>
+      </w:r>
+      <w:proofErr w:type="spellStart"/>
+      <w:r>
+        <w:rPr>
+          <w:lang w:val="fr-FR"/>
+        </w:rPr>
+        <w:t>Charreaux</w:t>
+      </w:r>
+      <w:proofErr w:type="spellEnd"/>
+      <w:r>
+        <w:rPr>
+          <w:lang w:val="fr-FR"/>
+        </w:rPr>
+        <w:t xml:space="preserve"> (2005), les leviers disciplinaires sont bien présents, les leviers cognitifs presque absents. L'architecture dualiste rend le Conseil dépendant de l'information produite par l'exécutif. La délégation RH confie la remontée des difficultés à une ligne managériale qui les vit comme des critiques, et les chefs de salle qui recueillent cette information n'ont aucun moyen de la transmettre. Les biais des décideurs entretiennent enfin une lecture rassurante de la situation.</w:t>
       </w:r>
     </w:p>
     <w:p>
@@ -4809,7 +5672,21 @@
         <w:rPr>
           <w:lang w:val="fr-FR"/>
         </w:rPr>
-        <w:t xml:space="preserve"> Le Conseil peut demander à la direction générale qu'une synthèse soit présentée aux collaborateurs : ce qui a été identifié, ce qui sera travaillé et selon quel calendrier. Il ne s'agit pas de publier le rapport, mais de trouver le « juste milieu » entre « tout dire et ne rien dire » qu'évoque E1, et de sortir ainsi de la logique de confiance décrite par Meyer et Rowan (1977).</w:t>
+        <w:t xml:space="preserve"> Le Conseil peut demander à la direction générale qu'une synthèse soit présentée aux collaborateurs : ce qui a été identifié, ce qui sera travaillé et selon quel calendrier. Il ne s'agit pas de publier le rapport, mais de trouver le « juste milieu » entre « tout dire et ne rien dire » qu'évoque E1, et de sortir ainsi de la logique de confiance décrite par Meyer et </w:t>
+      </w:r>
+      <w:proofErr w:type="spellStart"/>
+      <w:r>
+        <w:rPr>
+          <w:lang w:val="fr-FR"/>
+        </w:rPr>
+        <w:t>Rowan</w:t>
+      </w:r>
+      <w:proofErr w:type="spellEnd"/>
+      <w:r>
+        <w:rPr>
+          <w:lang w:val="fr-FR"/>
+        </w:rPr>
+        <w:t xml:space="preserve"> (1977).</w:t>
       </w:r>
     </w:p>
     <w:p>
@@ -4849,7 +5726,35 @@
         <w:rPr>
           <w:lang w:val="fr-FR"/>
         </w:rPr>
-        <w:t xml:space="preserve"> Le Conseil peut inscrire dans les objectifs annuels un suivi d'indicateurs humains présentés au même niveau que les volumes d'activité : rotation, absentéisme, ancienneté, motifs de départ recueillis par une personne extérieure au service. Ces indicateurs peuvent aussi être intégrés au contrat de prestations conclu avec le DSAS, afin que la gouvernance à distance ne repose plus sur les seuls volumes (Giauque, 2024). Ce qui dispose d'un canal peut enfin être vu (Ocasio, 1997), et les questions de personnel entrent dans le travail du Conseil (Hilb, 2016).</w:t>
+        <w:t xml:space="preserve"> Le Conseil peut inscrire dans les objectifs annuels un suivi d'indicateurs humains présentés au même niveau que les volumes d'activité : rotation, absentéisme, ancienneté, motifs de départ recueillis par une personne extérieure au service. Ces indicateurs peuvent aussi être intégrés au contrat de prestations conclu avec le DSAS, afin que la gouvernance à distance ne repose plus sur les seuls volumes (Giauque, 2024). Ce qui dispose d'un canal peut enfin être vu (</w:t>
+      </w:r>
+      <w:proofErr w:type="spellStart"/>
+      <w:r>
+        <w:rPr>
+          <w:lang w:val="fr-FR"/>
+        </w:rPr>
+        <w:t>Ocasio</w:t>
+      </w:r>
+      <w:proofErr w:type="spellEnd"/>
+      <w:r>
+        <w:rPr>
+          <w:lang w:val="fr-FR"/>
+        </w:rPr>
+        <w:t>, 1997), et les questions de personnel entrent dans le travail du Conseil (</w:t>
+      </w:r>
+      <w:proofErr w:type="spellStart"/>
+      <w:r>
+        <w:rPr>
+          <w:lang w:val="fr-FR"/>
+        </w:rPr>
+        <w:t>Hilb</w:t>
+      </w:r>
+      <w:proofErr w:type="spellEnd"/>
+      <w:r>
+        <w:rPr>
+          <w:lang w:val="fr-FR"/>
+        </w:rPr>
+        <w:t>, 2016).</w:t>
       </w:r>
     </w:p>
     <w:p>
@@ -4905,13 +5810,55 @@
         <w:rPr>
           <w:lang w:val="fr-FR"/>
         </w:rPr>
-        <w:t xml:space="preserve">, cette certification formalise un savoir aujourd'hui tacite (Nonaka &amp; Takeuchi, 1995), renforce la loyauté des </w:t>
-      </w:r>
-      <w:r>
-        <w:rPr>
-          <w:lang w:val="fr-FR"/>
-        </w:rPr>
-        <w:t>agents (Assanti &amp; Giauque, 2026</w:t>
+        <w:t>, cette certification formalise un savoir aujourd'hui tacite (</w:t>
+      </w:r>
+      <w:proofErr w:type="spellStart"/>
+      <w:r>
+        <w:rPr>
+          <w:lang w:val="fr-FR"/>
+        </w:rPr>
+        <w:t>Nonaka</w:t>
+      </w:r>
+      <w:proofErr w:type="spellEnd"/>
+      <w:r>
+        <w:rPr>
+          <w:lang w:val="fr-FR"/>
+        </w:rPr>
+        <w:t xml:space="preserve"> &amp; </w:t>
+      </w:r>
+      <w:proofErr w:type="spellStart"/>
+      <w:r>
+        <w:rPr>
+          <w:lang w:val="fr-FR"/>
+        </w:rPr>
+        <w:t>Takeuchi</w:t>
+      </w:r>
+      <w:proofErr w:type="spellEnd"/>
+      <w:r>
+        <w:rPr>
+          <w:lang w:val="fr-FR"/>
+        </w:rPr>
+        <w:t xml:space="preserve">, 1995), renforce la loyauté des </w:t>
+      </w:r>
+      <w:r>
+        <w:rPr>
+          <w:lang w:val="fr-FR"/>
+        </w:rPr>
+        <w:t>agents (</w:t>
+      </w:r>
+      <w:proofErr w:type="spellStart"/>
+      <w:r>
+        <w:rPr>
+          <w:lang w:val="fr-FR"/>
+        </w:rPr>
+        <w:t>Assanti</w:t>
+      </w:r>
+      <w:proofErr w:type="spellEnd"/>
+      <w:r>
+        <w:rPr>
+          <w:lang w:val="fr-FR"/>
+        </w:rPr>
+        <w:t xml:space="preserve"> &amp; Giauque, 2026</w:t>
       </w:r>
       <w:r>
         <w:rPr>
@@ -4955,7 +5902,35 @@
         <w:rPr>
           <w:lang w:val="fr-FR"/>
         </w:rPr>
-        <w:t xml:space="preserve"> Le Conseil peut créer une commission consacrée aux ressources humaines ou désigner parmi ses membres un référent RH, chargé d'examiner les indicateurs humains et les questions de personnel. Les enjeux humains ne dépendraient plus du seul choix de l'exécutif de les porter devant lui (Hilb, 2016 ; Petrovic et al., 2018).</w:t>
+        <w:t xml:space="preserve"> Le Conseil peut créer une commission consacrée aux ressources humaines ou désigner parmi ses membres un référent RH, chargé d'examiner les indicateurs humains et les questions de personnel. Les enjeux humains ne dépendraient plus du seul choix de l'exécutif de les porter devant lui (</w:t>
+      </w:r>
+      <w:proofErr w:type="spellStart"/>
+      <w:r>
+        <w:rPr>
+          <w:lang w:val="fr-FR"/>
+        </w:rPr>
+        <w:t>Hilb</w:t>
+      </w:r>
+      <w:proofErr w:type="spellEnd"/>
+      <w:r>
+        <w:rPr>
+          <w:lang w:val="fr-FR"/>
+        </w:rPr>
+        <w:t xml:space="preserve">, 2016 ; Petrovic et </w:t>
+      </w:r>
+      <w:proofErr w:type="gramStart"/>
+      <w:r>
+        <w:rPr>
+          <w:lang w:val="fr-FR"/>
+        </w:rPr>
+        <w:t>al.,</w:t>
+      </w:r>
+      <w:proofErr w:type="gramEnd"/>
+      <w:r>
+        <w:rPr>
+          <w:lang w:val="fr-FR"/>
+        </w:rPr>
+        <w:t xml:space="preserve"> 2018).</w:t>
       </w:r>
     </w:p>
     <w:p>
@@ -4975,7 +5950,77 @@
         <w:rPr>
           <w:lang w:val="fr-FR"/>
         </w:rPr>
-        <w:t xml:space="preserve"> Avant de réaffirmer une confiance ou de clore un dossier sensible, la direction générale et les RH peuvent utiliser la grille de Kahneman, Lovallo et Sibony (2011), ainsi que l'analyse pré-mortem (Klein, 2007). Fixer à l'avance des seuils d'alerte, par exemple un niveau de départs déclenchant une revue externe, réduit le risque d'escalade (Simonson &amp; Staw, 1992).</w:t>
+        <w:t xml:space="preserve"> Avant de réaffirmer une confiance ou de clore un dossier sensible, la direction générale et les RH peuvent utiliser la grille de </w:t>
+      </w:r>
+      <w:proofErr w:type="spellStart"/>
+      <w:r>
+        <w:rPr>
+          <w:lang w:val="fr-FR"/>
+        </w:rPr>
+        <w:t>Kahneman</w:t>
+      </w:r>
+      <w:proofErr w:type="spellEnd"/>
+      <w:r>
+        <w:rPr>
+          <w:lang w:val="fr-FR"/>
+        </w:rPr>
+        <w:t xml:space="preserve">, </w:t>
+      </w:r>
+      <w:proofErr w:type="spellStart"/>
+      <w:r>
+        <w:rPr>
+          <w:lang w:val="fr-FR"/>
+        </w:rPr>
+        <w:t>Lovallo</w:t>
+      </w:r>
+      <w:proofErr w:type="spellEnd"/>
+      <w:r>
+        <w:rPr>
+          <w:lang w:val="fr-FR"/>
+        </w:rPr>
+        <w:t xml:space="preserve"> et </w:t>
+      </w:r>
+      <w:proofErr w:type="spellStart"/>
+      <w:r>
+        <w:rPr>
+          <w:lang w:val="fr-FR"/>
+        </w:rPr>
+        <w:t>Sibony</w:t>
+      </w:r>
+      <w:proofErr w:type="spellEnd"/>
+      <w:r>
+        <w:rPr>
+          <w:lang w:val="fr-FR"/>
+        </w:rPr>
+        <w:t xml:space="preserve"> (2011), ainsi que l'analyse pré-mortem (Klein, 2007). Fixer à l'avance des seuils d'alerte, par exemple un niveau de départs déclenchant une revue externe, réduit le risque d'escalade (</w:t>
+      </w:r>
+      <w:proofErr w:type="spellStart"/>
+      <w:r>
+        <w:rPr>
+          <w:lang w:val="fr-FR"/>
+        </w:rPr>
+        <w:t>Simonson</w:t>
+      </w:r>
+      <w:proofErr w:type="spellEnd"/>
+      <w:r>
+        <w:rPr>
+          <w:lang w:val="fr-FR"/>
+        </w:rPr>
+        <w:t xml:space="preserve"> &amp; </w:t>
+      </w:r>
+      <w:proofErr w:type="spellStart"/>
+      <w:r>
+        <w:rPr>
+          <w:lang w:val="fr-FR"/>
+        </w:rPr>
+        <w:t>Staw</w:t>
+      </w:r>
+      <w:proofErr w:type="spellEnd"/>
+      <w:r>
+        <w:rPr>
+          <w:lang w:val="fr-FR"/>
+        </w:rPr>
+        <w:t>, 1992).</w:t>
       </w:r>
     </w:p>
     <w:p>
@@ -5022,7 +6067,21 @@
         <w:rPr>
           <w:lang w:val="fr-FR"/>
         </w:rPr>
-        <w:t>, par un tiers externe au service, avec cette fois une restitution aux équipes. C'est à cette condition que les collaborateurs pourront voir, selon les mots de E1, « que leur parole peut réellement avoir un effet sur le fonctionnement du service ».</w:t>
+        <w:t xml:space="preserve">, par un tiers externe au service, avec cette fois une restitution aux équipes. C'est à cette condition que les collaborateurs pourront voir, selon les mots </w:t>
+      </w:r>
+      <w:proofErr w:type="gramStart"/>
+      <w:r>
+        <w:rPr>
+          <w:lang w:val="fr-FR"/>
+        </w:rPr>
+        <w:t>de E1</w:t>
+      </w:r>
+      <w:proofErr w:type="gramEnd"/>
+      <w:r>
+        <w:rPr>
+          <w:lang w:val="fr-FR"/>
+        </w:rPr>
+        <w:t>, « que leur parole peut réellement avoir un effet sur le fonctionnement du service ».</w:t>
       </w:r>
     </w:p>
     <w:p>
@@ -5064,7 +6123,33 @@
         <w:rPr>
           <w:lang w:val="fr-FR"/>
         </w:rPr>
-        <w:t>Cet audit est parti d'un constat de terrain : à la CTMG, les structures sont en place, mais la confiance entre les niveaux ne l'est pas. Ce déficit ne tient pas seulement aux personnes : il résulte d'une gouvernance à distance par les volumes, d'une architecture dualiste qui rend le Conseil dépendant de l'exécutif, d'une fonction RH déléguée et perçue comme alignée sur la direction, et de biais qui transforment l'absence d'information en signe de maîtrise. Les recommandations visent à réparer un circuit : que ce que voit le terrain atteigne ceux qui gouvernent, et que ces derniers y répondent visiblement.</w:t>
+        <w:t>Cet audit est parti d'un constat de terrain : à la CTMG, les structures sont en place, mais la confiance entre les niveaux ne l'est pas. Ce déficit ne tient pas seulement aux personnes : il résulte d'une gouvernance à distance par les volumes, d'une architecture dualiste qui rend le Conseil dépendant de l'exécutif, d'une fonction RH déléguée et perçue comme alignée sur la direction, et de biais qui transforment l'absence d'information en signe de maîtrise</w:t>
+      </w:r>
+      <w:r>
+        <w:rPr>
+          <w:lang w:val="fr-FR"/>
+        </w:rPr>
+        <w:t xml:space="preserve">, </w:t>
+      </w:r>
+      <w:r>
+        <w:rPr>
+          <w:rStyle w:val="lev"/>
+          <w:b w:val="0"/>
+          <w:lang w:val="fr-FR"/>
+        </w:rPr>
+        <w:t>le tout dans un marché infirmier en pénurie qui rend chaque départ plus coûteux</w:t>
+      </w:r>
+      <w:r>
+        <w:rPr>
+          <w:lang w:val="fr-FR"/>
+        </w:rPr>
+        <w:t xml:space="preserve">. </w:t>
+      </w:r>
+      <w:r>
+        <w:rPr>
+          <w:lang w:val="fr-FR"/>
+        </w:rPr>
+        <w:t>Les recommandations visent à réparer un circuit : que ce que voit le terrain atteigne ceux qui gouvernent, et que ces derniers y répondent visiblement.</w:t>
       </w:r>
     </w:p>
     <w:p>
@@ -5156,8 +6241,6 @@
           <w:lang w:val="fr-FR"/>
         </w:rPr>
       </w:pPr>
-      <w:bookmarkStart w:id="35" w:name="_GoBack"/>
-      <w:bookmarkEnd w:id="35"/>
     </w:p>
     <w:p>
       <w:pPr>
@@ -5173,7 +6256,7 @@
           <w:lang w:val="fr-FR"/>
         </w:rPr>
       </w:pPr>
-      <w:bookmarkStart w:id="36" w:name="_Toc241271698"/>
+      <w:bookmarkStart w:id="35" w:name="_Toc241271698"/>
       <w:r>
         <w:rPr>
           <w:lang w:val="fr-FR"/>
@@ -5181,7 +6264,7 @@
         <w:lastRenderedPageBreak/>
         <w:t>Bibliographie</w:t>
       </w:r>
-      <w:bookmarkEnd w:id="36"/>
+      <w:bookmarkEnd w:id="35"/>
     </w:p>
     <w:p>
       <w:pPr>
@@ -5207,7 +6290,21 @@
         <w:rPr>
           <w:lang w:val="fr-FR"/>
         </w:rPr>
-        <w:t xml:space="preserve">Aldrich, P., Dietz, G., Clark, T., &amp; Hamilton, P. (2015). </w:t>
+        <w:t xml:space="preserve">Aldrich, P., </w:t>
+      </w:r>
+      <w:proofErr w:type="spellStart"/>
+      <w:r>
+        <w:rPr>
+          <w:lang w:val="fr-FR"/>
+        </w:rPr>
+        <w:t>Dietz</w:t>
+      </w:r>
+      <w:proofErr w:type="spellEnd"/>
+      <w:r>
+        <w:rPr>
+          <w:lang w:val="fr-FR"/>
+        </w:rPr>
+        <w:t xml:space="preserve">, G., Clark, T., &amp; Hamilton, P. (2015). </w:t>
       </w:r>
       <w:r>
         <w:t xml:space="preserve">Establishing HR professionals' influence and credibility: Lessons from the capital markets and investment banking sector. </w:t>
@@ -5228,8 +6325,13 @@
         <w:ind w:left="709" w:hanging="709"/>
         <w:jc w:val="left"/>
       </w:pPr>
-      <w:r>
-        <w:t xml:space="preserve">Assanti, S., &amp; Giauque, D. (2026). Building loyalty among public employees: The impact of high-performance work practices. </w:t>
+      <w:proofErr w:type="spellStart"/>
+      <w:r>
+        <w:t>Assanti</w:t>
+      </w:r>
+      <w:proofErr w:type="spellEnd"/>
+      <w:r>
+        <w:t xml:space="preserve">, S., &amp; Giauque, D. (2026). Building loyalty among public employees: The impact of high-performance work practices. </w:t>
       </w:r>
       <w:r>
         <w:rPr>
@@ -5238,7 +6340,31 @@
         <w:t>Review of Public Personnel Administration</w:t>
       </w:r>
       <w:r>
-        <w:t>. Publication anticipée en ligne.</w:t>
+        <w:t xml:space="preserve">. Publication </w:t>
+      </w:r>
+      <w:proofErr w:type="spellStart"/>
+      <w:r>
+        <w:t>anticipée</w:t>
+      </w:r>
+      <w:proofErr w:type="spellEnd"/>
+      <w:r>
+        <w:t xml:space="preserve"> </w:t>
+      </w:r>
+      <w:proofErr w:type="spellStart"/>
+      <w:r>
+        <w:t>en</w:t>
+      </w:r>
+      <w:proofErr w:type="spellEnd"/>
+      <w:r>
+        <w:t xml:space="preserve"> </w:t>
+      </w:r>
+      <w:proofErr w:type="spellStart"/>
+      <w:r>
+        <w:t>ligne</w:t>
+      </w:r>
+      <w:proofErr w:type="spellEnd"/>
+      <w:r>
+        <w:t>.</w:t>
       </w:r>
     </w:p>
     <w:p>
@@ -5291,12 +6417,21 @@
       <w:r>
         <w:t xml:space="preserve">Barney, J. B., &amp; Wright, P. M. (1998). On becoming a strategic partner: The role of human resources in gaining competitive advantage. </w:t>
       </w:r>
+      <w:proofErr w:type="spellStart"/>
       <w:r>
         <w:rPr>
           <w:i/>
           <w:lang w:val="fr-FR"/>
         </w:rPr>
-        <w:t>Human Resource Management, 37</w:t>
+        <w:t>Human</w:t>
+      </w:r>
+      <w:proofErr w:type="spellEnd"/>
+      <w:r>
+        <w:rPr>
+          <w:i/>
+          <w:lang w:val="fr-FR"/>
+        </w:rPr>
+        <w:t xml:space="preserve"> Resource Management, 37</w:t>
       </w:r>
       <w:r>
         <w:rPr>
@@ -5311,20 +6446,46 @@
         <w:ind w:left="709" w:hanging="709"/>
         <w:jc w:val="left"/>
       </w:pPr>
-      <w:r>
-        <w:rPr>
-          <w:lang w:val="fr-FR"/>
-        </w:rPr>
-        <w:t xml:space="preserve">Bonnet, C., Séville, M., &amp; Wirtz, P. (2017). Genèse et fonctionnement du conseil d'administration d'une firme entrepreneuriale : le rôle des identifications sociales des administrateurs. </w:t>
+      <w:proofErr w:type="spellStart"/>
+      <w:r>
+        <w:t>Bédat</w:t>
+      </w:r>
+      <w:proofErr w:type="spellEnd"/>
+      <w:r>
+        <w:t xml:space="preserve">, J. (2024). </w:t>
       </w:r>
       <w:r>
         <w:rPr>
           <w:i/>
         </w:rPr>
-        <w:t>Finance Contrôle Stratégie, 20</w:t>
-      </w:r>
-      <w:r>
-        <w:t>(3).</w:t>
+        <w:t>The influence of the board of directors on HR strategy: Three qualitative studies in a Swiss context</w:t>
+      </w:r>
+      <w:r>
+        <w:t xml:space="preserve"> [</w:t>
+      </w:r>
+      <w:proofErr w:type="spellStart"/>
+      <w:r>
+        <w:t>Thèse</w:t>
+      </w:r>
+      <w:proofErr w:type="spellEnd"/>
+      <w:r>
+        <w:t xml:space="preserve"> de </w:t>
+      </w:r>
+      <w:proofErr w:type="spellStart"/>
+      <w:r>
+        <w:t>doctorat</w:t>
+      </w:r>
+      <w:proofErr w:type="spellEnd"/>
+      <w:r>
+        <w:t xml:space="preserve">, </w:t>
+      </w:r>
+      <w:proofErr w:type="spellStart"/>
+      <w:r>
+        <w:t>Université</w:t>
+      </w:r>
+      <w:proofErr w:type="spellEnd"/>
+      <w:r>
+        <w:t xml:space="preserve"> Jean Moulin Lyon III].</w:t>
       </w:r>
     </w:p>
     <w:p>
@@ -5334,16 +6495,61 @@
         <w:jc w:val="left"/>
       </w:pPr>
       <w:r>
-        <w:t xml:space="preserve">Boxall, P. (1996). The strategic HRM debate and the resource-based view of the firm. </w:t>
+        <w:rPr>
+          <w:lang w:val="fr-FR"/>
+        </w:rPr>
+        <w:t xml:space="preserve">Bonnet, C., Séville, M., &amp; </w:t>
+      </w:r>
+      <w:proofErr w:type="spellStart"/>
+      <w:r>
+        <w:rPr>
+          <w:lang w:val="fr-FR"/>
+        </w:rPr>
+        <w:t>Wirtz</w:t>
+      </w:r>
+      <w:proofErr w:type="spellEnd"/>
+      <w:r>
+        <w:rPr>
+          <w:lang w:val="fr-FR"/>
+        </w:rPr>
+        <w:t xml:space="preserve">, P. (2017). Genèse et fonctionnement du conseil d'administration d'une firme entrepreneuriale : le rôle des identifications sociales des administrateurs. </w:t>
       </w:r>
       <w:r>
         <w:rPr>
           <w:i/>
         </w:rPr>
-        <w:t>Human Resource Management Journal, 6</w:t>
-      </w:r>
-      <w:r>
-        <w:t>(3), 59–75.</w:t>
+        <w:t xml:space="preserve">Finance </w:t>
+      </w:r>
+      <w:proofErr w:type="spellStart"/>
+      <w:r>
+        <w:rPr>
+          <w:i/>
+        </w:rPr>
+        <w:t>Contrôle</w:t>
+      </w:r>
+      <w:proofErr w:type="spellEnd"/>
+      <w:r>
+        <w:rPr>
+          <w:i/>
+        </w:rPr>
+        <w:t xml:space="preserve"> </w:t>
+      </w:r>
+      <w:proofErr w:type="spellStart"/>
+      <w:r>
+        <w:rPr>
+          <w:i/>
+        </w:rPr>
+        <w:t>Stratégie</w:t>
+      </w:r>
+      <w:proofErr w:type="spellEnd"/>
+      <w:r>
+        <w:rPr>
+          <w:i/>
+        </w:rPr>
+        <w:t>, 20</w:t>
+      </w:r>
+      <w:r>
+        <w:t>(3).</w:t>
       </w:r>
     </w:p>
     <w:p>
@@ -5353,16 +6559,16 @@
         <w:jc w:val="left"/>
       </w:pPr>
       <w:r>
-        <w:t xml:space="preserve">Brandl, J., &amp; Pohler, D. (2010). The human resource department's role and conditions that affect its development: Explanations from Austrian CEOs. </w:t>
+        <w:t xml:space="preserve">Boxall, P. (1996). The strategic HRM debate and the resource-based view of the firm. </w:t>
       </w:r>
       <w:r>
         <w:rPr>
           <w:i/>
         </w:rPr>
-        <w:t>Human Resource Management, 49</w:t>
-      </w:r>
-      <w:r>
-        <w:t>(6), 1025–1046.</w:t>
+        <w:t>Human Resource Management Journal, 6</w:t>
+      </w:r>
+      <w:r>
+        <w:t>(3), 59–75.</w:t>
       </w:r>
     </w:p>
     <w:p>
@@ -5371,17 +6577,30 @@
         <w:ind w:left="709" w:hanging="709"/>
         <w:jc w:val="left"/>
       </w:pPr>
-      <w:r>
-        <w:t xml:space="preserve">Bédat, J. (2024). </w:t>
+      <w:proofErr w:type="spellStart"/>
+      <w:r>
+        <w:t>Brandl</w:t>
+      </w:r>
+      <w:proofErr w:type="spellEnd"/>
+      <w:r>
+        <w:t xml:space="preserve">, J., &amp; </w:t>
+      </w:r>
+      <w:proofErr w:type="spellStart"/>
+      <w:r>
+        <w:t>Pohler</w:t>
+      </w:r>
+      <w:proofErr w:type="spellEnd"/>
+      <w:r>
+        <w:t xml:space="preserve">, D. (2010). The human resource department's role and conditions that affect its development: Explanations from Austrian CEOs. </w:t>
       </w:r>
       <w:r>
         <w:rPr>
           <w:i/>
         </w:rPr>
-        <w:t>The influence of the board of directors on HR strategy: Three qualitative studies in a Swiss context</w:t>
-      </w:r>
-      <w:r>
-        <w:t xml:space="preserve"> [Thèse de doctorat, Université Jean Moulin Lyon III].</w:t>
+        <w:t>Human Resource Management, 49</w:t>
+      </w:r>
+      <w:r>
+        <w:t>(6), 1025–1046.</w:t>
       </w:r>
     </w:p>
     <w:p>
@@ -5393,11 +6612,19 @@
           <w:lang w:val="fr-FR"/>
         </w:rPr>
       </w:pPr>
-      <w:r>
-        <w:rPr>
-          <w:lang w:val="fr-FR"/>
-        </w:rPr>
-        <w:t xml:space="preserve">Charreaux, G. (2005). Pour une gouvernance d'entreprise « comportementale » : une réflexion exploratoire... </w:t>
+      <w:proofErr w:type="spellStart"/>
+      <w:r>
+        <w:rPr>
+          <w:lang w:val="fr-FR"/>
+        </w:rPr>
+        <w:t>Charreaux</w:t>
+      </w:r>
+      <w:proofErr w:type="spellEnd"/>
+      <w:r>
+        <w:rPr>
+          <w:lang w:val="fr-FR"/>
+        </w:rPr>
+        <w:t xml:space="preserve">, G. (2005). Pour une gouvernance d'entreprise « comportementale » : une réflexion exploratoire... </w:t>
       </w:r>
       <w:r>
         <w:rPr>
@@ -5426,14 +6653,86 @@
         <w:rPr>
           <w:lang w:val="fr-FR"/>
         </w:rPr>
-        <w:t xml:space="preserve">Emery, Y., &amp; Giauque, D. (2003). Emergence of contradictory injunctions in Swiss NPM projects. </w:t>
+        <w:t xml:space="preserve">Emery, Y., &amp; Giauque, D. (2003). Emergence of </w:t>
+      </w:r>
+      <w:proofErr w:type="spellStart"/>
+      <w:r>
+        <w:rPr>
+          <w:lang w:val="fr-FR"/>
+        </w:rPr>
+        <w:t>contradictory</w:t>
+      </w:r>
+      <w:proofErr w:type="spellEnd"/>
+      <w:r>
+        <w:rPr>
+          <w:lang w:val="fr-FR"/>
+        </w:rPr>
+        <w:t xml:space="preserve"> </w:t>
+      </w:r>
+      <w:proofErr w:type="spellStart"/>
+      <w:r>
+        <w:rPr>
+          <w:lang w:val="fr-FR"/>
+        </w:rPr>
+        <w:t>injunctions</w:t>
+      </w:r>
+      <w:proofErr w:type="spellEnd"/>
+      <w:r>
+        <w:rPr>
+          <w:lang w:val="fr-FR"/>
+        </w:rPr>
+        <w:t xml:space="preserve"> in </w:t>
+      </w:r>
+      <w:proofErr w:type="spellStart"/>
+      <w:r>
+        <w:rPr>
+          <w:lang w:val="fr-FR"/>
+        </w:rPr>
+        <w:t>Swiss</w:t>
+      </w:r>
+      <w:proofErr w:type="spellEnd"/>
+      <w:r>
+        <w:rPr>
+          <w:lang w:val="fr-FR"/>
+        </w:rPr>
+        <w:t xml:space="preserve"> NPM </w:t>
+      </w:r>
+      <w:proofErr w:type="spellStart"/>
+      <w:r>
+        <w:rPr>
+          <w:lang w:val="fr-FR"/>
+        </w:rPr>
+        <w:t>projects</w:t>
+      </w:r>
+      <w:proofErr w:type="spellEnd"/>
+      <w:r>
+        <w:rPr>
+          <w:lang w:val="fr-FR"/>
+        </w:rPr>
+        <w:t xml:space="preserve">. </w:t>
       </w:r>
       <w:r>
         <w:rPr>
           <w:i/>
           <w:lang w:val="fr-FR"/>
         </w:rPr>
-        <w:t>International Journal of Public Sector Management, 16</w:t>
+        <w:t xml:space="preserve">International Journal of Public </w:t>
+      </w:r>
+      <w:proofErr w:type="spellStart"/>
+      <w:r>
+        <w:rPr>
+          <w:i/>
+          <w:lang w:val="fr-FR"/>
+        </w:rPr>
+        <w:t>Sector</w:t>
+      </w:r>
+      <w:proofErr w:type="spellEnd"/>
+      <w:r>
+        <w:rPr>
+          <w:i/>
+          <w:lang w:val="fr-FR"/>
+        </w:rPr>
+        <w:t xml:space="preserve"> Management, 16</w:t>
       </w:r>
       <w:r>
         <w:rPr>
@@ -5506,11 +6805,19 @@
         <w:ind w:left="709" w:hanging="709"/>
         <w:jc w:val="left"/>
       </w:pPr>
-      <w:r>
-        <w:rPr>
-          <w:lang w:val="fr-FR"/>
-        </w:rPr>
-        <w:t xml:space="preserve">Fama, E. F., &amp; Jensen, M. C. (1983). </w:t>
+      <w:proofErr w:type="spellStart"/>
+      <w:r>
+        <w:rPr>
+          <w:lang w:val="fr-FR"/>
+        </w:rPr>
+        <w:t>Fama</w:t>
+      </w:r>
+      <w:proofErr w:type="spellEnd"/>
+      <w:r>
+        <w:rPr>
+          <w:lang w:val="fr-FR"/>
+        </w:rPr>
+        <w:t xml:space="preserve">, E. F., &amp; Jensen, M. C. (1983). </w:t>
       </w:r>
       <w:r>
         <w:t xml:space="preserve">Separation of ownership and control. </w:t>
@@ -5580,7 +6887,23 @@
           <w:i/>
           <w:lang w:val="fr-FR"/>
         </w:rPr>
-        <w:t>International Review of Administrative Sciences, 69</w:t>
+        <w:t xml:space="preserve">International </w:t>
+      </w:r>
+      <w:proofErr w:type="spellStart"/>
+      <w:r>
+        <w:rPr>
+          <w:i/>
+          <w:lang w:val="fr-FR"/>
+        </w:rPr>
+        <w:t>Review</w:t>
+      </w:r>
+      <w:proofErr w:type="spellEnd"/>
+      <w:r>
+        <w:rPr>
+          <w:i/>
+          <w:lang w:val="fr-FR"/>
+        </w:rPr>
+        <w:t xml:space="preserve"> of Administrative Sciences, 69</w:t>
       </w:r>
       <w:r>
         <w:rPr>
@@ -5601,11 +6924,33 @@
         </w:rPr>
         <w:t xml:space="preserve">Giauque, D. (2024). Une nouvelle économie politique des administrations publiques : la gouvernance à distance. </w:t>
       </w:r>
+      <w:proofErr w:type="spellStart"/>
       <w:r>
         <w:rPr>
           <w:i/>
         </w:rPr>
-        <w:t>Éthique publique, 25</w:t>
+        <w:t>Éthique</w:t>
+      </w:r>
+      <w:proofErr w:type="spellEnd"/>
+      <w:r>
+        <w:rPr>
+          <w:i/>
+        </w:rPr>
+        <w:t xml:space="preserve"> </w:t>
+      </w:r>
+      <w:proofErr w:type="spellStart"/>
+      <w:r>
+        <w:rPr>
+          <w:i/>
+        </w:rPr>
+        <w:t>publique</w:t>
+      </w:r>
+      <w:proofErr w:type="spellEnd"/>
+      <w:r>
+        <w:rPr>
+          <w:i/>
+        </w:rPr>
+        <w:t>, 25</w:t>
       </w:r>
       <w:r>
         <w:t>(2).</w:t>
@@ -5619,7 +6964,23 @@
       </w:pPr>
       <w:r>
         <w:lastRenderedPageBreak/>
-        <w:t xml:space="preserve">Giauque, D., Anderfuhren-Biget, S., &amp; Varone, F. (2013). HRM practices, intrinsic motivators, and organizational performance in the public sector. </w:t>
+        <w:t xml:space="preserve">Giauque, D., </w:t>
+      </w:r>
+      <w:proofErr w:type="spellStart"/>
+      <w:r>
+        <w:t>Anderfuhren-Biget</w:t>
+      </w:r>
+      <w:proofErr w:type="spellEnd"/>
+      <w:r>
+        <w:t xml:space="preserve">, S., &amp; </w:t>
+      </w:r>
+      <w:proofErr w:type="spellStart"/>
+      <w:r>
+        <w:t>Varone</w:t>
+      </w:r>
+      <w:proofErr w:type="spellEnd"/>
+      <w:r>
+        <w:t xml:space="preserve">, F. (2013). HRM practices, intrinsic motivators, and organizational performance in the public sector. </w:t>
       </w:r>
       <w:r>
         <w:rPr>
@@ -5640,8 +7001,37 @@
           <w:lang w:val="fr-FR"/>
         </w:rPr>
       </w:pPr>
-      <w:r>
-        <w:t xml:space="preserve">Gioia, D. A., &amp; Chittipeddi, K. (1991). Sensemaking and sensegiving in strategic change initiation. </w:t>
+      <w:proofErr w:type="spellStart"/>
+      <w:r>
+        <w:t>Gioia</w:t>
+      </w:r>
+      <w:proofErr w:type="spellEnd"/>
+      <w:r>
+        <w:t xml:space="preserve">, D. A., &amp; </w:t>
+      </w:r>
+      <w:proofErr w:type="spellStart"/>
+      <w:r>
+        <w:t>Chittipeddi</w:t>
+      </w:r>
+      <w:proofErr w:type="spellEnd"/>
+      <w:r>
+        <w:t xml:space="preserve">, K. (1991). </w:t>
+      </w:r>
+      <w:proofErr w:type="spellStart"/>
+      <w:r>
+        <w:t>Sensemaking</w:t>
+      </w:r>
+      <w:proofErr w:type="spellEnd"/>
+      <w:r>
+        <w:t xml:space="preserve"> and </w:t>
+      </w:r>
+      <w:proofErr w:type="spellStart"/>
+      <w:r>
+        <w:t>sensegiving</w:t>
+      </w:r>
+      <w:proofErr w:type="spellEnd"/>
+      <w:r>
+        <w:t xml:space="preserve"> in strategic change initiation. </w:t>
       </w:r>
       <w:r>
         <w:rPr>
@@ -5663,11 +7053,19 @@
         <w:ind w:left="709" w:hanging="709"/>
         <w:jc w:val="left"/>
       </w:pPr>
-      <w:r>
-        <w:rPr>
-          <w:lang w:val="fr-FR"/>
-        </w:rPr>
-        <w:t xml:space="preserve">Giovannini, C., &amp; Giauque, D. (2023). La résilience organisationnelle, entre agilité et rigidité ? </w:t>
+      <w:proofErr w:type="spellStart"/>
+      <w:r>
+        <w:rPr>
+          <w:lang w:val="fr-FR"/>
+        </w:rPr>
+        <w:t>Giovannini</w:t>
+      </w:r>
+      <w:proofErr w:type="spellEnd"/>
+      <w:r>
+        <w:rPr>
+          <w:lang w:val="fr-FR"/>
+        </w:rPr>
+        <w:t xml:space="preserve">, C., &amp; Giauque, D. (2023). La résilience organisationnelle, entre agilité et rigidité ? </w:t>
       </w:r>
       <w:r>
         <w:rPr>
@@ -5685,8 +7083,21 @@
         <w:ind w:left="709" w:hanging="709"/>
         <w:jc w:val="left"/>
       </w:pPr>
-      <w:r>
-        <w:t xml:space="preserve">Haleblian, J., &amp; Rajagopalan, N. (2006). A cognitive model of CEO dismissal: Understanding the influence of board perceptions, attributions and efficacy beliefs. </w:t>
+      <w:proofErr w:type="spellStart"/>
+      <w:r>
+        <w:t>Haleblian</w:t>
+      </w:r>
+      <w:proofErr w:type="spellEnd"/>
+      <w:r>
+        <w:t xml:space="preserve">, J., &amp; </w:t>
+      </w:r>
+      <w:proofErr w:type="spellStart"/>
+      <w:r>
+        <w:t>Rajagopalan</w:t>
+      </w:r>
+      <w:proofErr w:type="spellEnd"/>
+      <w:r>
+        <w:t xml:space="preserve">, N. (2006). A cognitive model of CEO dismissal: Understanding the influence of board perceptions, attributions and efficacy beliefs. </w:t>
       </w:r>
       <w:r>
         <w:rPr>
@@ -5733,7 +7144,15 @@
         <w:t>New corporate governance: Successful board management tools</w:t>
       </w:r>
       <w:r>
-        <w:t xml:space="preserve"> (5e éd.). Springer.</w:t>
+        <w:t xml:space="preserve"> (5e </w:t>
+      </w:r>
+      <w:proofErr w:type="spellStart"/>
+      <w:r>
+        <w:t>éd</w:t>
+      </w:r>
+      <w:proofErr w:type="spellEnd"/>
+      <w:r>
+        <w:t>.). Springer.</w:t>
       </w:r>
     </w:p>
     <w:p>
@@ -5762,7 +7181,15 @@
         <w:jc w:val="left"/>
       </w:pPr>
       <w:r>
-        <w:t xml:space="preserve">Jensen, M. C., &amp; Meckling, W. H. (1976). Theory of the firm: Managerial behavior, agency costs and ownership structure. </w:t>
+        <w:t xml:space="preserve">Jensen, M. C., &amp; </w:t>
+      </w:r>
+      <w:proofErr w:type="spellStart"/>
+      <w:r>
+        <w:t>Meckling</w:t>
+      </w:r>
+      <w:proofErr w:type="spellEnd"/>
+      <w:r>
+        <w:t xml:space="preserve">, W. H. (1976). Theory of the firm: Managerial behavior, agency costs and ownership structure. </w:t>
       </w:r>
       <w:r>
         <w:rPr>
@@ -5780,8 +7207,13 @@
         <w:ind w:left="709" w:hanging="709"/>
         <w:jc w:val="left"/>
       </w:pPr>
-      <w:r>
-        <w:t xml:space="preserve">Jungmann, C. (2006). The effectiveness of corporate governance in one-tier and two-tier board systems: Evidence from the UK and Germany. </w:t>
+      <w:proofErr w:type="spellStart"/>
+      <w:r>
+        <w:t>Jungmann</w:t>
+      </w:r>
+      <w:proofErr w:type="spellEnd"/>
+      <w:r>
+        <w:t xml:space="preserve">, C. (2006). The effectiveness of corporate governance in one-tier and two-tier board systems: Evidence from the UK and Germany. </w:t>
       </w:r>
       <w:r>
         <w:rPr>
@@ -5799,8 +7231,13 @@
         <w:ind w:left="709" w:hanging="709"/>
         <w:jc w:val="left"/>
       </w:pPr>
-      <w:r>
-        <w:t xml:space="preserve">Kahneman, D. (2012). Two systems in the mind. </w:t>
+      <w:proofErr w:type="spellStart"/>
+      <w:r>
+        <w:t>Kahneman</w:t>
+      </w:r>
+      <w:proofErr w:type="spellEnd"/>
+      <w:r>
+        <w:t xml:space="preserve">, D. (2012). Two systems in the mind. </w:t>
       </w:r>
       <w:r>
         <w:rPr>
@@ -5818,8 +7255,29 @@
         <w:ind w:left="709" w:hanging="709"/>
         <w:jc w:val="left"/>
       </w:pPr>
-      <w:r>
-        <w:t xml:space="preserve">Kahneman, D., Lovallo, D., &amp; Sibony, O. (2011). Before you make that big decision. </w:t>
+      <w:proofErr w:type="spellStart"/>
+      <w:r>
+        <w:t>Kahneman</w:t>
+      </w:r>
+      <w:proofErr w:type="spellEnd"/>
+      <w:r>
+        <w:t xml:space="preserve">, D., </w:t>
+      </w:r>
+      <w:proofErr w:type="spellStart"/>
+      <w:r>
+        <w:t>Lovallo</w:t>
+      </w:r>
+      <w:proofErr w:type="spellEnd"/>
+      <w:r>
+        <w:t xml:space="preserve">, D., &amp; </w:t>
+      </w:r>
+      <w:proofErr w:type="spellStart"/>
+      <w:r>
+        <w:t>Sibony</w:t>
+      </w:r>
+      <w:proofErr w:type="spellEnd"/>
+      <w:r>
+        <w:t xml:space="preserve">, O. (2011). Before you make that big decision. </w:t>
       </w:r>
       <w:r>
         <w:rPr>
@@ -5838,7 +7296,15 @@
         <w:jc w:val="left"/>
       </w:pPr>
       <w:r>
-        <w:t xml:space="preserve">Klein, G. (2007). Performing a project premortem. </w:t>
+        <w:t xml:space="preserve">Klein, G. (2007). Performing a project </w:t>
+      </w:r>
+      <w:proofErr w:type="spellStart"/>
+      <w:r>
+        <w:t>premortem</w:t>
+      </w:r>
+      <w:proofErr w:type="spellEnd"/>
+      <w:r>
+        <w:t xml:space="preserve">. </w:t>
       </w:r>
       <w:r>
         <w:rPr>
@@ -5856,17 +7322,33 @@
         <w:ind w:left="709" w:hanging="709"/>
         <w:jc w:val="left"/>
       </w:pPr>
-      <w:r>
-        <w:rPr>
-          <w:lang w:val="fr-FR"/>
-        </w:rPr>
-        <w:t xml:space="preserve">Lamari, M. (2010). Le transfert intergénérationnel des connaissances tacites : les concepts utilisés et les évidences empiriques démontrées. </w:t>
-      </w:r>
+      <w:proofErr w:type="spellStart"/>
+      <w:r>
+        <w:rPr>
+          <w:lang w:val="fr-FR"/>
+        </w:rPr>
+        <w:t>Lamari</w:t>
+      </w:r>
+      <w:proofErr w:type="spellEnd"/>
+      <w:r>
+        <w:rPr>
+          <w:lang w:val="fr-FR"/>
+        </w:rPr>
+        <w:t xml:space="preserve">, M. (2010). Le transfert intergénérationnel des connaissances tacites : les concepts utilisés et les évidences empiriques démontrées. </w:t>
+      </w:r>
+      <w:proofErr w:type="spellStart"/>
       <w:r>
         <w:rPr>
           <w:i/>
         </w:rPr>
-        <w:t>Télescope, 16</w:t>
+        <w:t>Télescope</w:t>
+      </w:r>
+      <w:proofErr w:type="spellEnd"/>
+      <w:r>
+        <w:rPr>
+          <w:i/>
+        </w:rPr>
+        <w:t>, 16</w:t>
       </w:r>
       <w:r>
         <w:t>(1), 39–65.</w:t>
@@ -5879,7 +7361,15 @@
         <w:jc w:val="left"/>
       </w:pPr>
       <w:r>
-        <w:t xml:space="preserve">McCormick, M. J., &amp; Martinko, M. J. (2004). Identifying leader social cognitions: Integrating the causal reasoning perspective into social cognitive theory. </w:t>
+        <w:t xml:space="preserve">McCormick, M. J., &amp; </w:t>
+      </w:r>
+      <w:proofErr w:type="spellStart"/>
+      <w:r>
+        <w:t>Martinko</w:t>
+      </w:r>
+      <w:proofErr w:type="spellEnd"/>
+      <w:r>
+        <w:t xml:space="preserve">, M. J. (2004). Identifying leader social cognitions: Integrating the causal reasoning perspective into social cognitive theory. </w:t>
       </w:r>
       <w:r>
         <w:rPr>
@@ -5900,8 +7390,29 @@
           <w:lang w:val="fr-FR"/>
         </w:rPr>
       </w:pPr>
-      <w:r>
-        <w:t xml:space="preserve">Merçay, C., Grünig, A., &amp; Dolder, P. (2021). </w:t>
+      <w:proofErr w:type="spellStart"/>
+      <w:r>
+        <w:t>Merçay</w:t>
+      </w:r>
+      <w:proofErr w:type="spellEnd"/>
+      <w:r>
+        <w:t xml:space="preserve">, C., </w:t>
+      </w:r>
+      <w:proofErr w:type="spellStart"/>
+      <w:r>
+        <w:t>Grünig</w:t>
+      </w:r>
+      <w:proofErr w:type="spellEnd"/>
+      <w:r>
+        <w:t xml:space="preserve">, A., &amp; </w:t>
+      </w:r>
+      <w:proofErr w:type="spellStart"/>
+      <w:r>
+        <w:t>Dolder</w:t>
+      </w:r>
+      <w:proofErr w:type="spellEnd"/>
+      <w:r>
+        <w:t xml:space="preserve">, P. (2021). </w:t>
       </w:r>
       <w:r>
         <w:rPr>
@@ -5914,7 +7425,21 @@
         <w:rPr>
           <w:lang w:val="fr-FR"/>
         </w:rPr>
-        <w:t xml:space="preserve"> (Obsan Rapport 03/2021). Observatoire suisse de la santé.</w:t>
+        <w:t xml:space="preserve"> (</w:t>
+      </w:r>
+      <w:proofErr w:type="spellStart"/>
+      <w:r>
+        <w:rPr>
+          <w:lang w:val="fr-FR"/>
+        </w:rPr>
+        <w:t>Obsan</w:t>
+      </w:r>
+      <w:proofErr w:type="spellEnd"/>
+      <w:r>
+        <w:rPr>
+          <w:lang w:val="fr-FR"/>
+        </w:rPr>
+        <w:t xml:space="preserve"> Rapport 03/2021). Observatoire suisse de la santé.</w:t>
       </w:r>
     </w:p>
     <w:p>
@@ -5927,7 +7452,21 @@
         <w:rPr>
           <w:lang w:val="fr-FR"/>
         </w:rPr>
-        <w:t xml:space="preserve">Meyer, J. W., &amp; Rowan, B. (1977). </w:t>
+        <w:t xml:space="preserve">Meyer, J. W., &amp; </w:t>
+      </w:r>
+      <w:proofErr w:type="spellStart"/>
+      <w:r>
+        <w:rPr>
+          <w:lang w:val="fr-FR"/>
+        </w:rPr>
+        <w:t>Rowan</w:t>
+      </w:r>
+      <w:proofErr w:type="spellEnd"/>
+      <w:r>
+        <w:rPr>
+          <w:lang w:val="fr-FR"/>
+        </w:rPr>
+        <w:t xml:space="preserve">, B. (1977). </w:t>
       </w:r>
       <w:r>
         <w:t xml:space="preserve">Institutionalized organizations: Formal structure as myth and ceremony. </w:t>
@@ -5986,8 +7525,21 @@
         <w:ind w:left="709" w:hanging="709"/>
         <w:jc w:val="left"/>
       </w:pPr>
-      <w:r>
-        <w:t xml:space="preserve">Petrovic, J., Saridakis, G., &amp; Johnstone, S. (2018). An integrative approach to HRM–firm performance relationship: A missing link to corporate governance. </w:t>
+      <w:proofErr w:type="spellStart"/>
+      <w:r>
+        <w:t>Petrovic</w:t>
+      </w:r>
+      <w:proofErr w:type="spellEnd"/>
+      <w:r>
+        <w:t xml:space="preserve">, J., </w:t>
+      </w:r>
+      <w:proofErr w:type="spellStart"/>
+      <w:r>
+        <w:t>Saridakis</w:t>
+      </w:r>
+      <w:proofErr w:type="spellEnd"/>
+      <w:r>
+        <w:t xml:space="preserve">, G., &amp; Johnstone, S. (2018). An integrative approach to HRM–firm performance relationship: A missing link to corporate governance. </w:t>
       </w:r>
       <w:r>
         <w:rPr>
@@ -6005,8 +7557,13 @@
         <w:ind w:left="709" w:hanging="709"/>
         <w:jc w:val="left"/>
       </w:pPr>
-      <w:r>
-        <w:t xml:space="preserve">Pfeffer, J. (1992). </w:t>
+      <w:proofErr w:type="spellStart"/>
+      <w:r>
+        <w:t>Pfeffer</w:t>
+      </w:r>
+      <w:proofErr w:type="spellEnd"/>
+      <w:r>
+        <w:t xml:space="preserve">, J. (1992). </w:t>
       </w:r>
       <w:r>
         <w:rPr>
@@ -6031,12 +7588,21 @@
         <w:lastRenderedPageBreak/>
         <w:t xml:space="preserve">Polanyi, M. (1966). The logic of tacit inference. </w:t>
       </w:r>
+      <w:proofErr w:type="spellStart"/>
       <w:r>
         <w:rPr>
           <w:i/>
           <w:lang w:val="fr-FR"/>
         </w:rPr>
-        <w:t>Philosophy, 41</w:t>
+        <w:t>Philosophy</w:t>
+      </w:r>
+      <w:proofErr w:type="spellEnd"/>
+      <w:r>
+        <w:rPr>
+          <w:i/>
+          <w:lang w:val="fr-FR"/>
+        </w:rPr>
+        <w:t>, 41</w:t>
       </w:r>
       <w:r>
         <w:rPr>
@@ -6051,17 +7617,81 @@
         <w:ind w:left="709" w:hanging="709"/>
         <w:jc w:val="left"/>
       </w:pPr>
-      <w:r>
-        <w:rPr>
-          <w:lang w:val="fr-FR"/>
-        </w:rPr>
-        <w:t xml:space="preserve">Prévot, F., Brulhart, F., &amp; Guieu, G. (2010). Perspectives fondées sur les ressources : proposition de synthèse. </w:t>
+      <w:proofErr w:type="spellStart"/>
+      <w:r>
+        <w:rPr>
+          <w:lang w:val="fr-FR"/>
+        </w:rPr>
+        <w:t>Prévot</w:t>
+      </w:r>
+      <w:proofErr w:type="spellEnd"/>
+      <w:r>
+        <w:rPr>
+          <w:lang w:val="fr-FR"/>
+        </w:rPr>
+        <w:t xml:space="preserve">, F., </w:t>
+      </w:r>
+      <w:proofErr w:type="spellStart"/>
+      <w:r>
+        <w:rPr>
+          <w:lang w:val="fr-FR"/>
+        </w:rPr>
+        <w:t>Brulhart</w:t>
+      </w:r>
+      <w:proofErr w:type="spellEnd"/>
+      <w:r>
+        <w:rPr>
+          <w:lang w:val="fr-FR"/>
+        </w:rPr>
+        <w:t xml:space="preserve">, F., &amp; </w:t>
+      </w:r>
+      <w:proofErr w:type="spellStart"/>
+      <w:r>
+        <w:rPr>
+          <w:lang w:val="fr-FR"/>
+        </w:rPr>
+        <w:t>Guieu</w:t>
+      </w:r>
+      <w:proofErr w:type="spellEnd"/>
+      <w:r>
+        <w:rPr>
+          <w:lang w:val="fr-FR"/>
+        </w:rPr>
+        <w:t xml:space="preserve">, G. (2010). Perspectives fondées sur les ressources : proposition de synthèse. </w:t>
       </w:r>
       <w:r>
         <w:rPr>
           <w:i/>
         </w:rPr>
-        <w:t>Revue française de gestion, 204</w:t>
+        <w:t xml:space="preserve">Revue </w:t>
+      </w:r>
+      <w:proofErr w:type="spellStart"/>
+      <w:r>
+        <w:rPr>
+          <w:i/>
+        </w:rPr>
+        <w:t>française</w:t>
+      </w:r>
+      <w:proofErr w:type="spellEnd"/>
+      <w:r>
+        <w:rPr>
+          <w:i/>
+        </w:rPr>
+        <w:t xml:space="preserve"> de </w:t>
+      </w:r>
+      <w:proofErr w:type="spellStart"/>
+      <w:r>
+        <w:rPr>
+          <w:i/>
+        </w:rPr>
+        <w:t>gestion</w:t>
+      </w:r>
+      <w:proofErr w:type="spellEnd"/>
+      <w:r>
+        <w:rPr>
+          <w:i/>
+        </w:rPr>
+        <w:t>, 204</w:t>
       </w:r>
       <w:r>
         <w:t>(5), 87–103.</w:t>
@@ -6076,15 +7706,37 @@
           <w:lang w:val="fr-FR"/>
         </w:rPr>
       </w:pPr>
-      <w:r>
-        <w:t xml:space="preserve">Reichel, A., &amp; Lazarova, M. (2013). The effects of outsourcing and devolvement on the strategic position of HR departments. </w:t>
-      </w:r>
+      <w:proofErr w:type="spellStart"/>
+      <w:r>
+        <w:t>Reichel</w:t>
+      </w:r>
+      <w:proofErr w:type="spellEnd"/>
+      <w:r>
+        <w:t xml:space="preserve">, A., &amp; </w:t>
+      </w:r>
+      <w:proofErr w:type="spellStart"/>
+      <w:r>
+        <w:t>Lazarova</w:t>
+      </w:r>
+      <w:proofErr w:type="spellEnd"/>
+      <w:r>
+        <w:t xml:space="preserve">, M. (2013). The effects of outsourcing and devolvement on the strategic position of HR departments. </w:t>
+      </w:r>
+      <w:proofErr w:type="spellStart"/>
       <w:r>
         <w:rPr>
           <w:i/>
           <w:lang w:val="fr-FR"/>
         </w:rPr>
-        <w:t>Human Resource Management, 52</w:t>
+        <w:t>Human</w:t>
+      </w:r>
+      <w:proofErr w:type="spellEnd"/>
+      <w:r>
+        <w:rPr>
+          <w:i/>
+          <w:lang w:val="fr-FR"/>
+        </w:rPr>
+        <w:t xml:space="preserve"> Resource Management, 52</w:t>
       </w:r>
       <w:r>
         <w:rPr>
@@ -6137,11 +7789,19 @@
       <w:r>
         <w:t xml:space="preserve">Should chairman and CEO be separated? Leadership structure and firm performance in Switzerland. </w:t>
       </w:r>
+      <w:proofErr w:type="spellStart"/>
       <w:r>
         <w:rPr>
           <w:i/>
         </w:rPr>
-        <w:t>Schmalenbach Business Review, 60</w:t>
+        <w:t>Schmalenbach</w:t>
+      </w:r>
+      <w:proofErr w:type="spellEnd"/>
+      <w:r>
+        <w:rPr>
+          <w:i/>
+        </w:rPr>
+        <w:t xml:space="preserve"> Business Review, 60</w:t>
       </w:r>
       <w:r>
         <w:t>(2), 182–204.</w:t>
@@ -6153,8 +7813,13 @@
         <w:ind w:left="709" w:hanging="709"/>
         <w:jc w:val="left"/>
       </w:pPr>
-      <w:r>
-        <w:t xml:space="preserve">Schwenk, C. R. (1988). The cognitive perspective on strategic decision making. </w:t>
+      <w:proofErr w:type="spellStart"/>
+      <w:r>
+        <w:t>Schwenk</w:t>
+      </w:r>
+      <w:proofErr w:type="spellEnd"/>
+      <w:r>
+        <w:t xml:space="preserve">, C. R. (1988). The cognitive perspective on strategic decision making. </w:t>
       </w:r>
       <w:r>
         <w:rPr>
@@ -6173,7 +7838,15 @@
         <w:jc w:val="left"/>
       </w:pPr>
       <w:r>
-        <w:t xml:space="preserve">Sheehan, C., De Cieri, H., Cooper, B., &amp; Brooks, R. (2014). Exploring the power dimensions of the human resource function. </w:t>
+        <w:t xml:space="preserve">Sheehan, C., De </w:t>
+      </w:r>
+      <w:proofErr w:type="spellStart"/>
+      <w:r>
+        <w:t>Cieri</w:t>
+      </w:r>
+      <w:proofErr w:type="spellEnd"/>
+      <w:r>
+        <w:t xml:space="preserve">, H., Cooper, B., &amp; Brooks, R. (2014). Exploring the power dimensions of the human resource function. </w:t>
       </w:r>
       <w:r>
         <w:rPr>
@@ -6192,7 +7865,23 @@
         <w:jc w:val="left"/>
       </w:pPr>
       <w:r>
-        <w:t xml:space="preserve">Simonson, I., &amp; Staw, B. M. (1992). Deescalation strategies: A comparison of techniques for reducing commitment to losing courses of action. </w:t>
+        <w:t xml:space="preserve">Simonson, I., &amp; </w:t>
+      </w:r>
+      <w:proofErr w:type="spellStart"/>
+      <w:r>
+        <w:t>Staw</w:t>
+      </w:r>
+      <w:proofErr w:type="spellEnd"/>
+      <w:r>
+        <w:t xml:space="preserve">, B. M. (1992). </w:t>
+      </w:r>
+      <w:proofErr w:type="spellStart"/>
+      <w:r>
+        <w:t>Deescalation</w:t>
+      </w:r>
+      <w:proofErr w:type="spellEnd"/>
+      <w:r>
+        <w:t xml:space="preserve"> strategies: A comparison of techniques for reducing commitment to losing courses of action. </w:t>
       </w:r>
       <w:r>
         <w:rPr>
@@ -6210,8 +7899,21 @@
         <w:ind w:left="709" w:hanging="709"/>
         <w:jc w:val="left"/>
       </w:pPr>
-      <w:r>
-        <w:t xml:space="preserve">Sirmon, D. G., Hitt, M. A., Ireland, R. D., &amp; Gilbert, B. A. (2011). Resource orchestration to create competitive advantage: Breadth, depth, and life cycle effects. </w:t>
+      <w:proofErr w:type="spellStart"/>
+      <w:r>
+        <w:t>Sirmon</w:t>
+      </w:r>
+      <w:proofErr w:type="spellEnd"/>
+      <w:r>
+        <w:t xml:space="preserve">, D. G., </w:t>
+      </w:r>
+      <w:proofErr w:type="spellStart"/>
+      <w:r>
+        <w:t>Hitt</w:t>
+      </w:r>
+      <w:proofErr w:type="spellEnd"/>
+      <w:r>
+        <w:t xml:space="preserve">, M. A., Ireland, R. D., &amp; Gilbert, B. A. (2011). Resource orchestration to create competitive advantage: Breadth, depth, and life cycle effects. </w:t>
       </w:r>
       <w:r>
         <w:rPr>
@@ -6229,8 +7931,13 @@
         <w:ind w:left="709" w:hanging="709"/>
         <w:jc w:val="left"/>
       </w:pPr>
-      <w:r>
-        <w:t xml:space="preserve">Stinchcombe, A. L. (1965). Social structure and organizations. In J. G. March (Ed.), </w:t>
+      <w:proofErr w:type="spellStart"/>
+      <w:r>
+        <w:t>Stinchcombe</w:t>
+      </w:r>
+      <w:proofErr w:type="spellEnd"/>
+      <w:r>
+        <w:t xml:space="preserve">, A. L. (1965). Social structure and organizations. In J. G. March (Ed.), </w:t>
       </w:r>
       <w:r>
         <w:rPr>
@@ -6248,8 +7955,13 @@
         <w:ind w:left="709" w:hanging="709"/>
         <w:jc w:val="left"/>
       </w:pPr>
-      <w:r>
-        <w:t xml:space="preserve">Tetlock, P. E. (2000). Cognitive biases and organizational correctives: Do both disease and cure depend on the politics of the beholder? </w:t>
+      <w:proofErr w:type="spellStart"/>
+      <w:r>
+        <w:t>Tetlock</w:t>
+      </w:r>
+      <w:proofErr w:type="spellEnd"/>
+      <w:r>
+        <w:t xml:space="preserve">, P. E. (2000). Cognitive biases and organizational correctives: Do both disease and cure depend on the politics of the beholder? </w:t>
       </w:r>
       <w:r>
         <w:rPr>
@@ -6267,8 +7979,21 @@
         <w:ind w:left="709" w:hanging="709"/>
         <w:jc w:val="left"/>
       </w:pPr>
-      <w:r>
-        <w:t xml:space="preserve">Tversky, A., &amp; Kahneman, D. (1974). Judgment under uncertainty: Heuristics and biases. </w:t>
+      <w:proofErr w:type="spellStart"/>
+      <w:r>
+        <w:t>Tversky</w:t>
+      </w:r>
+      <w:proofErr w:type="spellEnd"/>
+      <w:r>
+        <w:t xml:space="preserve">, A., &amp; </w:t>
+      </w:r>
+      <w:proofErr w:type="spellStart"/>
+      <w:r>
+        <w:t>Kahneman</w:t>
+      </w:r>
+      <w:proofErr w:type="spellEnd"/>
+      <w:r>
+        <w:t xml:space="preserve">, D. (1974). Judgment under uncertainty: Heuristics and biases. </w:t>
       </w:r>
       <w:r>
         <w:rPr>
@@ -6289,8 +8014,13 @@
           <w:lang w:val="fr-FR"/>
         </w:rPr>
       </w:pPr>
-      <w:r>
-        <w:t xml:space="preserve">Vandenabeele, W., Brewer, G. A., &amp; Ritz, A. (2014). Past, present, and future of public service motivation research. </w:t>
+      <w:proofErr w:type="spellStart"/>
+      <w:r>
+        <w:t>Vandenabeele</w:t>
+      </w:r>
+      <w:proofErr w:type="spellEnd"/>
+      <w:r>
+        <w:t xml:space="preserve">, W., Brewer, G. A., &amp; Ritz, A. (2014). Past, present, and future of public service motivation research. </w:t>
       </w:r>
       <w:r>
         <w:rPr>
@@ -6363,14 +8093,27 @@
           <w:lang w:val="fr-FR"/>
         </w:rPr>
       </w:pPr>
-      <w:r>
-        <w:t xml:space="preserve">Weick, K. E. (1995). </w:t>
-      </w:r>
+      <w:proofErr w:type="spellStart"/>
+      <w:r>
+        <w:t>Weick</w:t>
+      </w:r>
+      <w:proofErr w:type="spellEnd"/>
+      <w:r>
+        <w:t xml:space="preserve">, K. E. (1995). </w:t>
+      </w:r>
+      <w:proofErr w:type="spellStart"/>
       <w:r>
         <w:rPr>
           <w:i/>
         </w:rPr>
-        <w:t>Sensemaking in organizations</w:t>
+        <w:t>Sensemaking</w:t>
+      </w:r>
+      <w:proofErr w:type="spellEnd"/>
+      <w:r>
+        <w:rPr>
+          <w:i/>
+        </w:rPr>
+        <w:t xml:space="preserve"> in organizations</w:t>
       </w:r>
       <w:r>
         <w:t xml:space="preserve">. </w:t>
@@ -6438,14 +8181,44 @@
         <w:rPr>
           <w:lang w:val="fr-FR"/>
         </w:rPr>
-        <w:t xml:space="preserve">CHUV. (s.d.). </w:t>
+        <w:t>CHUV. (</w:t>
+      </w:r>
+      <w:proofErr w:type="spellStart"/>
+      <w:r>
+        <w:rPr>
+          <w:lang w:val="fr-FR"/>
+        </w:rPr>
+        <w:t>s.d</w:t>
+      </w:r>
+      <w:proofErr w:type="spellEnd"/>
+      <w:r>
+        <w:rPr>
+          <w:lang w:val="fr-FR"/>
+        </w:rPr>
+        <w:t xml:space="preserve">.). </w:t>
       </w:r>
       <w:r>
         <w:rPr>
           <w:i/>
           <w:lang w:val="fr-FR"/>
         </w:rPr>
-        <w:t>Le 144 sera rattaché au CHUV et la Centrale téléphonique des médecins de garde à Unisanté</w:t>
+        <w:t xml:space="preserve">Le 144 </w:t>
+      </w:r>
+      <w:proofErr w:type="gramStart"/>
+      <w:r>
+        <w:rPr>
+          <w:i/>
+          <w:lang w:val="fr-FR"/>
+        </w:rPr>
+        <w:t>sera</w:t>
+      </w:r>
+      <w:proofErr w:type="gramEnd"/>
+      <w:r>
+        <w:rPr>
+          <w:i/>
+          <w:lang w:val="fr-FR"/>
+        </w:rPr>
+        <w:t xml:space="preserve"> rattaché au CHUV et la Centrale téléphonique des médecins de garde à Unisanté</w:t>
       </w:r>
       <w:r>
         <w:rPr>
@@ -6468,7 +8241,21 @@
           <w:lang w:val="fr-FR"/>
         </w:rPr>
         <w:lastRenderedPageBreak/>
-        <w:t xml:space="preserve">État de Vaud. (s.d.-a). </w:t>
+        <w:t>État de Vaud. (</w:t>
+      </w:r>
+      <w:proofErr w:type="spellStart"/>
+      <w:r>
+        <w:rPr>
+          <w:lang w:val="fr-FR"/>
+        </w:rPr>
+        <w:t>s.d</w:t>
+      </w:r>
+      <w:proofErr w:type="spellEnd"/>
+      <w:r>
+        <w:rPr>
+          <w:lang w:val="fr-FR"/>
+        </w:rPr>
+        <w:t xml:space="preserve">.-a). </w:t>
       </w:r>
       <w:r>
         <w:rPr>
@@ -6497,7 +8284,21 @@
         <w:rPr>
           <w:lang w:val="fr-FR"/>
         </w:rPr>
-        <w:t xml:space="preserve">État de Vaud. (s.d.-b). </w:t>
+        <w:t>État de Vaud. (</w:t>
+      </w:r>
+      <w:proofErr w:type="spellStart"/>
+      <w:r>
+        <w:rPr>
+          <w:lang w:val="fr-FR"/>
+        </w:rPr>
+        <w:t>s.d</w:t>
+      </w:r>
+      <w:proofErr w:type="spellEnd"/>
+      <w:r>
+        <w:rPr>
+          <w:lang w:val="fr-FR"/>
+        </w:rPr>
+        <w:t xml:space="preserve">.-b). </w:t>
       </w:r>
       <w:r>
         <w:rPr>
@@ -6526,7 +8327,21 @@
         <w:rPr>
           <w:lang w:val="fr-FR"/>
         </w:rPr>
-        <w:t xml:space="preserve">État de Vaud. (s.d.-c). </w:t>
+        <w:t>État de Vaud. (</w:t>
+      </w:r>
+      <w:proofErr w:type="spellStart"/>
+      <w:r>
+        <w:rPr>
+          <w:lang w:val="fr-FR"/>
+        </w:rPr>
+        <w:t>s.d</w:t>
+      </w:r>
+      <w:proofErr w:type="spellEnd"/>
+      <w:r>
+        <w:rPr>
+          <w:lang w:val="fr-FR"/>
+        </w:rPr>
+        <w:t xml:space="preserve">.-c). </w:t>
       </w:r>
       <w:r>
         <w:rPr>
@@ -6584,7 +8399,21 @@
         <w:rPr>
           <w:lang w:val="fr-FR"/>
         </w:rPr>
-        <w:t xml:space="preserve">Unisanté. (s.d.-a). </w:t>
+        <w:t>Unisanté. (</w:t>
+      </w:r>
+      <w:proofErr w:type="spellStart"/>
+      <w:r>
+        <w:rPr>
+          <w:lang w:val="fr-FR"/>
+        </w:rPr>
+        <w:t>s.d</w:t>
+      </w:r>
+      <w:proofErr w:type="spellEnd"/>
+      <w:r>
+        <w:rPr>
+          <w:lang w:val="fr-FR"/>
+        </w:rPr>
+        <w:t xml:space="preserve">.-a). </w:t>
       </w:r>
       <w:r>
         <w:rPr>
@@ -6613,7 +8442,21 @@
         <w:rPr>
           <w:lang w:val="fr-FR"/>
         </w:rPr>
-        <w:t xml:space="preserve">Unisanté. (s.d.-b). </w:t>
+        <w:t>Unisanté. (</w:t>
+      </w:r>
+      <w:proofErr w:type="spellStart"/>
+      <w:r>
+        <w:rPr>
+          <w:lang w:val="fr-FR"/>
+        </w:rPr>
+        <w:t>s.d</w:t>
+      </w:r>
+      <w:proofErr w:type="spellEnd"/>
+      <w:r>
+        <w:rPr>
+          <w:lang w:val="fr-FR"/>
+        </w:rPr>
+        <w:t xml:space="preserve">.-b). </w:t>
       </w:r>
       <w:r>
         <w:rPr>
@@ -6642,7 +8485,21 @@
         <w:rPr>
           <w:lang w:val="fr-FR"/>
         </w:rPr>
-        <w:t xml:space="preserve">Unisanté. (s.d.-c). </w:t>
+        <w:t>Unisanté. (</w:t>
+      </w:r>
+      <w:proofErr w:type="spellStart"/>
+      <w:r>
+        <w:rPr>
+          <w:lang w:val="fr-FR"/>
+        </w:rPr>
+        <w:t>s.d</w:t>
+      </w:r>
+      <w:proofErr w:type="spellEnd"/>
+      <w:r>
+        <w:rPr>
+          <w:lang w:val="fr-FR"/>
+        </w:rPr>
+        <w:t xml:space="preserve">.-c). </w:t>
       </w:r>
       <w:r>
         <w:rPr>
@@ -6671,7 +8528,7 @@
           <w:lang w:val="fr-FR"/>
         </w:rPr>
       </w:pPr>
-      <w:bookmarkStart w:id="37" w:name="_Toc241271699"/>
+      <w:bookmarkStart w:id="36" w:name="_Toc241271699"/>
       <w:r>
         <w:rPr>
           <w:lang w:val="fr-FR"/>
@@ -6679,23 +8536,23 @@
         <w:lastRenderedPageBreak/>
         <w:t>Annexes</w:t>
       </w:r>
+      <w:bookmarkEnd w:id="36"/>
+    </w:p>
+    <w:p>
+      <w:pPr>
+        <w:pStyle w:val="Titre2"/>
+        <w:rPr>
+          <w:lang w:val="fr-FR"/>
+        </w:rPr>
+      </w:pPr>
+      <w:bookmarkStart w:id="37" w:name="_Toc241271700"/>
+      <w:r>
+        <w:rPr>
+          <w:lang w:val="fr-FR"/>
+        </w:rPr>
+        <w:t>Annexe A – Organigrammes</w:t>
+      </w:r>
       <w:bookmarkEnd w:id="37"/>
-    </w:p>
-    <w:p>
-      <w:pPr>
-        <w:pStyle w:val="Titre2"/>
-        <w:rPr>
-          <w:lang w:val="fr-FR"/>
-        </w:rPr>
-      </w:pPr>
-      <w:bookmarkStart w:id="38" w:name="_Toc241271700"/>
-      <w:r>
-        <w:rPr>
-          <w:lang w:val="fr-FR"/>
-        </w:rPr>
-        <w:t>Annexe A – Organigrammes</w:t>
-      </w:r>
-      <w:bookmarkEnd w:id="38"/>
     </w:p>
     <w:p>
       <w:pPr>
@@ -7711,7 +9568,7 @@
           <w:lang w:val="fr-FR"/>
         </w:rPr>
       </w:pPr>
-      <w:bookmarkStart w:id="39" w:name="_Toc241271701"/>
+      <w:bookmarkStart w:id="38" w:name="_Toc241271701"/>
       <w:r>
         <w:rPr>
           <w:lang w:val="fr-FR"/>
@@ -7719,13 +9576,14 @@
         <w:lastRenderedPageBreak/>
         <w:t>Annexe B – Schéma de l'orchestration stratégique RH, de la CTMG à Unisanté</w:t>
       </w:r>
-      <w:bookmarkEnd w:id="39"/>
+      <w:bookmarkEnd w:id="38"/>
     </w:p>
     <w:p>
       <w:pPr>
         <w:keepNext/>
         <w:jc w:val="center"/>
       </w:pPr>
+      <w:bookmarkStart w:id="39" w:name="_GoBack"/>
       <w:r>
         <w:rPr>
           <w:noProof/>
@@ -7733,8 +9591,8 @@
         </w:rPr>
         <w:drawing>
           <wp:inline distT="0" distB="0" distL="0" distR="0">
-            <wp:extent cx="4895850" cy="6783070"/>
-            <wp:effectExtent l="0" t="0" r="0" b="0"/>
+            <wp:extent cx="5303520" cy="7347887"/>
+            <wp:effectExtent l="0" t="0" r="0" b="5715"/>
             <wp:docPr id="1" name="Picture 1"/>
             <wp:cNvGraphicFramePr>
               <a:graphicFrameLocks xmlns:a="http://schemas.openxmlformats.org/drawingml/2006/main" noChangeAspect="1"/>
@@ -7757,7 +9615,7 @@
                   <pic:spPr bwMode="auto">
                     <a:xfrm>
                       <a:off x="0" y="0"/>
-                      <a:ext cx="4895850" cy="6783070"/>
+                      <a:ext cx="5324585" cy="7377072"/>
                     </a:xfrm>
                     <a:prstGeom prst="rect">
                       <a:avLst/>
@@ -7769,6 +9627,7 @@
           </wp:inline>
         </w:drawing>
       </w:r>
+      <w:bookmarkEnd w:id="39"/>
     </w:p>
     <w:p>
       <w:pPr>
@@ -7848,7 +9707,23 @@
           <w:i/>
           <w:lang w:val="fr-FR"/>
         </w:rPr>
-        <w:t>Date : 16.09.2026. Cadre : entretien téléphonique, consentement recueilli en début d'entretien. Restitution : retranscription automatique (Turboscribe), corrigée et complétée par réécoute. Le prénom de la personne interrogée a été remplacé par « E1 ».</w:t>
+        <w:t>Date : 16.09.2026. Cadre : entretien téléphonique, consentement recueilli en début d'entretien. Restitution : retranscription automatique (</w:t>
+      </w:r>
+      <w:proofErr w:type="spellStart"/>
+      <w:r>
+        <w:rPr>
+          <w:i/>
+          <w:lang w:val="fr-FR"/>
+        </w:rPr>
+        <w:t>Turboscribe</w:t>
+      </w:r>
+      <w:proofErr w:type="spellEnd"/>
+      <w:r>
+        <w:rPr>
+          <w:i/>
+          <w:lang w:val="fr-FR"/>
+        </w:rPr>
+        <w:t>), corrigée et complétée par réécoute. Le prénom de la personne interrogée a été remplacé par « E1 ».</w:t>
       </w:r>
     </w:p>
     <w:p>
@@ -8094,7 +9969,21 @@
         <w:rPr>
           <w:lang w:val="fr-FR"/>
         </w:rPr>
-        <w:t xml:space="preserve"> Comment ce message a-t-il été reçu ?</w:t>
+        <w:t xml:space="preserve"> Comment ce message </w:t>
+      </w:r>
+      <w:proofErr w:type="spellStart"/>
+      <w:r>
+        <w:rPr>
+          <w:lang w:val="fr-FR"/>
+        </w:rPr>
+        <w:t>a-t-il</w:t>
+      </w:r>
+      <w:proofErr w:type="spellEnd"/>
+      <w:r>
+        <w:rPr>
+          <w:lang w:val="fr-FR"/>
+        </w:rPr>
+        <w:t xml:space="preserve"> été reçu ?</w:t>
       </w:r>
     </w:p>
     <w:p>
@@ -8281,7 +10170,21 @@
         <w:rPr>
           <w:lang w:val="fr-FR"/>
         </w:rPr>
-        <w:t xml:space="preserve"> Et les RH d'Unisanté, quelle place ont-elles pour vous ?</w:t>
+        <w:t xml:space="preserve"> Et les RH d'Unisanté, quelle place </w:t>
+      </w:r>
+      <w:proofErr w:type="spellStart"/>
+      <w:r>
+        <w:rPr>
+          <w:lang w:val="fr-FR"/>
+        </w:rPr>
+        <w:t>ont-elles</w:t>
+      </w:r>
+      <w:proofErr w:type="spellEnd"/>
+      <w:r>
+        <w:rPr>
+          <w:lang w:val="fr-FR"/>
+        </w:rPr>
+        <w:t xml:space="preserve"> pour vous ?</w:t>
       </w:r>
     </w:p>
     <w:p>
@@ -8448,7 +10351,21 @@
         <w:rPr>
           <w:lang w:val="fr-FR"/>
         </w:rPr>
-        <w:t xml:space="preserve"> Pour moi, il faudrait surtout de la transparence et des actes dans la durée. Les collaborateurs doivent pouvoir voir que lorsqu'un problème remonte, il est entendu, traité et qu'il y a un retour.</w:t>
+        <w:t xml:space="preserve"> Pour moi, il faudrait surtout de la transparence et des actes dans la durée. Les collaborateurs doivent pouvoir voir que lorsqu'un problème remonte, il est entendu, </w:t>
+      </w:r>
+      <w:proofErr w:type="gramStart"/>
+      <w:r>
+        <w:rPr>
+          <w:lang w:val="fr-FR"/>
+        </w:rPr>
+        <w:t>traité</w:t>
+      </w:r>
+      <w:proofErr w:type="gramEnd"/>
+      <w:r>
+        <w:rPr>
+          <w:lang w:val="fr-FR"/>
+        </w:rPr>
+        <w:t xml:space="preserve"> et qu'il y a un retour.</w:t>
       </w:r>
     </w:p>
     <w:p>
@@ -8583,7 +10500,23 @@
           <w:b/>
           <w:lang w:val="fr-FR"/>
         </w:rPr>
-        <w:t>C2. Entretien avec une régulatrice sanitaire, praticienne formatrice (E2)</w:t>
+        <w:t xml:space="preserve">C2. Entretien avec </w:t>
+      </w:r>
+      <w:proofErr w:type="gramStart"/>
+      <w:r>
+        <w:rPr>
+          <w:b/>
+          <w:lang w:val="fr-FR"/>
+        </w:rPr>
+        <w:t>une régulatrice</w:t>
+      </w:r>
+      <w:proofErr w:type="gramEnd"/>
+      <w:r>
+        <w:rPr>
+          <w:b/>
+          <w:lang w:val="fr-FR"/>
+        </w:rPr>
+        <w:t xml:space="preserve"> sanitaire, praticienne formatrice (E2)</w:t>
       </w:r>
     </w:p>
     <w:p>
@@ -8598,7 +10531,23 @@
           <w:i/>
           <w:lang w:val="fr-FR"/>
         </w:rPr>
-        <w:t>Date : 28.11.2024. Cadre : entretien téléphonique réalisé selon la technique des incidents critiques pour le module 002 (Comportements organisationnels), consentement recueilli en début d'entretien. Restitution : retranscription automatique (Turboscribe), corrigée et complétée par réécoute. Autorisation de réutilisation pour le présent audit : accord oral donné par téléphone le 17.09.2026 (échange retranscrit ci-dessous). Les prénoms ont été remplacés par « Auteur » et « E2 », et les données personnelles d'identification ont été retirées.</w:t>
+        <w:t>Date : 28.11.2024. Cadre : entretien téléphonique réalisé selon la technique des incidents critiques pour le module 002 (Comportements organisationnels), consentement recueilli en début d'entretien. Restitution : retranscription automatique (</w:t>
+      </w:r>
+      <w:proofErr w:type="spellStart"/>
+      <w:r>
+        <w:rPr>
+          <w:i/>
+          <w:lang w:val="fr-FR"/>
+        </w:rPr>
+        <w:t>Turboscribe</w:t>
+      </w:r>
+      <w:proofErr w:type="spellEnd"/>
+      <w:r>
+        <w:rPr>
+          <w:i/>
+          <w:lang w:val="fr-FR"/>
+        </w:rPr>
+        <w:t>), corrigée et complétée par réécoute. Autorisation de réutilisation pour le présent audit : accord oral donné par téléphone le 17.09.2026 (échange retranscrit ci-dessous). Les prénoms ont été remplacés par « Auteur » et « E2 », et les données personnelles d'identification ont été retirées.</w:t>
       </w:r>
     </w:p>
     <w:p>
@@ -8707,7 +10656,21 @@
         <w:rPr>
           <w:lang w:val="fr-FR"/>
         </w:rPr>
-        <w:t xml:space="preserve"> Je t’en remercie, j’ajouterai la retranscription de ton accord sur le document. [suite de la conversation hors-cadre du travail].</w:t>
+        <w:t xml:space="preserve"> Je t’en remercie, j’ajouterai la retranscription de ton accord sur le document. [</w:t>
+      </w:r>
+      <w:proofErr w:type="gramStart"/>
+      <w:r>
+        <w:rPr>
+          <w:lang w:val="fr-FR"/>
+        </w:rPr>
+        <w:t>suite</w:t>
+      </w:r>
+      <w:proofErr w:type="gramEnd"/>
+      <w:r>
+        <w:rPr>
+          <w:lang w:val="fr-FR"/>
+        </w:rPr>
+        <w:t xml:space="preserve"> de la conversation hors-cadre du travail].</w:t>
       </w:r>
     </w:p>
     <w:p>
@@ -9113,7 +11076,21 @@
         <w:rPr>
           <w:lang w:val="fr-FR"/>
         </w:rPr>
-        <w:t>On consacre une dizaine de minutes à se connecter sur nos ordinateurs, puisqu'on travaille en face d'écran avec des casques. Et puis, une fois qu'on est logué pour pouvoir recevoir les appels de la population, appels téléphoniques ou des appels d’urgence, des alarmes secutel, des personnes fragiles qui ont des bracelets d’alarme Secutel. C’est un ordinateur qui décide qui reçoit un appel de manière on va dire que ce soit assez équilibré et que ce ne soit pas tout le temps les mêmes personnes qui reçoivent les appels.</w:t>
+        <w:t xml:space="preserve">On consacre une dizaine de minutes à se connecter sur nos ordinateurs, puisqu'on travaille en face d'écran avec des casques. Et puis, une fois qu'on est logué pour pouvoir recevoir les appels de la population, appels téléphoniques ou des appels d’urgence, des alarmes </w:t>
+      </w:r>
+      <w:proofErr w:type="spellStart"/>
+      <w:r>
+        <w:rPr>
+          <w:lang w:val="fr-FR"/>
+        </w:rPr>
+        <w:t>secutel</w:t>
+      </w:r>
+      <w:proofErr w:type="spellEnd"/>
+      <w:r>
+        <w:rPr>
+          <w:lang w:val="fr-FR"/>
+        </w:rPr>
+        <w:t>, des personnes fragiles qui ont des bracelets d’alarme Secutel. C’est un ordinateur qui décide qui reçoit un appel de manière on va dire que ce soit assez équilibré et que ce ne soit pas tout le temps les mêmes personnes qui reçoivent les appels.</w:t>
       </w:r>
     </w:p>
     <w:p>
@@ -9193,7 +11170,35 @@
         <w:rPr>
           <w:lang w:val="fr-FR"/>
         </w:rPr>
-        <w:t>Deuxième motivation, c'est la diversité des appels qu'on a. On est souvent considérés comme un numéro poubelle. C'est ce que les gens disent [collègues de travail], euh, parce que ça fait pas très, euh, glorieux d’avoir des appels pour des rages de dent ou des verrues mais ça reste quelque chose de passionnant. C’est comme le papier cadeau au pied du sapin de Noel, tu sais pas trop ce qu’il y aura dedans et tu peux trouver ça super et puis tu peux trouver ça vraiment nul. Après, ce qui me plaît beaucoup, c'est de travailler euh, alors on est en équipe, c’est-à-dire qu’on est plusieurs au même endroit et on peut demander aux autres des avis, des conseils, notamment au chef des salle. Par contre, j'aime bien, j'ai plus envie d’être au sein d’équipe qui vont, j’ai travaillé aux soins intensifs, qui vont me dire « pourquoi tu as mis le pansement un peu plus à gauche que d'habitude. Moi, je l'ai mis un peu plus à droite ». C'est un côté un peu chiant. On n’a pas de transmission à faire, je n’ai plus envie d'avoir des transmissions. Et je n'ai plus envie d'avoir le côté pesant, parfois aussi, du travail en «équipe. Et puis, ce qui me motive aussi, je suis désolée, mais c'est le salaire.</w:t>
+        <w:t xml:space="preserve">Deuxième motivation, c'est la diversité des appels qu'on a. On est souvent considérés comme un numéro poubelle. C'est ce que les gens disent [collègues de travail], euh, parce que ça fait pas très, euh, glorieux d’avoir des appels pour des rages de dent ou des verrues mais ça reste quelque chose de passionnant. C’est comme le papier cadeau au pied du sapin de Noel, </w:t>
+      </w:r>
+      <w:proofErr w:type="gramStart"/>
+      <w:r>
+        <w:rPr>
+          <w:lang w:val="fr-FR"/>
+        </w:rPr>
+        <w:t>tu sais</w:t>
+      </w:r>
+      <w:proofErr w:type="gramEnd"/>
+      <w:r>
+        <w:rPr>
+          <w:lang w:val="fr-FR"/>
+        </w:rPr>
+        <w:t xml:space="preserve"> pas trop ce qu’il y aura dedans et tu peux trouver ça super et puis tu peux trouver ça vraiment nul. Après, ce qui me plaît beaucoup, c'est de travailler euh, alors on est en équipe, c’est-à-dire qu’on est plusieurs au même endroit et on peut demander aux autres des avis, des conseils, notamment au chef </w:t>
+      </w:r>
+      <w:proofErr w:type="gramStart"/>
+      <w:r>
+        <w:rPr>
+          <w:lang w:val="fr-FR"/>
+        </w:rPr>
+        <w:t>des salle</w:t>
+      </w:r>
+      <w:proofErr w:type="gramEnd"/>
+      <w:r>
+        <w:rPr>
+          <w:lang w:val="fr-FR"/>
+        </w:rPr>
+        <w:t>. Par contre, j'aime bien, j'ai plus envie d’être au sein d’équipe qui vont, j’ai travaillé aux soins intensifs, qui vont me dire « pourquoi tu as mis le pansement un peu plus à gauche que d'habitude. Moi, je l'ai mis un peu plus à droite ». C'est un côté un peu chiant. On n’a pas de transmission à faire, je n’ai plus envie d'avoir des transmissions. Et je n'ai plus envie d'avoir le côté pesant, parfois aussi, du travail en «équipe. Et puis, ce qui me motive aussi, je suis désolée, mais c'est le salaire.</w:t>
       </w:r>
     </w:p>
     <w:p>
@@ -9584,7 +11589,21 @@
         <w:rPr>
           <w:lang w:val="fr-FR"/>
         </w:rPr>
-        <w:t>C'est une dame qui a l'air d'être totalement cinglée. Elle dit qu’elle a des vers qui lui sort partout dans le corps. ». Donc, il s'adresse au chef de salle. Il rigole, il dit « qui est-ce qui veut ça ». Je dis, « ben vas-y envoie le moi ». Je me dis à moi-même, « Mon Dieu, sur quoi je vais tomber ». Et puis, en fait j’ai fait mon anamnèse et euh, en réalité, cette dame me décrit quelque chose que j'ai fait en travaillant en Afrique. Elle me décrit très bien. Elle est en contact avec des gens qui venaient d'Afrique d'ailleurs, en contact rapproché. Et elle me décrit une problématique d’infection par des vers qui effectivement vont sous la peau qui gigotent, tombent.</w:t>
+        <w:t xml:space="preserve">C'est une dame qui a l'air d'être totalement cinglée. Elle dit qu’elle a des vers qui lui </w:t>
+      </w:r>
+      <w:proofErr w:type="gramStart"/>
+      <w:r>
+        <w:rPr>
+          <w:lang w:val="fr-FR"/>
+        </w:rPr>
+        <w:t>sort</w:t>
+      </w:r>
+      <w:proofErr w:type="gramEnd"/>
+      <w:r>
+        <w:rPr>
+          <w:lang w:val="fr-FR"/>
+        </w:rPr>
+        <w:t xml:space="preserve"> partout dans le corps. ». Donc, il s'adresse au chef de salle. Il rigole, il dit « qui est-ce qui veut ça ». Je dis, « ben vas-y envoie le moi ». Je me dis à moi-même, « Mon Dieu, sur quoi je vais tomber ». Et puis, en fait j’ai fait mon anamnèse et euh, en réalité, cette dame me décrit quelque chose que j'ai fait en travaillant en Afrique. Elle me décrit très bien. Elle est en contact avec des gens qui venaient d'Afrique d'ailleurs, en contact rapproché. Et elle me décrit une problématique d’infection par des vers qui effectivement vont sous la peau qui gigotent, tombent.</w:t>
       </w:r>
     </w:p>
     <w:p>
@@ -9636,7 +11655,21 @@
         <w:rPr>
           <w:lang w:val="fr-FR"/>
         </w:rPr>
-        <w:t>J'ai eu la chance de tomber sur un médecin. J'ai expliqué au médecin ce qui se passe. C'est normalement pas du tout ce que je fais.</w:t>
+        <w:t xml:space="preserve">J'ai eu la chance de tomber sur un médecin. J'ai expliqué au médecin ce qui se passe. </w:t>
+      </w:r>
+      <w:proofErr w:type="gramStart"/>
+      <w:r>
+        <w:rPr>
+          <w:lang w:val="fr-FR"/>
+        </w:rPr>
+        <w:t>C'est</w:t>
+      </w:r>
+      <w:proofErr w:type="gramEnd"/>
+      <w:r>
+        <w:rPr>
+          <w:lang w:val="fr-FR"/>
+        </w:rPr>
+        <w:t xml:space="preserve"> normalement pas du tout ce que je fais.</w:t>
       </w:r>
     </w:p>
     <w:p>
@@ -9708,7 +11741,49 @@
           <w:lang w:val="fr-FR"/>
         </w:rPr>
         <w:lastRenderedPageBreak/>
-        <w:t>pas trouvé. C'est juste... Enfin voilà quoi, il faut avoir été en Afrique de l’ouest plus particulièrement ou bien alors, travailler en médecine tropicale pour connaître. Voilà , ça ça a été, j’étais contente, très très contente et fière de moi.</w:t>
+        <w:t xml:space="preserve">pas trouvé. C'est juste... Enfin voilà quoi, il faut avoir été en Afrique de l’ouest plus particulièrement ou bien alors, travailler en médecine tropicale pour connaître. </w:t>
+      </w:r>
+      <w:proofErr w:type="gramStart"/>
+      <w:r>
+        <w:rPr>
+          <w:lang w:val="fr-FR"/>
+        </w:rPr>
+        <w:t>Voilà ,</w:t>
+      </w:r>
+      <w:proofErr w:type="gramEnd"/>
+      <w:r>
+        <w:rPr>
+          <w:lang w:val="fr-FR"/>
+        </w:rPr>
+        <w:t xml:space="preserve"> ça </w:t>
+      </w:r>
+      <w:proofErr w:type="spellStart"/>
+      <w:r>
+        <w:rPr>
+          <w:lang w:val="fr-FR"/>
+        </w:rPr>
+        <w:t>ça</w:t>
+      </w:r>
+      <w:proofErr w:type="spellEnd"/>
+      <w:r>
+        <w:rPr>
+          <w:lang w:val="fr-FR"/>
+        </w:rPr>
+        <w:t xml:space="preserve"> a été, j’étais contente, très </w:t>
+      </w:r>
+      <w:proofErr w:type="spellStart"/>
+      <w:r>
+        <w:rPr>
+          <w:lang w:val="fr-FR"/>
+        </w:rPr>
+        <w:t>très</w:t>
+      </w:r>
+      <w:proofErr w:type="spellEnd"/>
+      <w:r>
+        <w:rPr>
+          <w:lang w:val="fr-FR"/>
+        </w:rPr>
+        <w:t xml:space="preserve"> contente et fière de moi.</w:t>
       </w:r>
     </w:p>
     <w:p>
@@ -9800,7 +11875,21 @@
         <w:rPr>
           <w:lang w:val="fr-FR"/>
         </w:rPr>
-        <w:t>J'ai vraiment écouté. Puis après, par contre, j'ai sorti du cadre spécifique et j'ai fait une action qui n’était pas protocolée et après, appelé la médecine tropicale pour choper un rdv en médecine tropicale à la dame et j'ai prévenu tous les collègues. C'était un vendredi.</w:t>
+        <w:t xml:space="preserve">J'ai vraiment écouté. Puis après, par contre, j'ai sorti du cadre spécifique et j'ai fait une action qui n’était pas </w:t>
+      </w:r>
+      <w:proofErr w:type="spellStart"/>
+      <w:r>
+        <w:rPr>
+          <w:lang w:val="fr-FR"/>
+        </w:rPr>
+        <w:t>protocolée</w:t>
+      </w:r>
+      <w:proofErr w:type="spellEnd"/>
+      <w:r>
+        <w:rPr>
+          <w:lang w:val="fr-FR"/>
+        </w:rPr>
+        <w:t xml:space="preserve"> et après, appelé la médecine tropicale pour choper un rdv en médecine tropicale à la dame et j'ai prévenu tous les collègues. C'était un vendredi.</w:t>
       </w:r>
     </w:p>
     <w:p>
@@ -9865,7 +11954,21 @@
         <w:rPr>
           <w:lang w:val="fr-FR"/>
         </w:rPr>
-        <w:t>Ce que j'ai aimé, c'est de faire quelque chose qui n’était pas tracé sur le papie. J’ai eu ma petite autonomie et puis ça a marché.</w:t>
+        <w:t xml:space="preserve">Ce que j'ai aimé, c'est de faire quelque chose qui n’était pas tracé sur le </w:t>
+      </w:r>
+      <w:proofErr w:type="spellStart"/>
+      <w:r>
+        <w:rPr>
+          <w:lang w:val="fr-FR"/>
+        </w:rPr>
+        <w:t>papie</w:t>
+      </w:r>
+      <w:proofErr w:type="spellEnd"/>
+      <w:r>
+        <w:rPr>
+          <w:lang w:val="fr-FR"/>
+        </w:rPr>
+        <w:t>. J’ai eu ma petite autonomie et puis ça a marché.</w:t>
       </w:r>
     </w:p>
     <w:p>
@@ -9918,7 +12021,21 @@
         <w:rPr>
           <w:lang w:val="fr-FR"/>
         </w:rPr>
-        <w:t>J'ai joué le jeu de « je ne suis pas un robot et j’utilise mon cerveau ». Euh l’expérience que j’avais, elle a eu du bol de tomber sur moi, parce que quand tu ne connais pas cette pathologie, tu ne peux pas imaginer qu’elle existe et puis euuh, après euh, ce qui a joué malgré tout c’est quand même cette cohésion d’équipe. Parce que quand j'en ai parlé pour préparer le week-end, au cas où elle rappelle, parce qu’elle savait qu’elle pouvait rappeler quand elle voulait, si elle n'était pas bien. Je l’ai expliqué aux chefs de salle qu'ils ont transmis. Et ça j'ai trouvé ça sympa, qu'il y a un relais au niveau de l'équipe.</w:t>
+        <w:t xml:space="preserve">J'ai joué le jeu de « je ne suis pas un robot et j’utilise mon cerveau ». Euh l’expérience que j’avais, elle a eu du bol de tomber sur moi, parce que quand tu ne connais pas cette pathologie, tu ne peux pas imaginer qu’elle existe et puis </w:t>
+      </w:r>
+      <w:proofErr w:type="spellStart"/>
+      <w:r>
+        <w:rPr>
+          <w:lang w:val="fr-FR"/>
+        </w:rPr>
+        <w:t>euuh</w:t>
+      </w:r>
+      <w:proofErr w:type="spellEnd"/>
+      <w:r>
+        <w:rPr>
+          <w:lang w:val="fr-FR"/>
+        </w:rPr>
+        <w:t>, après euh, ce qui a joué malgré tout c’est quand même cette cohésion d’équipe. Parce que quand j'en ai parlé pour préparer le week-end, au cas où elle rappelle, parce qu’elle savait qu’elle pouvait rappeler quand elle voulait, si elle n'était pas bien. Je l’ai expliqué aux chefs de salle qu'ils ont transmis. Et ça j'ai trouvé ça sympa, qu'il y a un relais au niveau de l'équipe.</w:t>
       </w:r>
     </w:p>
     <w:p>
@@ -10171,7 +12288,21 @@
         <w:rPr>
           <w:lang w:val="fr-FR"/>
         </w:rPr>
-        <w:t>C'était plutôt informel et fortuit. Ça n'a pas été prévenu, à un moment donné quand la coupe est pleine, elle finit par débordée et tu finis par parler. Moi je ne vais pas trop dans le cadre du travail critiquer l'institution parce que c'est transformé, multi-amplifié et ça peut porter préjudices. Ce n'est pas un conflit ouvert mais en même temps, je ne sais pas trop par quel bout prendre le problème organisationnel non, institutionnellement non, ça a été fortuit.Et je pense que j'avais ras-le-bol. Je pense que c'était surtout parce que j'avais ras-le-bol [rires] qu'il ne se passait rien. Ma collègue c’était pareil, elle en avait ras-le-bol qui ne se passe rien. Et on nous a aidés aussi. Donc c’est l’appui d’autre personne expérimentée, mais ça n’a pas été dans un cadre institutionnel, c’est tout, ni organisationnel non plus. Ça s’est fait comme ça.</w:t>
+        <w:t xml:space="preserve">C'était plutôt informel et fortuit. Ça n'a pas été prévenu, à un moment donné quand la coupe est pleine, elle finit par débordée et tu finis par parler. Moi je ne vais pas trop dans le cadre du travail critiquer l'institution parce que c'est transformé, multi-amplifié et ça peut porter préjudices. Ce n'est pas un conflit ouvert mais en même temps, je ne sais pas trop par quel bout prendre le problème organisationnel non, institutionnellement non, ça a été </w:t>
+      </w:r>
+      <w:proofErr w:type="spellStart"/>
+      <w:r>
+        <w:rPr>
+          <w:lang w:val="fr-FR"/>
+        </w:rPr>
+        <w:t>fortuit.Et</w:t>
+      </w:r>
+      <w:proofErr w:type="spellEnd"/>
+      <w:r>
+        <w:rPr>
+          <w:lang w:val="fr-FR"/>
+        </w:rPr>
+        <w:t xml:space="preserve"> je pense que j'avais ras-le-bol. Je pense que c'était surtout parce que j'avais ras-le-bol [rires] qu'il ne se passait rien. Ma collègue c’était pareil, elle en avait ras-le-bol qui ne se passe rien. Et on nous a aidés aussi. Donc c’est l’appui d’autre personne expérimentée, mais ça n’a pas été dans un cadre institutionnel, c’est tout, ni organisationnel non plus. Ça s’est fait comme ça.</w:t>
       </w:r>
     </w:p>
     <w:p>
@@ -10191,7 +12322,21 @@
         <w:rPr>
           <w:lang w:val="fr-FR"/>
         </w:rPr>
-        <w:t xml:space="preserve"> Et puis ces personnes plus expérimentée, euh, est-ce que tu peux me dire, à quel niveau hiérarchique se place-t-il ? Si c’était des collèg/</w:t>
+        <w:t xml:space="preserve"> Et puis ces personnes plus expérimentée, euh, est-ce que tu peux me dire, à quel niveau hiérarchique se place-t-il ? Si c’était des </w:t>
+      </w:r>
+      <w:proofErr w:type="spellStart"/>
+      <w:r>
+        <w:rPr>
+          <w:lang w:val="fr-FR"/>
+        </w:rPr>
+        <w:t>collèg</w:t>
+      </w:r>
+      <w:proofErr w:type="spellEnd"/>
+      <w:r>
+        <w:rPr>
+          <w:lang w:val="fr-FR"/>
+        </w:rPr>
+        <w:t>/</w:t>
       </w:r>
     </w:p>
     <w:p>
@@ -10211,7 +12356,35 @@
         <w:rPr>
           <w:lang w:val="fr-FR"/>
         </w:rPr>
-        <w:t xml:space="preserve"> En fait, c’est pas de la vraie hiérarchie, c’était un collègue chef de salle, mais c’est paaas, hiérarchiquement, c’est pas mon chef. Les chefs de salle c’est euh, on peut le comparer au chef d’orchestre qui organise et coordonne le travail de tous les acteurs à la centrale. Après il y a aussi un petit côté flicage en surveillant le taux d’activité donc il y a un petit côté garde chiots mais il n’y a pas de relation hiérarchique, je pense que c’est qui a aidé aussi en tout cas ça a permis d’avoir cette discussion plus ouverte et parce que cette personne ne pouvait pas se sentir agressée parce que elle était en dehors la hiérarchie. Parce que si j’avais eu le même questionnement et je l’ai eu avec ma hiérarchie, c’est-à-dire mes cadres, ben tout de suite c’était vécu comme une agression, une euh, une euh, c’est-à-dire c’est comme si je l’avais pointée du doigt dans leur incapacité de gérer leurs problèmes.</w:t>
+        <w:t xml:space="preserve"> En fait, </w:t>
+      </w:r>
+      <w:proofErr w:type="gramStart"/>
+      <w:r>
+        <w:rPr>
+          <w:lang w:val="fr-FR"/>
+        </w:rPr>
+        <w:t>c’est</w:t>
+      </w:r>
+      <w:proofErr w:type="gramEnd"/>
+      <w:r>
+        <w:rPr>
+          <w:lang w:val="fr-FR"/>
+        </w:rPr>
+        <w:t xml:space="preserve"> pas de la vraie hiérarchie, c’était un collègue chef de salle, mais c’est </w:t>
+      </w:r>
+      <w:proofErr w:type="spellStart"/>
+      <w:r>
+        <w:rPr>
+          <w:lang w:val="fr-FR"/>
+        </w:rPr>
+        <w:t>paaas</w:t>
+      </w:r>
+      <w:proofErr w:type="spellEnd"/>
+      <w:r>
+        <w:rPr>
+          <w:lang w:val="fr-FR"/>
+        </w:rPr>
+        <w:t>, hiérarchiquement, c’est pas mon chef. Les chefs de salle c’est euh, on peut le comparer au chef d’orchestre qui organise et coordonne le travail de tous les acteurs à la centrale. Après il y a aussi un petit côté flicage en surveillant le taux d’activité donc il y a un petit côté garde chiots mais il n’y a pas de relation hiérarchique, je pense que c’est qui a aidé aussi en tout cas ça a permis d’avoir cette discussion plus ouverte et parce que cette personne ne pouvait pas se sentir agressée parce que elle était en dehors la hiérarchie. Parce que si j’avais eu le même questionnement et je l’ai eu avec ma hiérarchie, c’est-à-dire mes cadres, ben tout de suite c’était vécu comme une agression, une euh, une euh, c’est-à-dire c’est comme si je l’avais pointée du doigt dans leur incapacité de gérer leurs problèmes.</w:t>
       </w:r>
     </w:p>
     <w:p>
@@ -10277,7 +12450,21 @@
         <w:rPr>
           <w:lang w:val="fr-FR"/>
         </w:rPr>
-        <w:t xml:space="preserve"> Ah bah oui. Il y a encore récemment, il y a quelques mois, j'ai été en arrêt maladie. Alors, c’est pas directement dans la centrale, ça correspond quand même à ta question ?</w:t>
+        <w:t xml:space="preserve"> Ah bah oui. Il y a encore récemment, il y a quelques mois, j'ai été en arrêt maladie. Alors, </w:t>
+      </w:r>
+      <w:proofErr w:type="gramStart"/>
+      <w:r>
+        <w:rPr>
+          <w:lang w:val="fr-FR"/>
+        </w:rPr>
+        <w:t>c’est</w:t>
+      </w:r>
+      <w:proofErr w:type="gramEnd"/>
+      <w:r>
+        <w:rPr>
+          <w:lang w:val="fr-FR"/>
+        </w:rPr>
+        <w:t xml:space="preserve"> pas directement dans la centrale, ça correspond quand même à ta question ?</w:t>
       </w:r>
     </w:p>
     <w:p>
@@ -10481,7 +12668,21 @@
         <w:rPr>
           <w:lang w:val="fr-FR"/>
         </w:rPr>
-        <w:t>Je ne sais pas ce que j'ai fait de mal d’ailleurs. Et quant à la procédure, se faire tenser vertement comme ça euh, parce que je n’ai pas annoncé en temps et en heure.</w:t>
+        <w:t xml:space="preserve">Je ne sais pas ce que j'ai fait de mal d’ailleurs. Et quant à la procédure, se faire </w:t>
+      </w:r>
+      <w:proofErr w:type="spellStart"/>
+      <w:r>
+        <w:rPr>
+          <w:lang w:val="fr-FR"/>
+        </w:rPr>
+        <w:t>tenser</w:t>
+      </w:r>
+      <w:proofErr w:type="spellEnd"/>
+      <w:r>
+        <w:rPr>
+          <w:lang w:val="fr-FR"/>
+        </w:rPr>
+        <w:t xml:space="preserve"> vertement comme ça euh, parce que je n’ai pas annoncé en temps et en heure.</w:t>
       </w:r>
     </w:p>
     <w:p>
@@ -10580,7 +12781,35 @@
         <w:rPr>
           <w:lang w:val="fr-FR"/>
         </w:rPr>
-        <w:t>J'avais laissé la trace orale et écrite de mon arrêt. Donc j'ai commis des erreurs. Après, je pense que c'est une… Je pense que d’un point de vue… Je ne sais pas si c'est managérial, je ne suis pas qualifiée, mais je trouve qu’il y a une méconnaissance totale de la.. de la façon donc il y a le management et il y a aussi l'accompagnement. Il y a aussi euh… la connaissance de la gestion d'un personnel quoi.</w:t>
+        <w:t>J'avais laissé la trace orale et écrite de mon arrêt. Donc j'ai commis des erreurs. Après, je pense que c'est une… Je pense que d’un point de vue… Je ne sais pas si c'est managérial, je ne suis pas qualifiée, mais je trouve qu’il y a une méconnaissance totale de la</w:t>
+      </w:r>
+      <w:proofErr w:type="gramStart"/>
+      <w:r>
+        <w:rPr>
+          <w:lang w:val="fr-FR"/>
+        </w:rPr>
+        <w:t>..</w:t>
+      </w:r>
+      <w:proofErr w:type="gramEnd"/>
+      <w:r>
+        <w:rPr>
+          <w:lang w:val="fr-FR"/>
+        </w:rPr>
+        <w:t xml:space="preserve"> </w:t>
+      </w:r>
+      <w:proofErr w:type="gramStart"/>
+      <w:r>
+        <w:rPr>
+          <w:lang w:val="fr-FR"/>
+        </w:rPr>
+        <w:t>de</w:t>
+      </w:r>
+      <w:proofErr w:type="gramEnd"/>
+      <w:r>
+        <w:rPr>
+          <w:lang w:val="fr-FR"/>
+        </w:rPr>
+        <w:t xml:space="preserve"> la façon donc il y a le management et il y a aussi l'accompagnement. Il y a aussi euh… la connaissance de la gestion d'un personnel quoi.</w:t>
       </w:r>
     </w:p>
     <w:p>
@@ -10645,7 +12874,21 @@
         <w:rPr>
           <w:lang w:val="fr-FR"/>
         </w:rPr>
-        <w:t>Même si j’avais à être la dernière des dernières, à être absente en permanence, en retard et tout ce qu’on veut, même comme ça, ce n'est pas comme ça qu'on doit faire. On ne doit pas faire comme ça. Ce n'est pas normal.</w:t>
+        <w:t xml:space="preserve">Même si j’avais à être la dernière des dernières, à être </w:t>
+      </w:r>
+      <w:proofErr w:type="gramStart"/>
+      <w:r>
+        <w:rPr>
+          <w:lang w:val="fr-FR"/>
+        </w:rPr>
+        <w:t>absente</w:t>
+      </w:r>
+      <w:proofErr w:type="gramEnd"/>
+      <w:r>
+        <w:rPr>
+          <w:lang w:val="fr-FR"/>
+        </w:rPr>
+        <w:t xml:space="preserve"> en permanence, en retard et tout ce qu’on veut, même comme ça, ce n'est pas comme ça qu'on doit faire. On ne doit pas faire comme ça. Ce n'est pas normal.</w:t>
       </w:r>
     </w:p>
     <w:p>
@@ -11733,11 +13976,19 @@
           <w:lang w:val="fr-FR"/>
         </w:rPr>
       </w:pPr>
-      <w:r>
-        <w:rPr>
-          <w:lang w:val="fr-FR"/>
-        </w:rPr>
-        <w:t>C'est pas assez professionnel. C'est un jugement de valeur, mais je l'assume.</w:t>
+      <w:proofErr w:type="gramStart"/>
+      <w:r>
+        <w:rPr>
+          <w:lang w:val="fr-FR"/>
+        </w:rPr>
+        <w:t>C'est</w:t>
+      </w:r>
+      <w:proofErr w:type="gramEnd"/>
+      <w:r>
+        <w:rPr>
+          <w:lang w:val="fr-FR"/>
+        </w:rPr>
+        <w:t xml:space="preserve"> pas assez professionnel. C'est un jugement de valeur, mais je l'assume.</w:t>
       </w:r>
     </w:p>
     <w:p>
@@ -11975,7 +14226,49 @@
         <w:rPr>
           <w:lang w:val="fr-FR"/>
         </w:rPr>
-        <w:t xml:space="preserve"> Il n'y en a pas, donc comme ça, ça va être vite fait. La seule force, c'est quelques personnes qui sont des vrais communicants, mais pas des cancaneurs, des cancaneuses, parce que si tu te dis « ah oui, mais ça ne m'étonne pas, là ou j'ai fait ça, ça ne fait pas avancer la CTMG », rares sont les gens qui acceptent de te parler et de te donner des clés pour avancer. Très rares pour la centrale.</w:t>
+        <w:t xml:space="preserve"> Il n'y en a pas, donc comme ça, ça va être vite fait. La seule force, c'est quelques personnes qui sont des vrais communicants, mais pas des </w:t>
+      </w:r>
+      <w:proofErr w:type="spellStart"/>
+      <w:r>
+        <w:rPr>
+          <w:lang w:val="fr-FR"/>
+        </w:rPr>
+        <w:t>cancaneurs</w:t>
+      </w:r>
+      <w:proofErr w:type="spellEnd"/>
+      <w:r>
+        <w:rPr>
+          <w:lang w:val="fr-FR"/>
+        </w:rPr>
+        <w:t xml:space="preserve">, des </w:t>
+      </w:r>
+      <w:proofErr w:type="spellStart"/>
+      <w:r>
+        <w:rPr>
+          <w:lang w:val="fr-FR"/>
+        </w:rPr>
+        <w:t>cancaneuses</w:t>
+      </w:r>
+      <w:proofErr w:type="spellEnd"/>
+      <w:r>
+        <w:rPr>
+          <w:lang w:val="fr-FR"/>
+        </w:rPr>
+        <w:t xml:space="preserve">, parce que si tu te dis « ah oui, mais ça ne m'étonne pas, là </w:t>
+      </w:r>
+      <w:proofErr w:type="spellStart"/>
+      <w:r>
+        <w:rPr>
+          <w:lang w:val="fr-FR"/>
+        </w:rPr>
+        <w:t>ou</w:t>
+      </w:r>
+      <w:proofErr w:type="spellEnd"/>
+      <w:r>
+        <w:rPr>
+          <w:lang w:val="fr-FR"/>
+        </w:rPr>
+        <w:t xml:space="preserve"> j'ai fait ça, ça ne fait pas avancer la CTMG », rares sont les gens qui acceptent de te parler et de te donner des clés pour avancer. Très rares pour la centrale.</w:t>
       </w:r>
     </w:p>
     <w:p>
@@ -12001,7 +14294,21 @@
         <w:rPr>
           <w:lang w:val="fr-FR"/>
         </w:rPr>
-        <w:t>Si, notre dernier cadre qui est arrivé, il met un peu plus les formes, mais il est un peu plus posé, c'est moins lié à des états d'âme, il est plus peace, c'est reposant. Après, à voir sur le long terme.</w:t>
+        <w:t xml:space="preserve">Si, notre dernier cadre qui est arrivé, il met un peu plus les formes, mais il est un peu plus posé, c'est moins lié à des états d'âme, il est plus </w:t>
+      </w:r>
+      <w:proofErr w:type="spellStart"/>
+      <w:r>
+        <w:rPr>
+          <w:lang w:val="fr-FR"/>
+        </w:rPr>
+        <w:t>peace</w:t>
+      </w:r>
+      <w:proofErr w:type="spellEnd"/>
+      <w:r>
+        <w:rPr>
+          <w:lang w:val="fr-FR"/>
+        </w:rPr>
+        <w:t>, c'est reposant. Après, à voir sur le long terme.</w:t>
       </w:r>
     </w:p>
     <w:p>
@@ -12107,7 +14414,21 @@
         <w:rPr>
           <w:lang w:val="fr-FR"/>
         </w:rPr>
-        <w:t>Et on l'a tensée sévèrement pendant une demi-heure, tout en disant, que en tant que formatrice, quand même, ça ne plaisait pas, qu'il ne fallait pas, ce n'était pas comme ça, je veux dire, c'était hallucinant. Donc, force est de constater que ma crainte, ce n'est pas juste une crainte, je l'ai vue. Alors, ce n'est pas allé plus loin que.</w:t>
+        <w:t xml:space="preserve">Et on l'a </w:t>
+      </w:r>
+      <w:proofErr w:type="spellStart"/>
+      <w:r>
+        <w:rPr>
+          <w:lang w:val="fr-FR"/>
+        </w:rPr>
+        <w:t>tensée</w:t>
+      </w:r>
+      <w:proofErr w:type="spellEnd"/>
+      <w:r>
+        <w:rPr>
+          <w:lang w:val="fr-FR"/>
+        </w:rPr>
+        <w:t xml:space="preserve"> sévèrement pendant une demi-heure, tout en disant, que en tant que formatrice, quand même, ça ne plaisait pas, qu'il ne fallait pas, ce n'était pas comme ça, je veux dire, c'était hallucinant. Donc, force est de constater que ma crainte, ce n'est pas juste une crainte, je l'ai vue. Alors, ce n'est pas allé plus loin que.</w:t>
       </w:r>
     </w:p>
     <w:p>
@@ -12199,7 +14520,21 @@
         <w:rPr>
           <w:lang w:val="fr-FR"/>
         </w:rPr>
-        <w:t xml:space="preserve"> Il me semblait, alors j'ai ça, cette collègue qui s'est fait tensée, je vais dire, elle a demandé pour qu’on explique comment les horaires étaient calculés sur notre logiciel, parce qu'elle pensait qu'il y avait des erreurs. Elle s'est fait choper dans le bureau pendant une demi-heure par un cadre de proximité.</w:t>
+        <w:t xml:space="preserve"> Il me semblait, alors j'ai ça, cette collègue qui s'est fait </w:t>
+      </w:r>
+      <w:proofErr w:type="spellStart"/>
+      <w:r>
+        <w:rPr>
+          <w:lang w:val="fr-FR"/>
+        </w:rPr>
+        <w:t>tensée</w:t>
+      </w:r>
+      <w:proofErr w:type="spellEnd"/>
+      <w:r>
+        <w:rPr>
+          <w:lang w:val="fr-FR"/>
+        </w:rPr>
+        <w:t>, je vais dire, elle a demandé pour qu’on explique comment les horaires étaient calculés sur notre logiciel, parce qu'elle pensait qu'il y avait des erreurs. Elle s'est fait choper dans le bureau pendant une demi-heure par un cadre de proximité.</w:t>
       </w:r>
     </w:p>
     <w:p>
@@ -12327,11 +14662,19 @@
           <w:lang w:val="fr-FR"/>
         </w:rPr>
       </w:pPr>
-      <w:r>
-        <w:rPr>
-          <w:lang w:val="fr-FR"/>
-        </w:rPr>
-        <w:t>C’est pas juste quelqu’un qui écoute et qui dit c’est bien, c’est pas bien. Il me semble aussi qu'on est un levier de problèmes qui n'est pas assez utilisé, pas assez exploité, pas assez formé.</w:t>
+      <w:proofErr w:type="gramStart"/>
+      <w:r>
+        <w:rPr>
+          <w:lang w:val="fr-FR"/>
+        </w:rPr>
+        <w:t>C’est</w:t>
+      </w:r>
+      <w:proofErr w:type="gramEnd"/>
+      <w:r>
+        <w:rPr>
+          <w:lang w:val="fr-FR"/>
+        </w:rPr>
+        <w:t xml:space="preserve"> pas juste quelqu’un qui écoute et qui dit c’est bien, c’est pas bien. Il me semble aussi qu'on est un levier de problèmes qui n'est pas assez utilisé, pas assez exploité, pas assez formé.</w:t>
       </w:r>
     </w:p>
     <w:p>
@@ -12430,7 +14773,21 @@
         <w:rPr>
           <w:lang w:val="fr-FR"/>
         </w:rPr>
-        <w:t xml:space="preserve"> Prochaine question. Quel changement organisationnel ou managériau pourrait, selon toi, améliorer l'engagement et la santé des régulateurs ?</w:t>
+        <w:t xml:space="preserve"> Prochaine question. Quel changement organisationnel ou </w:t>
+      </w:r>
+      <w:proofErr w:type="spellStart"/>
+      <w:r>
+        <w:rPr>
+          <w:lang w:val="fr-FR"/>
+        </w:rPr>
+        <w:t>managériau</w:t>
+      </w:r>
+      <w:proofErr w:type="spellEnd"/>
+      <w:r>
+        <w:rPr>
+          <w:lang w:val="fr-FR"/>
+        </w:rPr>
+        <w:t xml:space="preserve"> pourrait, selon toi, améliorer l'engagement et la santé des régulateurs ?</w:t>
       </w:r>
     </w:p>
     <w:p>
@@ -12596,7 +14953,21 @@
         <w:rPr>
           <w:lang w:val="fr-FR"/>
         </w:rPr>
-        <w:t>Parce que les leaders ne sont pas forcément les cadres. Et on a, par exemple, des chefs de salle qui peuvent être des leaders. Toi, t'en es un. J'ai son nom. Il n'y en a pas des masses. Toi tu es leader. Des managers qui soient des vrais managers. Et une cheffe de service qui revoit sa copie pour aller ailleurs. Je vais me faire virer d'avoir dit ça. [rires]</w:t>
+        <w:t>Parce que les leaders ne sont pas forcément les cadres. Et on a, par exemple, des chefs de salle qui peuvent être des leaders. Toi, t'en es un. J'ai son nom. Il n'y en a pas des masses. Toi tu es leader. Des managers qui soient des vrais managers. Et une cheffe de service qui revoit sa copie pour aller ailleurs. Je vais me faire virer d'avoir dit ça. [</w:t>
+      </w:r>
+      <w:proofErr w:type="gramStart"/>
+      <w:r>
+        <w:rPr>
+          <w:lang w:val="fr-FR"/>
+        </w:rPr>
+        <w:t>rires</w:t>
+      </w:r>
+      <w:proofErr w:type="gramEnd"/>
+      <w:r>
+        <w:rPr>
+          <w:lang w:val="fr-FR"/>
+        </w:rPr>
+        <w:t>]</w:t>
       </w:r>
     </w:p>
     <w:p>
@@ -13145,7 +15516,21 @@
         <w:rPr>
           <w:lang w:val="fr-FR"/>
         </w:rPr>
-        <w:t xml:space="preserve"> Il y a intérêt, parce que vu ce que j'ai dit, sinon je serais tirée, mais je ne me mets plus jamais les pieds là-bas. [rires]</w:t>
+        <w:t xml:space="preserve"> Il y a intérêt, parce que vu ce que j'ai dit, sinon je serais tirée, mais je ne me mets plus jamais les pieds là-bas. [</w:t>
+      </w:r>
+      <w:proofErr w:type="gramStart"/>
+      <w:r>
+        <w:rPr>
+          <w:lang w:val="fr-FR"/>
+        </w:rPr>
+        <w:t>rires</w:t>
+      </w:r>
+      <w:proofErr w:type="gramEnd"/>
+      <w:r>
+        <w:rPr>
+          <w:lang w:val="fr-FR"/>
+        </w:rPr>
+        <w:t>]</w:t>
       </w:r>
     </w:p>
     <w:p>
@@ -13516,7 +15901,21 @@
         <w:rPr>
           <w:lang w:val="fr-FR"/>
         </w:rPr>
-        <w:t xml:space="preserve"> Claude (Anthropic), via l’application Claude Code, en septembre 2026.</w:t>
+        <w:t xml:space="preserve"> Claude (</w:t>
+      </w:r>
+      <w:proofErr w:type="spellStart"/>
+      <w:r>
+        <w:rPr>
+          <w:lang w:val="fr-FR"/>
+        </w:rPr>
+        <w:t>Anthropic</w:t>
+      </w:r>
+      <w:proofErr w:type="spellEnd"/>
+      <w:r>
+        <w:rPr>
+          <w:lang w:val="fr-FR"/>
+        </w:rPr>
+        <w:t>), via l’application Claude Code, en septembre 2026.</w:t>
       </w:r>
     </w:p>
     <w:p>
@@ -13558,7 +15957,21 @@
         <w:rPr>
           <w:lang w:val="fr-FR"/>
         </w:rPr>
-        <w:t xml:space="preserve"> J’ai choisi l’organisation auditée, conduit les entretiens et corrigé leur retranscription automatique (Turboscribe), et apporté la connaissance du terrain. J’ai pensé puis repensé l’angle d’analyse, notamment la lecture de la gouvernance de type dualiste et celle des biais cognitifs. J’ai restructuré le plan et réécrit l’ensemble du texte, afin qu’il suive une trajectoire d’analyse cohérente et fidèle au terrain et au matériau recueilli.</w:t>
+        <w:t xml:space="preserve"> J’ai choisi l’organisation auditée, conduit les entretiens et corrigé leur retranscription automatique (</w:t>
+      </w:r>
+      <w:proofErr w:type="spellStart"/>
+      <w:r>
+        <w:rPr>
+          <w:lang w:val="fr-FR"/>
+        </w:rPr>
+        <w:t>Turboscribe</w:t>
+      </w:r>
+      <w:proofErr w:type="spellEnd"/>
+      <w:r>
+        <w:rPr>
+          <w:lang w:val="fr-FR"/>
+        </w:rPr>
+        <w:t>), et apporté la connaissance du terrain. J’ai pensé puis repensé l’angle d’analyse, notamment la lecture de la gouvernance de type dualiste et celle des biais cognitifs. J’ai restructuré le plan et réécrit l’ensemble du texte, afin qu’il suive une trajectoire d’analyse cohérente et fidèle au terrain et au matériau recueilli.</w:t>
       </w:r>
     </w:p>
     <w:p>
@@ -14262,8 +16675,17 @@
                 <w:sz w:val="20"/>
                 <w:lang w:val="fr-FR"/>
               </w:rPr>
-              <w:t>6. Outils de débiaisage</w:t>
-            </w:r>
+              <w:t xml:space="preserve">6. Outils de </w:t>
+            </w:r>
+            <w:proofErr w:type="spellStart"/>
+            <w:r>
+              <w:rPr>
+                <w:sz w:val="20"/>
+                <w:lang w:val="fr-FR"/>
+              </w:rPr>
+              <w:t>débiaisage</w:t>
+            </w:r>
+            <w:proofErr w:type="spellEnd"/>
           </w:p>
         </w:tc>
         <w:tc>
@@ -14579,7 +17001,7 @@
       <w:rPr>
         <w:noProof/>
       </w:rPr>
-      <w:t>27</w:t>
+      <w:t>23</w:t>
     </w:r>
     <w:r>
       <w:fldChar w:fldCharType="end"/>
@@ -26822,7 +29244,7 @@
 </file>
 
 <file path=customXml/itemProps1.xml><?xml version="1.0" encoding="utf-8"?>
-<ds:datastoreItem xmlns:ds="http://schemas.openxmlformats.org/officeDocument/2006/customXml" ds:itemID="{5A07A1BB-1C7F-4AA2-92CA-CAAF0BC67025}">
+<ds:datastoreItem xmlns:ds="http://schemas.openxmlformats.org/officeDocument/2006/customXml" ds:itemID="{8F1E3D12-A576-47A5-88F0-D891235D164E}">
   <ds:schemaRefs>
     <ds:schemaRef ds:uri="http://schemas.openxmlformats.org/officeDocument/2006/bibliography"/>
   </ds:schemaRefs>

</xml_diff>